<commit_message>
Add system logic diagram to CEO overview document
Full-page architecture diagram placed at the start of Section 3 (How It Works)
showing all three layers, their features, data flow, analytics cross-layer
access, and breadcrumb navigation.

Co-Authored-By: Claude Opus 4.6 <noreply@anthropic.com>
</commit_message>
<xml_diff>
--- a/ProjectFlow-Executive-Overview.docx
+++ b/ProjectFlow-Executive-Overview.docx
@@ -162,7 +162,7 @@
               </w:rPr>
               <w:t xml:space="preserve">Clients Layer: </w:t>
             </w:r>
-            <w:hyperlink w:history="1" r:id="rIdrf3l9mrjjx3cacpurklws">
+            <w:hyperlink w:history="1" r:id="rIdd-uiwzdu-18jv_pb-a5et">
               <w:r>
                 <w:rPr>
                   <w:rStyle w:val="Hyperlink"/>
@@ -188,7 +188,7 @@
               </w:rPr>
               <w:t xml:space="preserve">Services Layer: </w:t>
             </w:r>
-            <w:hyperlink w:history="1" r:id="rId_uszysietfkfqyiwr1rf0">
+            <w:hyperlink w:history="1" r:id="rIdybrxx_vw22l3aw8cgw6da">
               <w:r>
                 <w:rPr>
                   <w:rStyle w:val="Hyperlink"/>
@@ -214,7 +214,7 @@
               </w:rPr>
               <w:t xml:space="preserve">Kanban Layer: </w:t>
             </w:r>
-            <w:hyperlink w:history="1" r:id="rIdatig10thdk2ry3dc9-hfi">
+            <w:hyperlink w:history="1" r:id="rIdbv7i_igoftjctybnsfrx9">
               <w:r>
                 <w:rPr>
                   <w:rStyle w:val="Hyperlink"/>
@@ -237,7 +237,7 @@
               </w:rPr>
               <w:t xml:space="preserve">Analytics Layer: </w:t>
             </w:r>
-            <w:hyperlink w:history="1" r:id="rIdsb5vv5glr9j0vohmin_ib">
+            <w:hyperlink w:history="1" r:id="rIdxm2uebtndtepfv5hjfdk0">
               <w:r>
                 <w:rPr>
                   <w:rStyle w:val="Hyperlink"/>
@@ -728,21 +728,23 @@
       </w:r>
     </w:p>
     <w:p>
-      <w:r>
-        <w:br w:type="page"/>
-      </w:r>
-    </w:p>
-    <w:p>
-      <w:pPr>
-        <w:pStyle w:val="Heading2"/>
-      </w:pPr>
-      <w:r>
-        <w:rPr>
-          <w:b/>
-          <w:bCs/>
-        </w:rPr>
-        <w:t xml:space="preserve">3.1 Layer 1: Clients</w:t>
-      </w:r>
+      <w:pPr>
+        <w:spacing w:after="120"/>
+      </w:pPr>
+      <w:r>
+        <w:rPr>
+          <w:rFonts w:ascii="Arial" w:cs="Arial" w:eastAsia="Arial" w:hAnsi="Arial"/>
+          <w:color w:val="1D1D1F"/>
+          <w:sz w:val="22"/>
+          <w:szCs w:val="22"/>
+        </w:rPr>
+        <w:t xml:space="preserve">The diagram below shows how data flows through the system and what each layer contains:</w:t>
+      </w:r>
+    </w:p>
+    <w:p>
+      <w:pPr>
+        <w:spacing w:after="120"/>
+      </w:pPr>
     </w:p>
     <w:tbl>
       <w:tblPr>
@@ -764,218 +766,6 @@
           <w:tcPr>
             <w:tcW w:type="dxa" w:w="9360"/>
             <w:tcBorders>
-              <w:top w:val="single" w:color="0071E3" w:sz="3"/>
-              <w:left w:val="single" w:color="0071E3" w:sz="3"/>
-              <w:bottom w:val="single" w:color="0071E3" w:sz="3"/>
-              <w:right w:val="single" w:color="0071E3" w:sz="3"/>
-            </w:tcBorders>
-            <w:shd w:fill="E8F0FF" w:val="clear"/>
-            <w:tcMar>
-              <w:top w:type="dxa" w:w="120"/>
-              <w:left w:type="dxa" w:w="160"/>
-              <w:bottom w:type="dxa" w:w="120"/>
-              <w:right w:type="dxa" w:w="160"/>
-            </w:tcMar>
-          </w:tcPr>
-          <w:p>
-            <w:pPr>
-              <w:spacing w:after="60"/>
-            </w:pPr>
-            <w:r>
-              <w:rPr>
-                <w:rFonts w:ascii="Arial" w:cs="Arial" w:eastAsia="Arial" w:hAnsi="Arial"/>
-                <w:b/>
-                <w:bCs/>
-                <w:color w:val="1D1D1F"/>
-                <w:sz w:val="20"/>
-                <w:szCs w:val="20"/>
-              </w:rPr>
-              <w:t xml:space="preserve">Live Demo — Clients Page</w:t>
-            </w:r>
-          </w:p>
-          <w:p>
-            <w:hyperlink w:history="1" r:id="rIdvcgzcjwwezdqs1-l4iyoe">
-              <w:r>
-                <w:rPr>
-                  <w:rStyle w:val="Hyperlink"/>
-                  <w:rFonts w:ascii="Arial" w:cs="Arial" w:eastAsia="Arial" w:hAnsi="Arial"/>
-                  <w:sz w:val="20"/>
-                  <w:szCs w:val="20"/>
-                </w:rPr>
-                <w:t xml:space="preserve">https://nikkortrinidad-cpu.github.io/kanban-website/mockups/01-clients.html</w:t>
-              </w:r>
-            </w:hyperlink>
-          </w:p>
-        </w:tc>
-      </w:tr>
-    </w:tbl>
-    <w:p>
-      <w:pPr>
-        <w:spacing w:after="120" w:before="200"/>
-      </w:pPr>
-    </w:p>
-    <w:p>
-      <w:pPr>
-        <w:spacing w:after="120"/>
-      </w:pPr>
-      <w:r>
-        <w:rPr>
-          <w:rFonts w:ascii="Arial" w:cs="Arial" w:eastAsia="Arial" w:hAnsi="Arial"/>
-          <w:color w:val="1D1D1F"/>
-          <w:sz w:val="22"/>
-          <w:szCs w:val="22"/>
-        </w:rPr>
-        <w:t xml:space="preserve">This is the landing page. It shows every client we manage in a card-based grid that can be sorted, filtered, and searched.</w:t>
-      </w:r>
-    </w:p>
-    <w:p>
-      <w:pPr>
-        <w:pStyle w:val="Heading3"/>
-      </w:pPr>
-      <w:r>
-        <w:rPr>
-          <w:b/>
-          <w:bCs/>
-        </w:rPr>
-        <w:t xml:space="preserve">What you see on this page:</w:t>
-      </w:r>
-    </w:p>
-    <w:p>
-      <w:pPr>
-        <w:pStyle w:val="ListParagraph"/>
-        <w:numPr>
-          <w:ilvl w:val="0"/>
-          <w:numId w:val="3"/>
-        </w:numPr>
-        <w:spacing w:after="60"/>
-      </w:pPr>
-      <w:r>
-        <w:rPr>
-          <w:rFonts w:ascii="Arial" w:cs="Arial" w:eastAsia="Arial" w:hAnsi="Arial"/>
-          <w:sz w:val="22"/>
-          <w:szCs w:val="22"/>
-        </w:rPr>
-        <w:t xml:space="preserve">KPI summary cards at the top — Active Tasks (82), Average Tasks per Client (13.7), and Completion Rate (87%). These update from real data.</w:t>
-      </w:r>
-    </w:p>
-    <w:p>
-      <w:pPr>
-        <w:pStyle w:val="ListParagraph"/>
-        <w:numPr>
-          <w:ilvl w:val="0"/>
-          <w:numId w:val="3"/>
-        </w:numPr>
-        <w:spacing w:after="60"/>
-      </w:pPr>
-      <w:r>
-        <w:rPr>
-          <w:rFonts w:ascii="Arial" w:cs="Arial" w:eastAsia="Arial" w:hAnsi="Arial"/>
-          <w:sz w:val="22"/>
-          <w:szCs w:val="22"/>
-        </w:rPr>
-        <w:t xml:space="preserve">A toolbar with search, sort (by name, tasks, services, revenue), filter (by service type), and a grid/list view toggle.</w:t>
-      </w:r>
-    </w:p>
-    <w:p>
-      <w:pPr>
-        <w:pStyle w:val="ListParagraph"/>
-        <w:numPr>
-          <w:ilvl w:val="0"/>
-          <w:numId w:val="3"/>
-        </w:numPr>
-        <w:spacing w:after="60"/>
-      </w:pPr>
-      <w:r>
-        <w:rPr>
-          <w:rFonts w:ascii="Arial" w:cs="Arial" w:eastAsia="Arial" w:hAnsi="Arial"/>
-          <w:sz w:val="22"/>
-          <w:szCs w:val="22"/>
-        </w:rPr>
-        <w:t xml:space="preserve">Client cards showing: company name, industry, status (Active/Paused), number of services, task count, revenue, service tags, and last activity timestamp.</w:t>
-      </w:r>
-    </w:p>
-    <w:p>
-      <w:pPr>
-        <w:pStyle w:val="ListParagraph"/>
-        <w:numPr>
-          <w:ilvl w:val="0"/>
-          <w:numId w:val="3"/>
-        </w:numPr>
-        <w:spacing w:after="60"/>
-      </w:pPr>
-      <w:r>
-        <w:rPr>
-          <w:rFonts w:ascii="Arial" w:cs="Arial" w:eastAsia="Arial" w:hAnsi="Arial"/>
-          <w:sz w:val="22"/>
-          <w:szCs w:val="22"/>
-        </w:rPr>
-        <w:t xml:space="preserve">Tabs to switch between Active Clients and Archived Clients.</w:t>
-      </w:r>
-    </w:p>
-    <w:p>
-      <w:pPr>
-        <w:pStyle w:val="ListParagraph"/>
-        <w:numPr>
-          <w:ilvl w:val="0"/>
-          <w:numId w:val="3"/>
-        </w:numPr>
-        <w:spacing w:after="60"/>
-      </w:pPr>
-      <w:r>
-        <w:rPr>
-          <w:rFonts w:ascii="Arial" w:cs="Arial" w:eastAsia="Arial" w:hAnsi="Arial"/>
-          <w:sz w:val="22"/>
-          <w:szCs w:val="22"/>
-        </w:rPr>
-        <w:t xml:space="preserve">A 3-dot menu on each card for quick actions — change status or archive a client.</w:t>
-      </w:r>
-    </w:p>
-    <w:p>
-      <w:pPr>
-        <w:pStyle w:val="Heading3"/>
-      </w:pPr>
-      <w:r>
-        <w:rPr>
-          <w:b/>
-          <w:bCs/>
-        </w:rPr>
-        <w:t xml:space="preserve">Grid View (default):</w:t>
-      </w:r>
-    </w:p>
-    <w:p>
-      <w:pPr>
-        <w:spacing w:after="120"/>
-      </w:pPr>
-      <w:r>
-        <w:rPr>
-          <w:rFonts w:ascii="Arial" w:cs="Arial" w:eastAsia="Arial" w:hAnsi="Arial"/>
-          <w:color w:val="1D1D1F"/>
-          <w:sz w:val="22"/>
-          <w:szCs w:val="22"/>
-        </w:rPr>
-        <w:t xml:space="preserve">Cards are arranged in a responsive grid. Each card gives a quick snapshot of the client’s status, revenue, and active services.</w:t>
-      </w:r>
-    </w:p>
-    <w:tbl>
-      <w:tblPr>
-        <w:tblW w:type="dxa" w:w="9360"/>
-        <w:tblBorders>
-          <w:top w:val="single" w:color="auto" w:sz="4"/>
-          <w:left w:val="single" w:color="auto" w:sz="4"/>
-          <w:bottom w:val="single" w:color="auto" w:sz="4"/>
-          <w:right w:val="single" w:color="auto" w:sz="4"/>
-          <w:insideH w:val="single" w:color="auto" w:sz="4"/>
-          <w:insideV w:val="single" w:color="auto" w:sz="4"/>
-        </w:tblBorders>
-      </w:tblPr>
-      <w:tblGrid>
-        <w:gridCol w:w="9360"/>
-      </w:tblGrid>
-      <w:tr>
-        <w:tc>
-          <w:tcPr>
-            <w:tcW w:type="dxa" w:w="9360"/>
-            <w:tcBorders>
               <w:top w:val="single" w:color="D2D2D7" w:sz="2"/>
               <w:left w:val="single" w:color="D2D2D7" w:sz="2"/>
               <w:bottom w:val="single" w:color="D2D2D7" w:sz="2"/>
@@ -995,7 +785,7 @@
             <w:r>
               <w:drawing>
                 <wp:inline distT="0" distB="0" distL="0" distR="0">
-                  <wp:extent cx="5800000" cy="3728571"/>
+                  <wp:extent cx="5800000" cy="6950333"/>
                   <wp:effectExtent t="0" r="0" b="0" l="0"/>
                   <wp:docPr id="1" name="" descr="" title=""/>
                   <wp:cNvGraphicFramePr>
@@ -1020,7 +810,7 @@
                         <pic:spPr bwMode="auto">
                           <a:xfrm>
                             <a:off x="0" y="0"/>
-                            <a:ext cx="5800000" cy="3728571"/>
+                            <a:ext cx="5800000" cy="6950333"/>
                           </a:xfrm>
                           <a:prstGeom prst="rect">
                             <a:avLst/>
@@ -1050,20 +840,95 @@
           <w:sz w:val="18"/>
           <w:szCs w:val="18"/>
         </w:rPr>
-        <w:t xml:space="preserve">Figure 1: Clients page — Grid view with KPI summary, search, and toolbar</w:t>
-      </w:r>
-    </w:p>
-    <w:p>
-      <w:pPr>
-        <w:pStyle w:val="Heading3"/>
+        <w:t xml:space="preserve">Figure: ProjectFlow System Logic — Three-layer architecture with data flow</w:t>
+      </w:r>
+    </w:p>
+    <w:p>
+      <w:r>
+        <w:br w:type="page"/>
+      </w:r>
+    </w:p>
+    <w:p>
+      <w:pPr>
+        <w:pStyle w:val="Heading2"/>
       </w:pPr>
       <w:r>
         <w:rPr>
           <w:b/>
           <w:bCs/>
         </w:rPr>
-        <w:t xml:space="preserve">List View:</w:t>
-      </w:r>
+        <w:t xml:space="preserve">3.1 Layer 1: Clients</w:t>
+      </w:r>
+    </w:p>
+    <w:tbl>
+      <w:tblPr>
+        <w:tblW w:type="dxa" w:w="9360"/>
+        <w:tblBorders>
+          <w:top w:val="single" w:color="auto" w:sz="4"/>
+          <w:left w:val="single" w:color="auto" w:sz="4"/>
+          <w:bottom w:val="single" w:color="auto" w:sz="4"/>
+          <w:right w:val="single" w:color="auto" w:sz="4"/>
+          <w:insideH w:val="single" w:color="auto" w:sz="4"/>
+          <w:insideV w:val="single" w:color="auto" w:sz="4"/>
+        </w:tblBorders>
+      </w:tblPr>
+      <w:tblGrid>
+        <w:gridCol w:w="9360"/>
+      </w:tblGrid>
+      <w:tr>
+        <w:tc>
+          <w:tcPr>
+            <w:tcW w:type="dxa" w:w="9360"/>
+            <w:tcBorders>
+              <w:top w:val="single" w:color="0071E3" w:sz="3"/>
+              <w:left w:val="single" w:color="0071E3" w:sz="3"/>
+              <w:bottom w:val="single" w:color="0071E3" w:sz="3"/>
+              <w:right w:val="single" w:color="0071E3" w:sz="3"/>
+            </w:tcBorders>
+            <w:shd w:fill="E8F0FF" w:val="clear"/>
+            <w:tcMar>
+              <w:top w:type="dxa" w:w="120"/>
+              <w:left w:type="dxa" w:w="160"/>
+              <w:bottom w:type="dxa" w:w="120"/>
+              <w:right w:type="dxa" w:w="160"/>
+            </w:tcMar>
+          </w:tcPr>
+          <w:p>
+            <w:pPr>
+              <w:spacing w:after="60"/>
+            </w:pPr>
+            <w:r>
+              <w:rPr>
+                <w:rFonts w:ascii="Arial" w:cs="Arial" w:eastAsia="Arial" w:hAnsi="Arial"/>
+                <w:b/>
+                <w:bCs/>
+                <w:color w:val="1D1D1F"/>
+                <w:sz w:val="20"/>
+                <w:szCs w:val="20"/>
+              </w:rPr>
+              <w:t xml:space="preserve">Live Demo — Clients Page</w:t>
+            </w:r>
+          </w:p>
+          <w:p>
+            <w:hyperlink w:history="1" r:id="rIdlta7wwnie3trp3nqxevum">
+              <w:r>
+                <w:rPr>
+                  <w:rStyle w:val="Hyperlink"/>
+                  <w:rFonts w:ascii="Arial" w:cs="Arial" w:eastAsia="Arial" w:hAnsi="Arial"/>
+                  <w:sz w:val="20"/>
+                  <w:szCs w:val="20"/>
+                </w:rPr>
+                <w:t xml:space="preserve">https://nikkortrinidad-cpu.github.io/kanban-website/mockups/01-clients.html</w:t>
+              </w:r>
+            </w:hyperlink>
+          </w:p>
+        </w:tc>
+      </w:tr>
+    </w:tbl>
+    <w:p>
+      <w:pPr>
+        <w:spacing w:after="120" w:before="200"/>
+      </w:pPr>
     </w:p>
     <w:p>
       <w:pPr>
@@ -1076,7 +941,135 @@
           <w:sz w:val="22"/>
           <w:szCs w:val="22"/>
         </w:rPr>
-        <w:t xml:space="preserve">Toggle to list view for a compact, table-like layout with column headers (Client, Status, Services, Tasks, Revenue, Activity). Better for scanning large numbers of clients quickly.</w:t>
+        <w:t xml:space="preserve">This is the landing page. It shows every client we manage in a card-based grid that can be sorted, filtered, and searched.</w:t>
+      </w:r>
+    </w:p>
+    <w:p>
+      <w:pPr>
+        <w:pStyle w:val="Heading3"/>
+      </w:pPr>
+      <w:r>
+        <w:rPr>
+          <w:b/>
+          <w:bCs/>
+        </w:rPr>
+        <w:t xml:space="preserve">What you see on this page:</w:t>
+      </w:r>
+    </w:p>
+    <w:p>
+      <w:pPr>
+        <w:pStyle w:val="ListParagraph"/>
+        <w:numPr>
+          <w:ilvl w:val="0"/>
+          <w:numId w:val="3"/>
+        </w:numPr>
+        <w:spacing w:after="60"/>
+      </w:pPr>
+      <w:r>
+        <w:rPr>
+          <w:rFonts w:ascii="Arial" w:cs="Arial" w:eastAsia="Arial" w:hAnsi="Arial"/>
+          <w:sz w:val="22"/>
+          <w:szCs w:val="22"/>
+        </w:rPr>
+        <w:t xml:space="preserve">KPI summary cards at the top — Active Tasks (82), Average Tasks per Client (13.7), and Completion Rate (87%). These update from real data.</w:t>
+      </w:r>
+    </w:p>
+    <w:p>
+      <w:pPr>
+        <w:pStyle w:val="ListParagraph"/>
+        <w:numPr>
+          <w:ilvl w:val="0"/>
+          <w:numId w:val="3"/>
+        </w:numPr>
+        <w:spacing w:after="60"/>
+      </w:pPr>
+      <w:r>
+        <w:rPr>
+          <w:rFonts w:ascii="Arial" w:cs="Arial" w:eastAsia="Arial" w:hAnsi="Arial"/>
+          <w:sz w:val="22"/>
+          <w:szCs w:val="22"/>
+        </w:rPr>
+        <w:t xml:space="preserve">A toolbar with search, sort (by name, tasks, services, revenue), filter (by service type), and a grid/list view toggle.</w:t>
+      </w:r>
+    </w:p>
+    <w:p>
+      <w:pPr>
+        <w:pStyle w:val="ListParagraph"/>
+        <w:numPr>
+          <w:ilvl w:val="0"/>
+          <w:numId w:val="3"/>
+        </w:numPr>
+        <w:spacing w:after="60"/>
+      </w:pPr>
+      <w:r>
+        <w:rPr>
+          <w:rFonts w:ascii="Arial" w:cs="Arial" w:eastAsia="Arial" w:hAnsi="Arial"/>
+          <w:sz w:val="22"/>
+          <w:szCs w:val="22"/>
+        </w:rPr>
+        <w:t xml:space="preserve">Client cards showing: company name, industry, status (Active/Paused), number of services, task count, revenue, service tags, and last activity timestamp.</w:t>
+      </w:r>
+    </w:p>
+    <w:p>
+      <w:pPr>
+        <w:pStyle w:val="ListParagraph"/>
+        <w:numPr>
+          <w:ilvl w:val="0"/>
+          <w:numId w:val="3"/>
+        </w:numPr>
+        <w:spacing w:after="60"/>
+      </w:pPr>
+      <w:r>
+        <w:rPr>
+          <w:rFonts w:ascii="Arial" w:cs="Arial" w:eastAsia="Arial" w:hAnsi="Arial"/>
+          <w:sz w:val="22"/>
+          <w:szCs w:val="22"/>
+        </w:rPr>
+        <w:t xml:space="preserve">Tabs to switch between Active Clients and Archived Clients.</w:t>
+      </w:r>
+    </w:p>
+    <w:p>
+      <w:pPr>
+        <w:pStyle w:val="ListParagraph"/>
+        <w:numPr>
+          <w:ilvl w:val="0"/>
+          <w:numId w:val="3"/>
+        </w:numPr>
+        <w:spacing w:after="60"/>
+      </w:pPr>
+      <w:r>
+        <w:rPr>
+          <w:rFonts w:ascii="Arial" w:cs="Arial" w:eastAsia="Arial" w:hAnsi="Arial"/>
+          <w:sz w:val="22"/>
+          <w:szCs w:val="22"/>
+        </w:rPr>
+        <w:t xml:space="preserve">A 3-dot menu on each card for quick actions — change status or archive a client.</w:t>
+      </w:r>
+    </w:p>
+    <w:p>
+      <w:pPr>
+        <w:pStyle w:val="Heading3"/>
+      </w:pPr>
+      <w:r>
+        <w:rPr>
+          <w:b/>
+          <w:bCs/>
+        </w:rPr>
+        <w:t xml:space="preserve">Grid View (default):</w:t>
+      </w:r>
+    </w:p>
+    <w:p>
+      <w:pPr>
+        <w:spacing w:after="120"/>
+      </w:pPr>
+      <w:r>
+        <w:rPr>
+          <w:rFonts w:ascii="Arial" w:cs="Arial" w:eastAsia="Arial" w:hAnsi="Arial"/>
+          <w:color w:val="1D1D1F"/>
+          <w:sz w:val="22"/>
+          <w:szCs w:val="22"/>
+        </w:rPr>
+        <w:t xml:space="preserve">Cards are arranged in a responsive grid. Each card gives a quick snapshot of the client’s status, revenue, and active services.</w:t>
       </w:r>
     </w:p>
     <w:tbl>
@@ -1173,7 +1166,7 @@
           <w:sz w:val="18"/>
           <w:szCs w:val="18"/>
         </w:rPr>
-        <w:t xml:space="preserve">Figure 2: Clients page — List view with sortable columns</w:t>
+        <w:t xml:space="preserve">Figure 1: Clients page — Grid view with KPI summary, search, and toolbar</w:t>
       </w:r>
     </w:p>
     <w:p>
@@ -1185,658 +1178,8 @@
           <w:b/>
           <w:bCs/>
         </w:rPr>
-        <w:t xml:space="preserve">Key functions:</w:t>
-      </w:r>
-    </w:p>
-    <w:tbl>
-      <w:tblPr>
-        <w:tblW w:type="dxa" w:w="9360"/>
-        <w:tblBorders>
-          <w:top w:val="single" w:color="auto" w:sz="4"/>
-          <w:left w:val="single" w:color="auto" w:sz="4"/>
-          <w:bottom w:val="single" w:color="auto" w:sz="4"/>
-          <w:right w:val="single" w:color="auto" w:sz="4"/>
-          <w:insideH w:val="single" w:color="auto" w:sz="4"/>
-          <w:insideV w:val="single" w:color="auto" w:sz="4"/>
-        </w:tblBorders>
-      </w:tblPr>
-      <w:tblGrid>
-        <w:gridCol w:w="2400"/>
-        <w:gridCol w:w="6960"/>
-      </w:tblGrid>
-      <w:tr>
-        <w:tc>
-          <w:tcPr>
-            <w:tcW w:type="dxa" w:w="2400"/>
-            <w:tcBorders>
-              <w:top w:val="single" w:color="D2D2D7" w:sz="1"/>
-              <w:left w:val="single" w:color="D2D2D7" w:sz="1"/>
-              <w:bottom w:val="single" w:color="D2D2D7" w:sz="1"/>
-              <w:right w:val="single" w:color="D2D2D7" w:sz="1"/>
-            </w:tcBorders>
-            <w:shd w:fill="E8F0FF" w:val="clear"/>
-            <w:tcMar>
-              <w:top w:type="dxa" w:w="80"/>
-              <w:left w:type="dxa" w:w="120"/>
-              <w:bottom w:type="dxa" w:w="80"/>
-              <w:right w:type="dxa" w:w="120"/>
-            </w:tcMar>
-          </w:tcPr>
-          <w:p>
-            <w:pPr>
-              <w:jc w:val="left"/>
-            </w:pPr>
-            <w:r>
-              <w:rPr>
-                <w:rFonts w:ascii="Arial" w:cs="Arial" w:eastAsia="Arial" w:hAnsi="Arial"/>
-                <w:b/>
-                <w:bCs/>
-                <w:color w:val="1D1D1F"/>
-                <w:sz w:val="20"/>
-                <w:szCs w:val="20"/>
-              </w:rPr>
-              <w:t xml:space="preserve">Function</w:t>
-            </w:r>
-          </w:p>
-        </w:tc>
-        <w:tc>
-          <w:tcPr>
-            <w:tcW w:type="dxa" w:w="6960"/>
-            <w:tcBorders>
-              <w:top w:val="single" w:color="D2D2D7" w:sz="1"/>
-              <w:left w:val="single" w:color="D2D2D7" w:sz="1"/>
-              <w:bottom w:val="single" w:color="D2D2D7" w:sz="1"/>
-              <w:right w:val="single" w:color="D2D2D7" w:sz="1"/>
-            </w:tcBorders>
-            <w:shd w:fill="E8F0FF" w:val="clear"/>
-            <w:tcMar>
-              <w:top w:type="dxa" w:w="80"/>
-              <w:left w:type="dxa" w:w="120"/>
-              <w:bottom w:type="dxa" w:w="80"/>
-              <w:right w:type="dxa" w:w="120"/>
-            </w:tcMar>
-          </w:tcPr>
-          <w:p>
-            <w:pPr>
-              <w:jc w:val="left"/>
-            </w:pPr>
-            <w:r>
-              <w:rPr>
-                <w:rFonts w:ascii="Arial" w:cs="Arial" w:eastAsia="Arial" w:hAnsi="Arial"/>
-                <w:b/>
-                <w:bCs/>
-                <w:color w:val="1D1D1F"/>
-                <w:sz w:val="20"/>
-                <w:szCs w:val="20"/>
-              </w:rPr>
-              <w:t xml:space="preserve">What it does</w:t>
-            </w:r>
-          </w:p>
-        </w:tc>
-      </w:tr>
-      <w:tr>
-        <w:tc>
-          <w:tcPr>
-            <w:tcW w:type="dxa" w:w="2400"/>
-            <w:tcBorders>
-              <w:top w:val="single" w:color="D2D2D7" w:sz="1"/>
-              <w:left w:val="single" w:color="D2D2D7" w:sz="1"/>
-              <w:bottom w:val="single" w:color="D2D2D7" w:sz="1"/>
-              <w:right w:val="single" w:color="D2D2D7" w:sz="1"/>
-            </w:tcBorders>
-            <w:tcMar>
-              <w:top w:type="dxa" w:w="80"/>
-              <w:left w:type="dxa" w:w="120"/>
-              <w:bottom w:type="dxa" w:w="80"/>
-              <w:right w:type="dxa" w:w="120"/>
-            </w:tcMar>
-          </w:tcPr>
-          <w:p>
-            <w:pPr>
-              <w:jc w:val="left"/>
-            </w:pPr>
-            <w:r>
-              <w:rPr>
-                <w:rFonts w:ascii="Arial" w:cs="Arial" w:eastAsia="Arial" w:hAnsi="Arial"/>
-                <w:b/>
-                <w:bCs/>
-                <w:color w:val="1D1D1F"/>
-                <w:sz w:val="20"/>
-                <w:szCs w:val="20"/>
-              </w:rPr>
-              <w:t xml:space="preserve">Search</w:t>
-            </w:r>
-          </w:p>
-        </w:tc>
-        <w:tc>
-          <w:tcPr>
-            <w:tcW w:type="dxa" w:w="6960"/>
-            <w:tcBorders>
-              <w:top w:val="single" w:color="D2D2D7" w:sz="1"/>
-              <w:left w:val="single" w:color="D2D2D7" w:sz="1"/>
-              <w:bottom w:val="single" w:color="D2D2D7" w:sz="1"/>
-              <w:right w:val="single" w:color="D2D2D7" w:sz="1"/>
-            </w:tcBorders>
-            <w:tcMar>
-              <w:top w:type="dxa" w:w="80"/>
-              <w:left w:type="dxa" w:w="120"/>
-              <w:bottom w:type="dxa" w:w="80"/>
-              <w:right w:type="dxa" w:w="120"/>
-            </w:tcMar>
-          </w:tcPr>
-          <w:p>
-            <w:pPr>
-              <w:jc w:val="left"/>
-            </w:pPr>
-            <w:r>
-              <w:rPr>
-                <w:rFonts w:ascii="Arial" w:cs="Arial" w:eastAsia="Arial" w:hAnsi="Arial"/>
-                <w:b w:val="false"/>
-                <w:bCs w:val="false"/>
-                <w:color w:val="1D1D1F"/>
-                <w:sz w:val="20"/>
-                <w:szCs w:val="20"/>
-              </w:rPr>
-              <w:t xml:space="preserve">Filter clients by name in real time</w:t>
-            </w:r>
-          </w:p>
-        </w:tc>
-      </w:tr>
-      <w:tr>
-        <w:tc>
-          <w:tcPr>
-            <w:tcW w:type="dxa" w:w="2400"/>
-            <w:tcBorders>
-              <w:top w:val="single" w:color="D2D2D7" w:sz="1"/>
-              <w:left w:val="single" w:color="D2D2D7" w:sz="1"/>
-              <w:bottom w:val="single" w:color="D2D2D7" w:sz="1"/>
-              <w:right w:val="single" w:color="D2D2D7" w:sz="1"/>
-            </w:tcBorders>
-            <w:tcMar>
-              <w:top w:type="dxa" w:w="80"/>
-              <w:left w:type="dxa" w:w="120"/>
-              <w:bottom w:type="dxa" w:w="80"/>
-              <w:right w:type="dxa" w:w="120"/>
-            </w:tcMar>
-          </w:tcPr>
-          <w:p>
-            <w:pPr>
-              <w:jc w:val="left"/>
-            </w:pPr>
-            <w:r>
-              <w:rPr>
-                <w:rFonts w:ascii="Arial" w:cs="Arial" w:eastAsia="Arial" w:hAnsi="Arial"/>
-                <w:b/>
-                <w:bCs/>
-                <w:color w:val="1D1D1F"/>
-                <w:sz w:val="20"/>
-                <w:szCs w:val="20"/>
-              </w:rPr>
-              <w:t xml:space="preserve">Sort</w:t>
-            </w:r>
-          </w:p>
-        </w:tc>
-        <w:tc>
-          <w:tcPr>
-            <w:tcW w:type="dxa" w:w="6960"/>
-            <w:tcBorders>
-              <w:top w:val="single" w:color="D2D2D7" w:sz="1"/>
-              <w:left w:val="single" w:color="D2D2D7" w:sz="1"/>
-              <w:bottom w:val="single" w:color="D2D2D7" w:sz="1"/>
-              <w:right w:val="single" w:color="D2D2D7" w:sz="1"/>
-            </w:tcBorders>
-            <w:tcMar>
-              <w:top w:type="dxa" w:w="80"/>
-              <w:left w:type="dxa" w:w="120"/>
-              <w:bottom w:type="dxa" w:w="80"/>
-              <w:right w:type="dxa" w:w="120"/>
-            </w:tcMar>
-          </w:tcPr>
-          <w:p>
-            <w:pPr>
-              <w:jc w:val="left"/>
-            </w:pPr>
-            <w:r>
-              <w:rPr>
-                <w:rFonts w:ascii="Arial" w:cs="Arial" w:eastAsia="Arial" w:hAnsi="Arial"/>
-                <w:b w:val="false"/>
-                <w:bCs w:val="false"/>
-                <w:color w:val="1D1D1F"/>
-                <w:sz w:val="20"/>
-                <w:szCs w:val="20"/>
-              </w:rPr>
-              <w:t xml:space="preserve">9 options: Default, Name (A-Z / Z-A), Most/Least Tasks, Most/Least Services, Highest/Lowest Revenue</w:t>
-            </w:r>
-          </w:p>
-        </w:tc>
-      </w:tr>
-      <w:tr>
-        <w:tc>
-          <w:tcPr>
-            <w:tcW w:type="dxa" w:w="2400"/>
-            <w:tcBorders>
-              <w:top w:val="single" w:color="D2D2D7" w:sz="1"/>
-              <w:left w:val="single" w:color="D2D2D7" w:sz="1"/>
-              <w:bottom w:val="single" w:color="D2D2D7" w:sz="1"/>
-              <w:right w:val="single" w:color="D2D2D7" w:sz="1"/>
-            </w:tcBorders>
-            <w:tcMar>
-              <w:top w:type="dxa" w:w="80"/>
-              <w:left w:type="dxa" w:w="120"/>
-              <w:bottom w:type="dxa" w:w="80"/>
-              <w:right w:type="dxa" w:w="120"/>
-            </w:tcMar>
-          </w:tcPr>
-          <w:p>
-            <w:pPr>
-              <w:jc w:val="left"/>
-            </w:pPr>
-            <w:r>
-              <w:rPr>
-                <w:rFonts w:ascii="Arial" w:cs="Arial" w:eastAsia="Arial" w:hAnsi="Arial"/>
-                <w:b/>
-                <w:bCs/>
-                <w:color w:val="1D1D1F"/>
-                <w:sz w:val="20"/>
-                <w:szCs w:val="20"/>
-              </w:rPr>
-              <w:t xml:space="preserve">Filter</w:t>
-            </w:r>
-          </w:p>
-        </w:tc>
-        <w:tc>
-          <w:tcPr>
-            <w:tcW w:type="dxa" w:w="6960"/>
-            <w:tcBorders>
-              <w:top w:val="single" w:color="D2D2D7" w:sz="1"/>
-              <w:left w:val="single" w:color="D2D2D7" w:sz="1"/>
-              <w:bottom w:val="single" w:color="D2D2D7" w:sz="1"/>
-              <w:right w:val="single" w:color="D2D2D7" w:sz="1"/>
-            </w:tcBorders>
-            <w:tcMar>
-              <w:top w:type="dxa" w:w="80"/>
-              <w:left w:type="dxa" w:w="120"/>
-              <w:bottom w:type="dxa" w:w="80"/>
-              <w:right w:type="dxa" w:w="120"/>
-            </w:tcMar>
-          </w:tcPr>
-          <w:p>
-            <w:pPr>
-              <w:jc w:val="left"/>
-            </w:pPr>
-            <w:r>
-              <w:rPr>
-                <w:rFonts w:ascii="Arial" w:cs="Arial" w:eastAsia="Arial" w:hAnsi="Arial"/>
-                <w:b w:val="false"/>
-                <w:bCs w:val="false"/>
-                <w:color w:val="1D1D1F"/>
-                <w:sz w:val="20"/>
-                <w:szCs w:val="20"/>
-              </w:rPr>
-              <w:t xml:space="preserve">Filter by service type: Web, Mobile, SEO, Cloud, Design, Content, Social, Branding</w:t>
-            </w:r>
-          </w:p>
-        </w:tc>
-      </w:tr>
-      <w:tr>
-        <w:tc>
-          <w:tcPr>
-            <w:tcW w:type="dxa" w:w="2400"/>
-            <w:tcBorders>
-              <w:top w:val="single" w:color="D2D2D7" w:sz="1"/>
-              <w:left w:val="single" w:color="D2D2D7" w:sz="1"/>
-              <w:bottom w:val="single" w:color="D2D2D7" w:sz="1"/>
-              <w:right w:val="single" w:color="D2D2D7" w:sz="1"/>
-            </w:tcBorders>
-            <w:tcMar>
-              <w:top w:type="dxa" w:w="80"/>
-              <w:left w:type="dxa" w:w="120"/>
-              <w:bottom w:type="dxa" w:w="80"/>
-              <w:right w:type="dxa" w:w="120"/>
-            </w:tcMar>
-          </w:tcPr>
-          <w:p>
-            <w:pPr>
-              <w:jc w:val="left"/>
-            </w:pPr>
-            <w:r>
-              <w:rPr>
-                <w:rFonts w:ascii="Arial" w:cs="Arial" w:eastAsia="Arial" w:hAnsi="Arial"/>
-                <w:b/>
-                <w:bCs/>
-                <w:color w:val="1D1D1F"/>
-                <w:sz w:val="20"/>
-                <w:szCs w:val="20"/>
-              </w:rPr>
-              <w:t xml:space="preserve">View Toggle</w:t>
-            </w:r>
-          </w:p>
-        </w:tc>
-        <w:tc>
-          <w:tcPr>
-            <w:tcW w:type="dxa" w:w="6960"/>
-            <w:tcBorders>
-              <w:top w:val="single" w:color="D2D2D7" w:sz="1"/>
-              <w:left w:val="single" w:color="D2D2D7" w:sz="1"/>
-              <w:bottom w:val="single" w:color="D2D2D7" w:sz="1"/>
-              <w:right w:val="single" w:color="D2D2D7" w:sz="1"/>
-            </w:tcBorders>
-            <w:tcMar>
-              <w:top w:type="dxa" w:w="80"/>
-              <w:left w:type="dxa" w:w="120"/>
-              <w:bottom w:type="dxa" w:w="80"/>
-              <w:right w:type="dxa" w:w="120"/>
-            </w:tcMar>
-          </w:tcPr>
-          <w:p>
-            <w:pPr>
-              <w:jc w:val="left"/>
-            </w:pPr>
-            <w:r>
-              <w:rPr>
-                <w:rFonts w:ascii="Arial" w:cs="Arial" w:eastAsia="Arial" w:hAnsi="Arial"/>
-                <w:b w:val="false"/>
-                <w:bCs w:val="false"/>
-                <w:color w:val="1D1D1F"/>
-                <w:sz w:val="20"/>
-                <w:szCs w:val="20"/>
-              </w:rPr>
-              <w:t xml:space="preserve">Switch between grid (cards) and list (table rows) layouts</w:t>
-            </w:r>
-          </w:p>
-        </w:tc>
-      </w:tr>
-      <w:tr>
-        <w:tc>
-          <w:tcPr>
-            <w:tcW w:type="dxa" w:w="2400"/>
-            <w:tcBorders>
-              <w:top w:val="single" w:color="D2D2D7" w:sz="1"/>
-              <w:left w:val="single" w:color="D2D2D7" w:sz="1"/>
-              <w:bottom w:val="single" w:color="D2D2D7" w:sz="1"/>
-              <w:right w:val="single" w:color="D2D2D7" w:sz="1"/>
-            </w:tcBorders>
-            <w:tcMar>
-              <w:top w:type="dxa" w:w="80"/>
-              <w:left w:type="dxa" w:w="120"/>
-              <w:bottom w:type="dxa" w:w="80"/>
-              <w:right w:type="dxa" w:w="120"/>
-            </w:tcMar>
-          </w:tcPr>
-          <w:p>
-            <w:pPr>
-              <w:jc w:val="left"/>
-            </w:pPr>
-            <w:r>
-              <w:rPr>
-                <w:rFonts w:ascii="Arial" w:cs="Arial" w:eastAsia="Arial" w:hAnsi="Arial"/>
-                <w:b/>
-                <w:bCs/>
-                <w:color w:val="1D1D1F"/>
-                <w:sz w:val="20"/>
-                <w:szCs w:val="20"/>
-              </w:rPr>
-              <w:t xml:space="preserve">Add Client</w:t>
-            </w:r>
-          </w:p>
-        </w:tc>
-        <w:tc>
-          <w:tcPr>
-            <w:tcW w:type="dxa" w:w="6960"/>
-            <w:tcBorders>
-              <w:top w:val="single" w:color="D2D2D7" w:sz="1"/>
-              <w:left w:val="single" w:color="D2D2D7" w:sz="1"/>
-              <w:bottom w:val="single" w:color="D2D2D7" w:sz="1"/>
-              <w:right w:val="single" w:color="D2D2D7" w:sz="1"/>
-            </w:tcBorders>
-            <w:tcMar>
-              <w:top w:type="dxa" w:w="80"/>
-              <w:left w:type="dxa" w:w="120"/>
-              <w:bottom w:type="dxa" w:w="80"/>
-              <w:right w:type="dxa" w:w="120"/>
-            </w:tcMar>
-          </w:tcPr>
-          <w:p>
-            <w:pPr>
-              <w:jc w:val="left"/>
-            </w:pPr>
-            <w:r>
-              <w:rPr>
-                <w:rFonts w:ascii="Arial" w:cs="Arial" w:eastAsia="Arial" w:hAnsi="Arial"/>
-                <w:b w:val="false"/>
-                <w:bCs w:val="false"/>
-                <w:color w:val="1D1D1F"/>
-                <w:sz w:val="20"/>
-                <w:szCs w:val="20"/>
-              </w:rPr>
-              <w:t xml:space="preserve">Create a new client record</w:t>
-            </w:r>
-          </w:p>
-        </w:tc>
-      </w:tr>
-      <w:tr>
-        <w:tc>
-          <w:tcPr>
-            <w:tcW w:type="dxa" w:w="2400"/>
-            <w:tcBorders>
-              <w:top w:val="single" w:color="D2D2D7" w:sz="1"/>
-              <w:left w:val="single" w:color="D2D2D7" w:sz="1"/>
-              <w:bottom w:val="single" w:color="D2D2D7" w:sz="1"/>
-              <w:right w:val="single" w:color="D2D2D7" w:sz="1"/>
-            </w:tcBorders>
-            <w:tcMar>
-              <w:top w:type="dxa" w:w="80"/>
-              <w:left w:type="dxa" w:w="120"/>
-              <w:bottom w:type="dxa" w:w="80"/>
-              <w:right w:type="dxa" w:w="120"/>
-            </w:tcMar>
-          </w:tcPr>
-          <w:p>
-            <w:pPr>
-              <w:jc w:val="left"/>
-            </w:pPr>
-            <w:r>
-              <w:rPr>
-                <w:rFonts w:ascii="Arial" w:cs="Arial" w:eastAsia="Arial" w:hAnsi="Arial"/>
-                <w:b/>
-                <w:bCs/>
-                <w:color w:val="1D1D1F"/>
-                <w:sz w:val="20"/>
-                <w:szCs w:val="20"/>
-              </w:rPr>
-              <w:t xml:space="preserve">3-Dot Menu</w:t>
-            </w:r>
-          </w:p>
-        </w:tc>
-        <w:tc>
-          <w:tcPr>
-            <w:tcW w:type="dxa" w:w="6960"/>
-            <w:tcBorders>
-              <w:top w:val="single" w:color="D2D2D7" w:sz="1"/>
-              <w:left w:val="single" w:color="D2D2D7" w:sz="1"/>
-              <w:bottom w:val="single" w:color="D2D2D7" w:sz="1"/>
-              <w:right w:val="single" w:color="D2D2D7" w:sz="1"/>
-            </w:tcBorders>
-            <w:tcMar>
-              <w:top w:type="dxa" w:w="80"/>
-              <w:left w:type="dxa" w:w="120"/>
-              <w:bottom w:type="dxa" w:w="80"/>
-              <w:right w:type="dxa" w:w="120"/>
-            </w:tcMar>
-          </w:tcPr>
-          <w:p>
-            <w:pPr>
-              <w:jc w:val="left"/>
-            </w:pPr>
-            <w:r>
-              <w:rPr>
-                <w:rFonts w:ascii="Arial" w:cs="Arial" w:eastAsia="Arial" w:hAnsi="Arial"/>
-                <w:b w:val="false"/>
-                <w:bCs w:val="false"/>
-                <w:color w:val="1D1D1F"/>
-                <w:sz w:val="20"/>
-                <w:szCs w:val="20"/>
-              </w:rPr>
-              <w:t xml:space="preserve">Change client status (Active/Paused) or archive the client</w:t>
-            </w:r>
-          </w:p>
-        </w:tc>
-      </w:tr>
-      <w:tr>
-        <w:tc>
-          <w:tcPr>
-            <w:tcW w:type="dxa" w:w="2400"/>
-            <w:tcBorders>
-              <w:top w:val="single" w:color="D2D2D7" w:sz="1"/>
-              <w:left w:val="single" w:color="D2D2D7" w:sz="1"/>
-              <w:bottom w:val="single" w:color="D2D2D7" w:sz="1"/>
-              <w:right w:val="single" w:color="D2D2D7" w:sz="1"/>
-            </w:tcBorders>
-            <w:tcMar>
-              <w:top w:type="dxa" w:w="80"/>
-              <w:left w:type="dxa" w:w="120"/>
-              <w:bottom w:type="dxa" w:w="80"/>
-              <w:right w:type="dxa" w:w="120"/>
-            </w:tcMar>
-          </w:tcPr>
-          <w:p>
-            <w:pPr>
-              <w:jc w:val="left"/>
-            </w:pPr>
-            <w:r>
-              <w:rPr>
-                <w:rFonts w:ascii="Arial" w:cs="Arial" w:eastAsia="Arial" w:hAnsi="Arial"/>
-                <w:b/>
-                <w:bCs/>
-                <w:color w:val="1D1D1F"/>
-                <w:sz w:val="20"/>
-                <w:szCs w:val="20"/>
-              </w:rPr>
-              <w:t xml:space="preserve">Tabs</w:t>
-            </w:r>
-          </w:p>
-        </w:tc>
-        <w:tc>
-          <w:tcPr>
-            <w:tcW w:type="dxa" w:w="6960"/>
-            <w:tcBorders>
-              <w:top w:val="single" w:color="D2D2D7" w:sz="1"/>
-              <w:left w:val="single" w:color="D2D2D7" w:sz="1"/>
-              <w:bottom w:val="single" w:color="D2D2D7" w:sz="1"/>
-              <w:right w:val="single" w:color="D2D2D7" w:sz="1"/>
-            </w:tcBorders>
-            <w:tcMar>
-              <w:top w:type="dxa" w:w="80"/>
-              <w:left w:type="dxa" w:w="120"/>
-              <w:bottom w:type="dxa" w:w="80"/>
-              <w:right w:type="dxa" w:w="120"/>
-            </w:tcMar>
-          </w:tcPr>
-          <w:p>
-            <w:pPr>
-              <w:jc w:val="left"/>
-            </w:pPr>
-            <w:r>
-              <w:rPr>
-                <w:rFonts w:ascii="Arial" w:cs="Arial" w:eastAsia="Arial" w:hAnsi="Arial"/>
-                <w:b w:val="false"/>
-                <w:bCs w:val="false"/>
-                <w:color w:val="1D1D1F"/>
-                <w:sz w:val="20"/>
-                <w:szCs w:val="20"/>
-              </w:rPr>
-              <w:t xml:space="preserve">Switch between Active Clients (6) and Archived (2)</w:t>
-            </w:r>
-          </w:p>
-        </w:tc>
-      </w:tr>
-    </w:tbl>
-    <w:p>
-      <w:r>
-        <w:br w:type="page"/>
-      </w:r>
-    </w:p>
-    <w:p>
-      <w:pPr>
-        <w:pStyle w:val="Heading2"/>
-      </w:pPr>
-      <w:r>
-        <w:rPr>
-          <w:b/>
-          <w:bCs/>
-        </w:rPr>
-        <w:t xml:space="preserve">3.2 Layer 2: Client Dashboard &amp; Services</w:t>
-      </w:r>
-    </w:p>
-    <w:tbl>
-      <w:tblPr>
-        <w:tblW w:type="dxa" w:w="9360"/>
-        <w:tblBorders>
-          <w:top w:val="single" w:color="auto" w:sz="4"/>
-          <w:left w:val="single" w:color="auto" w:sz="4"/>
-          <w:bottom w:val="single" w:color="auto" w:sz="4"/>
-          <w:right w:val="single" w:color="auto" w:sz="4"/>
-          <w:insideH w:val="single" w:color="auto" w:sz="4"/>
-          <w:insideV w:val="single" w:color="auto" w:sz="4"/>
-        </w:tblBorders>
-      </w:tblPr>
-      <w:tblGrid>
-        <w:gridCol w:w="9360"/>
-      </w:tblGrid>
-      <w:tr>
-        <w:tc>
-          <w:tcPr>
-            <w:tcW w:type="dxa" w:w="9360"/>
-            <w:tcBorders>
-              <w:top w:val="single" w:color="0071E3" w:sz="3"/>
-              <w:left w:val="single" w:color="0071E3" w:sz="3"/>
-              <w:bottom w:val="single" w:color="0071E3" w:sz="3"/>
-              <w:right w:val="single" w:color="0071E3" w:sz="3"/>
-            </w:tcBorders>
-            <w:shd w:fill="E8F0FF" w:val="clear"/>
-            <w:tcMar>
-              <w:top w:type="dxa" w:w="120"/>
-              <w:left w:type="dxa" w:w="160"/>
-              <w:bottom w:type="dxa" w:w="120"/>
-              <w:right w:type="dxa" w:w="160"/>
-            </w:tcMar>
-          </w:tcPr>
-          <w:p>
-            <w:pPr>
-              <w:spacing w:after="60"/>
-            </w:pPr>
-            <w:r>
-              <w:rPr>
-                <w:rFonts w:ascii="Arial" w:cs="Arial" w:eastAsia="Arial" w:hAnsi="Arial"/>
-                <w:b/>
-                <w:bCs/>
-                <w:color w:val="1D1D1F"/>
-                <w:sz w:val="20"/>
-                <w:szCs w:val="20"/>
-              </w:rPr>
-              <w:t xml:space="preserve">Live Demo — Services Page</w:t>
-            </w:r>
-          </w:p>
-          <w:p>
-            <w:hyperlink w:history="1" r:id="rId2oaekzpxnhwbka3pvcrzy">
-              <w:r>
-                <w:rPr>
-                  <w:rStyle w:val="Hyperlink"/>
-                  <w:rFonts w:ascii="Arial" w:cs="Arial" w:eastAsia="Arial" w:hAnsi="Arial"/>
-                  <w:sz w:val="20"/>
-                  <w:szCs w:val="20"/>
-                </w:rPr>
-                <w:t xml:space="preserve">https://nikkortrinidad-cpu.github.io/kanban-website/mockups/02-services.html</w:t>
-              </w:r>
-            </w:hyperlink>
-          </w:p>
-        </w:tc>
-      </w:tr>
-    </w:tbl>
-    <w:p>
-      <w:pPr>
-        <w:spacing w:after="120" w:before="200"/>
-      </w:pPr>
+        <w:t xml:space="preserve">List View:</w:t>
+      </w:r>
     </w:p>
     <w:p>
       <w:pPr>
@@ -1849,33 +1192,7 @@
           <w:sz w:val="22"/>
           <w:szCs w:val="22"/>
         </w:rPr>
-        <w:t xml:space="preserve">Click any client card and you land here. This is the full client dashboard — it shows everything about a specific client in one place.</w:t>
-      </w:r>
-    </w:p>
-    <w:p>
-      <w:pPr>
-        <w:pStyle w:val="Heading3"/>
-      </w:pPr>
-      <w:r>
-        <w:rPr>
-          <w:b/>
-          <w:bCs/>
-        </w:rPr>
-        <w:t xml:space="preserve">Client Header &amp; Service Cards</w:t>
-      </w:r>
-    </w:p>
-    <w:p>
-      <w:pPr>
-        <w:spacing w:after="120"/>
-      </w:pPr>
-      <w:r>
-        <w:rPr>
-          <w:rFonts w:ascii="Arial" w:cs="Arial" w:eastAsia="Arial" w:hAnsi="Arial"/>
-          <w:color w:val="1D1D1F"/>
-          <w:sz w:val="22"/>
-          <w:szCs w:val="22"/>
-        </w:rPr>
-        <w:t xml:space="preserve">At the top: the client’s name, industry, location, and contact information. Two action buttons: open Analytics or Add a new Service. Below that, a quick actions bar for common tasks (Send Email, Schedule Meeting, Create Invoice, Add Note, Add Document, Add Contact). Then the active service cards, each showing the service name, status, progress bar, task count, and last updated timestamp.</w:t>
+        <w:t xml:space="preserve">Toggle to list view for a compact, table-like layout with column headers (Client, Status, Services, Tasks, Revenue, Activity). Better for scanning large numbers of clients quickly.</w:t>
       </w:r>
     </w:p>
     <w:tbl>
@@ -1972,7 +1289,7 @@
           <w:sz w:val="18"/>
           <w:szCs w:val="18"/>
         </w:rPr>
-        <w:t xml:space="preserve">Figure 3: Client dashboard — Header, quick actions bar, and active service cards</w:t>
+        <w:t xml:space="preserve">Figure 2: Clients page — List view with sortable columns</w:t>
       </w:r>
     </w:p>
     <w:p>
@@ -1984,21 +1301,7 @@
           <w:b/>
           <w:bCs/>
         </w:rPr>
-        <w:t xml:space="preserve">Client Overview Section</w:t>
-      </w:r>
-    </w:p>
-    <w:p>
-      <w:pPr>
-        <w:spacing w:after="120"/>
-      </w:pPr>
-      <w:r>
-        <w:rPr>
-          <w:rFonts w:ascii="Arial" w:cs="Arial" w:eastAsia="Arial" w:hAnsi="Arial"/>
-          <w:color w:val="1D1D1F"/>
-          <w:sz w:val="22"/>
-          <w:szCs w:val="22"/>
-        </w:rPr>
-        <w:t xml:space="preserve">Below the services, a grid of overview cards gives a complete picture of the client relationship:</w:t>
+        <w:t xml:space="preserve">Key functions:</w:t>
       </w:r>
     </w:p>
     <w:tbl>
@@ -2014,13 +1317,13 @@
         </w:tblBorders>
       </w:tblPr>
       <w:tblGrid>
-        <w:gridCol w:w="2200"/>
-        <w:gridCol w:w="7160"/>
+        <w:gridCol w:w="2400"/>
+        <w:gridCol w:w="6960"/>
       </w:tblGrid>
       <w:tr>
         <w:tc>
           <w:tcPr>
-            <w:tcW w:type="dxa" w:w="2200"/>
+            <w:tcW w:type="dxa" w:w="2400"/>
             <w:tcBorders>
               <w:top w:val="single" w:color="D2D2D7" w:sz="1"/>
               <w:left w:val="single" w:color="D2D2D7" w:sz="1"/>
@@ -2048,13 +1351,13 @@
                 <w:sz w:val="20"/>
                 <w:szCs w:val="20"/>
               </w:rPr>
-              <w:t xml:space="preserve">Card</w:t>
-            </w:r>
-          </w:p>
-        </w:tc>
-        <w:tc>
-          <w:tcPr>
-            <w:tcW w:type="dxa" w:w="7160"/>
+              <w:t xml:space="preserve">Function</w:t>
+            </w:r>
+          </w:p>
+        </w:tc>
+        <w:tc>
+          <w:tcPr>
+            <w:tcW w:type="dxa" w:w="6960"/>
             <w:tcBorders>
               <w:top w:val="single" w:color="D2D2D7" w:sz="1"/>
               <w:left w:val="single" w:color="D2D2D7" w:sz="1"/>
@@ -2082,7 +1385,7 @@
                 <w:sz w:val="20"/>
                 <w:szCs w:val="20"/>
               </w:rPr>
-              <w:t xml:space="preserve">What it shows</w:t>
+              <w:t xml:space="preserve">What it does</w:t>
             </w:r>
           </w:p>
         </w:tc>
@@ -2090,7 +1393,7 @@
       <w:tr>
         <w:tc>
           <w:tcPr>
-            <w:tcW w:type="dxa" w:w="2200"/>
+            <w:tcW w:type="dxa" w:w="2400"/>
             <w:tcBorders>
               <w:top w:val="single" w:color="D2D2D7" w:sz="1"/>
               <w:left w:val="single" w:color="D2D2D7" w:sz="1"/>
@@ -2117,13 +1420,13 @@
                 <w:sz w:val="20"/>
                 <w:szCs w:val="20"/>
               </w:rPr>
-              <w:t xml:space="preserve">People</w:t>
-            </w:r>
-          </w:p>
-        </w:tc>
-        <w:tc>
-          <w:tcPr>
-            <w:tcW w:type="dxa" w:w="7160"/>
+              <w:t xml:space="preserve">Search</w:t>
+            </w:r>
+          </w:p>
+        </w:tc>
+        <w:tc>
+          <w:tcPr>
+            <w:tcW w:type="dxa" w:w="6960"/>
             <w:tcBorders>
               <w:top w:val="single" w:color="D2D2D7" w:sz="1"/>
               <w:left w:val="single" w:color="D2D2D7" w:sz="1"/>
@@ -2150,7 +1453,7 @@
                 <w:sz w:val="20"/>
                 <w:szCs w:val="20"/>
               </w:rPr>
-              <w:t xml:space="preserve">Account manager and team members assigned to this client, with roles and contact shortcuts</w:t>
+              <w:t xml:space="preserve">Filter clients by name in real time</w:t>
             </w:r>
           </w:p>
         </w:tc>
@@ -2158,7 +1461,7 @@
       <w:tr>
         <w:tc>
           <w:tcPr>
-            <w:tcW w:type="dxa" w:w="2200"/>
+            <w:tcW w:type="dxa" w:w="2400"/>
             <w:tcBorders>
               <w:top w:val="single" w:color="D2D2D7" w:sz="1"/>
               <w:left w:val="single" w:color="D2D2D7" w:sz="1"/>
@@ -2185,13 +1488,13 @@
                 <w:sz w:val="20"/>
                 <w:szCs w:val="20"/>
               </w:rPr>
-              <w:t xml:space="preserve">Meetings</w:t>
-            </w:r>
-          </w:p>
-        </w:tc>
-        <w:tc>
-          <w:tcPr>
-            <w:tcW w:type="dxa" w:w="7160"/>
+              <w:t xml:space="preserve">Sort</w:t>
+            </w:r>
+          </w:p>
+        </w:tc>
+        <w:tc>
+          <w:tcPr>
+            <w:tcW w:type="dxa" w:w="6960"/>
             <w:tcBorders>
               <w:top w:val="single" w:color="D2D2D7" w:sz="1"/>
               <w:left w:val="single" w:color="D2D2D7" w:sz="1"/>
@@ -2218,7 +1521,7 @@
                 <w:sz w:val="20"/>
                 <w:szCs w:val="20"/>
               </w:rPr>
-              <w:t xml:space="preserve">Last meeting, next scheduled meeting, frequency, attendees, links to recordings and agendas</w:t>
+              <w:t xml:space="preserve">9 options: Default, Name (A-Z / Z-A), Most/Least Tasks, Most/Least Services, Highest/Lowest Revenue</w:t>
             </w:r>
           </w:p>
         </w:tc>
@@ -2226,7 +1529,7 @@
       <w:tr>
         <w:tc>
           <w:tcPr>
-            <w:tcW w:type="dxa" w:w="2200"/>
+            <w:tcW w:type="dxa" w:w="2400"/>
             <w:tcBorders>
               <w:top w:val="single" w:color="D2D2D7" w:sz="1"/>
               <w:left w:val="single" w:color="D2D2D7" w:sz="1"/>
@@ -2253,13 +1556,13 @@
                 <w:sz w:val="20"/>
                 <w:szCs w:val="20"/>
               </w:rPr>
-              <w:t xml:space="preserve">Documents</w:t>
-            </w:r>
-          </w:p>
-        </w:tc>
-        <w:tc>
-          <w:tcPr>
-            <w:tcW w:type="dxa" w:w="7160"/>
+              <w:t xml:space="preserve">Filter</w:t>
+            </w:r>
+          </w:p>
+        </w:tc>
+        <w:tc>
+          <w:tcPr>
+            <w:tcW w:type="dxa" w:w="6960"/>
             <w:tcBorders>
               <w:top w:val="single" w:color="D2D2D7" w:sz="1"/>
               <w:left w:val="single" w:color="D2D2D7" w:sz="1"/>
@@ -2286,7 +1589,7 @@
                 <w:sz w:val="20"/>
                 <w:szCs w:val="20"/>
               </w:rPr>
-              <w:t xml:space="preserve">Document checklist with signing status (Contract, NDA, SOW, Proposal, Brand Guidelines) plus Google Drive link</w:t>
+              <w:t xml:space="preserve">Filter by service type: Web, Mobile, SEO, Cloud, Design, Content, Social, Branding</w:t>
             </w:r>
           </w:p>
         </w:tc>
@@ -2294,7 +1597,7 @@
       <w:tr>
         <w:tc>
           <w:tcPr>
-            <w:tcW w:type="dxa" w:w="2200"/>
+            <w:tcW w:type="dxa" w:w="2400"/>
             <w:tcBorders>
               <w:top w:val="single" w:color="D2D2D7" w:sz="1"/>
               <w:left w:val="single" w:color="D2D2D7" w:sz="1"/>
@@ -2321,13 +1624,13 @@
                 <w:sz w:val="20"/>
                 <w:szCs w:val="20"/>
               </w:rPr>
-              <w:t xml:space="preserve">Billing</w:t>
-            </w:r>
-          </w:p>
-        </w:tc>
-        <w:tc>
-          <w:tcPr>
-            <w:tcW w:type="dxa" w:w="7160"/>
+              <w:t xml:space="preserve">View Toggle</w:t>
+            </w:r>
+          </w:p>
+        </w:tc>
+        <w:tc>
+          <w:tcPr>
+            <w:tcW w:type="dxa" w:w="6960"/>
             <w:tcBorders>
               <w:top w:val="single" w:color="D2D2D7" w:sz="1"/>
               <w:left w:val="single" w:color="D2D2D7" w:sz="1"/>
@@ -2354,7 +1657,7 @@
                 <w:sz w:val="20"/>
                 <w:szCs w:val="20"/>
               </w:rPr>
-              <w:t xml:space="preserve">Payment status, current invoice amount, last payment date, next invoice date, recent invoice history, Xero link</w:t>
+              <w:t xml:space="preserve">Switch between grid (cards) and list (table rows) layouts</w:t>
             </w:r>
           </w:p>
         </w:tc>
@@ -2362,7 +1665,7 @@
       <w:tr>
         <w:tc>
           <w:tcPr>
-            <w:tcW w:type="dxa" w:w="2200"/>
+            <w:tcW w:type="dxa" w:w="2400"/>
             <w:tcBorders>
               <w:top w:val="single" w:color="D2D2D7" w:sz="1"/>
               <w:left w:val="single" w:color="D2D2D7" w:sz="1"/>
@@ -2389,13 +1692,13 @@
                 <w:sz w:val="20"/>
                 <w:szCs w:val="20"/>
               </w:rPr>
-              <w:t xml:space="preserve">Key Contacts</w:t>
-            </w:r>
-          </w:p>
-        </w:tc>
-        <w:tc>
-          <w:tcPr>
-            <w:tcW w:type="dxa" w:w="7160"/>
+              <w:t xml:space="preserve">Add Client</w:t>
+            </w:r>
+          </w:p>
+        </w:tc>
+        <w:tc>
+          <w:tcPr>
+            <w:tcW w:type="dxa" w:w="6960"/>
             <w:tcBorders>
               <w:top w:val="single" w:color="D2D2D7" w:sz="1"/>
               <w:left w:val="single" w:color="D2D2D7" w:sz="1"/>
@@ -2422,7 +1725,7 @@
                 <w:sz w:val="20"/>
                 <w:szCs w:val="20"/>
               </w:rPr>
-              <w:t xml:space="preserve">Client-side contacts with roles, email, phone, and quick action buttons</w:t>
+              <w:t xml:space="preserve">Create a new client record</w:t>
             </w:r>
           </w:p>
         </w:tc>
@@ -2430,7 +1733,7 @@
       <w:tr>
         <w:tc>
           <w:tcPr>
-            <w:tcW w:type="dxa" w:w="2200"/>
+            <w:tcW w:type="dxa" w:w="2400"/>
             <w:tcBorders>
               <w:top w:val="single" w:color="D2D2D7" w:sz="1"/>
               <w:left w:val="single" w:color="D2D2D7" w:sz="1"/>
@@ -2457,13 +1760,13 @@
                 <w:sz w:val="20"/>
                 <w:szCs w:val="20"/>
               </w:rPr>
-              <w:t xml:space="preserve">Contract Details</w:t>
-            </w:r>
-          </w:p>
-        </w:tc>
-        <w:tc>
-          <w:tcPr>
-            <w:tcW w:type="dxa" w:w="7160"/>
+              <w:t xml:space="preserve">3-Dot Menu</w:t>
+            </w:r>
+          </w:p>
+        </w:tc>
+        <w:tc>
+          <w:tcPr>
+            <w:tcW w:type="dxa" w:w="6960"/>
             <w:tcBorders>
               <w:top w:val="single" w:color="D2D2D7" w:sz="1"/>
               <w:left w:val="single" w:color="D2D2D7" w:sz="1"/>
@@ -2490,7 +1793,7 @@
                 <w:sz w:val="20"/>
                 <w:szCs w:val="20"/>
               </w:rPr>
-              <w:t xml:space="preserve">Contract type, start/end dates, auto-renewal status, monthly retainer, total contract value</w:t>
+              <w:t xml:space="preserve">Change client status (Active/Paused) or archive the client</w:t>
             </w:r>
           </w:p>
         </w:tc>
@@ -2498,7 +1801,7 @@
       <w:tr>
         <w:tc>
           <w:tcPr>
-            <w:tcW w:type="dxa" w:w="2200"/>
+            <w:tcW w:type="dxa" w:w="2400"/>
             <w:tcBorders>
               <w:top w:val="single" w:color="D2D2D7" w:sz="1"/>
               <w:left w:val="single" w:color="D2D2D7" w:sz="1"/>
@@ -2525,13 +1828,13 @@
                 <w:sz w:val="20"/>
                 <w:szCs w:val="20"/>
               </w:rPr>
-              <w:t xml:space="preserve">Internal Notes</w:t>
-            </w:r>
-          </w:p>
-        </w:tc>
-        <w:tc>
-          <w:tcPr>
-            <w:tcW w:type="dxa" w:w="7160"/>
+              <w:t xml:space="preserve">Tabs</w:t>
+            </w:r>
+          </w:p>
+        </w:tc>
+        <w:tc>
+          <w:tcPr>
+            <w:tcW w:type="dxa" w:w="6960"/>
             <w:tcBorders>
               <w:top w:val="single" w:color="D2D2D7" w:sz="1"/>
               <w:left w:val="single" w:color="D2D2D7" w:sz="1"/>
@@ -2558,31 +1861,65 @@
                 <w:sz w:val="20"/>
                 <w:szCs w:val="20"/>
               </w:rPr>
-              <w:t xml:space="preserve">Timestamped notes from team members — preferences, upsell opportunities, important context</w:t>
+              <w:t xml:space="preserve">Switch between Active Clients (6) and Archived (2)</w:t>
             </w:r>
           </w:p>
         </w:tc>
       </w:tr>
+    </w:tbl>
+    <w:p>
+      <w:r>
+        <w:br w:type="page"/>
+      </w:r>
+    </w:p>
+    <w:p>
+      <w:pPr>
+        <w:pStyle w:val="Heading2"/>
+      </w:pPr>
+      <w:r>
+        <w:rPr>
+          <w:b/>
+          <w:bCs/>
+        </w:rPr>
+        <w:t xml:space="preserve">3.2 Layer 2: Client Dashboard &amp; Services</w:t>
+      </w:r>
+    </w:p>
+    <w:tbl>
+      <w:tblPr>
+        <w:tblW w:type="dxa" w:w="9360"/>
+        <w:tblBorders>
+          <w:top w:val="single" w:color="auto" w:sz="4"/>
+          <w:left w:val="single" w:color="auto" w:sz="4"/>
+          <w:bottom w:val="single" w:color="auto" w:sz="4"/>
+          <w:right w:val="single" w:color="auto" w:sz="4"/>
+          <w:insideH w:val="single" w:color="auto" w:sz="4"/>
+          <w:insideV w:val="single" w:color="auto" w:sz="4"/>
+        </w:tblBorders>
+      </w:tblPr>
+      <w:tblGrid>
+        <w:gridCol w:w="9360"/>
+      </w:tblGrid>
       <w:tr>
         <w:tc>
           <w:tcPr>
-            <w:tcW w:type="dxa" w:w="2200"/>
-            <w:tcBorders>
-              <w:top w:val="single" w:color="D2D2D7" w:sz="1"/>
-              <w:left w:val="single" w:color="D2D2D7" w:sz="1"/>
-              <w:bottom w:val="single" w:color="D2D2D7" w:sz="1"/>
-              <w:right w:val="single" w:color="D2D2D7" w:sz="1"/>
-            </w:tcBorders>
-            <w:tcMar>
-              <w:top w:type="dxa" w:w="80"/>
-              <w:left w:type="dxa" w:w="120"/>
-              <w:bottom w:type="dxa" w:w="80"/>
-              <w:right w:type="dxa" w:w="120"/>
-            </w:tcMar>
-          </w:tcPr>
-          <w:p>
-            <w:pPr>
-              <w:jc w:val="left"/>
+            <w:tcW w:type="dxa" w:w="9360"/>
+            <w:tcBorders>
+              <w:top w:val="single" w:color="0071E3" w:sz="3"/>
+              <w:left w:val="single" w:color="0071E3" w:sz="3"/>
+              <w:bottom w:val="single" w:color="0071E3" w:sz="3"/>
+              <w:right w:val="single" w:color="0071E3" w:sz="3"/>
+            </w:tcBorders>
+            <w:shd w:fill="E8F0FF" w:val="clear"/>
+            <w:tcMar>
+              <w:top w:type="dxa" w:w="120"/>
+              <w:left w:type="dxa" w:w="160"/>
+              <w:bottom w:type="dxa" w:w="120"/>
+              <w:right w:type="dxa" w:w="160"/>
+            </w:tcMar>
+          </w:tcPr>
+          <w:p>
+            <w:pPr>
+              <w:spacing w:after="60"/>
             </w:pPr>
             <w:r>
               <w:rPr>
@@ -2593,49 +1930,69 @@
                 <w:sz w:val="20"/>
                 <w:szCs w:val="20"/>
               </w:rPr>
-              <w:t xml:space="preserve">Communications</w:t>
-            </w:r>
-          </w:p>
-        </w:tc>
-        <w:tc>
-          <w:tcPr>
-            <w:tcW w:type="dxa" w:w="7160"/>
-            <w:tcBorders>
-              <w:top w:val="single" w:color="D2D2D7" w:sz="1"/>
-              <w:left w:val="single" w:color="D2D2D7" w:sz="1"/>
-              <w:bottom w:val="single" w:color="D2D2D7" w:sz="1"/>
-              <w:right w:val="single" w:color="D2D2D7" w:sz="1"/>
-            </w:tcBorders>
-            <w:tcMar>
-              <w:top w:type="dxa" w:w="80"/>
-              <w:left w:type="dxa" w:w="120"/>
-              <w:bottom w:type="dxa" w:w="80"/>
-              <w:right w:type="dxa" w:w="120"/>
-            </w:tcMar>
-          </w:tcPr>
-          <w:p>
-            <w:pPr>
-              <w:jc w:val="left"/>
-            </w:pPr>
-            <w:r>
-              <w:rPr>
-                <w:rFonts w:ascii="Arial" w:cs="Arial" w:eastAsia="Arial" w:hAnsi="Arial"/>
-                <w:b w:val="false"/>
-                <w:bCs w:val="false"/>
-                <w:color w:val="1D1D1F"/>
-                <w:sz w:val="20"/>
-                <w:szCs w:val="20"/>
-              </w:rPr>
-              <w:t xml:space="preserve">Recent activity log: emails sent, calls made, meetings held, Slack messages — with timestamps</w:t>
-            </w:r>
+              <w:t xml:space="preserve">Live Demo — Services Page</w:t>
+            </w:r>
+          </w:p>
+          <w:p>
+            <w:hyperlink w:history="1" r:id="rIdqkzjwsc9-cxl1fqdprwvt">
+              <w:r>
+                <w:rPr>
+                  <w:rStyle w:val="Hyperlink"/>
+                  <w:rFonts w:ascii="Arial" w:cs="Arial" w:eastAsia="Arial" w:hAnsi="Arial"/>
+                  <w:sz w:val="20"/>
+                  <w:szCs w:val="20"/>
+                </w:rPr>
+                <w:t xml:space="preserve">https://nikkortrinidad-cpu.github.io/kanban-website/mockups/02-services.html</w:t>
+              </w:r>
+            </w:hyperlink>
           </w:p>
         </w:tc>
       </w:tr>
     </w:tbl>
     <w:p>
       <w:pPr>
-        <w:spacing w:after="160"/>
-      </w:pPr>
+        <w:spacing w:after="120" w:before="200"/>
+      </w:pPr>
+    </w:p>
+    <w:p>
+      <w:pPr>
+        <w:spacing w:after="120"/>
+      </w:pPr>
+      <w:r>
+        <w:rPr>
+          <w:rFonts w:ascii="Arial" w:cs="Arial" w:eastAsia="Arial" w:hAnsi="Arial"/>
+          <w:color w:val="1D1D1F"/>
+          <w:sz w:val="22"/>
+          <w:szCs w:val="22"/>
+        </w:rPr>
+        <w:t xml:space="preserve">Click any client card and you land here. This is the full client dashboard — it shows everything about a specific client in one place.</w:t>
+      </w:r>
+    </w:p>
+    <w:p>
+      <w:pPr>
+        <w:pStyle w:val="Heading3"/>
+      </w:pPr>
+      <w:r>
+        <w:rPr>
+          <w:b/>
+          <w:bCs/>
+        </w:rPr>
+        <w:t xml:space="preserve">Client Header &amp; Service Cards</w:t>
+      </w:r>
+    </w:p>
+    <w:p>
+      <w:pPr>
+        <w:spacing w:after="120"/>
+      </w:pPr>
+      <w:r>
+        <w:rPr>
+          <w:rFonts w:ascii="Arial" w:cs="Arial" w:eastAsia="Arial" w:hAnsi="Arial"/>
+          <w:color w:val="1D1D1F"/>
+          <w:sz w:val="22"/>
+          <w:szCs w:val="22"/>
+        </w:rPr>
+        <w:t xml:space="preserve">At the top: the client’s name, industry, location, and contact information. Two action buttons: open Analytics or Add a new Service. Below that, a quick actions bar for common tasks (Send Email, Schedule Meeting, Create Invoice, Add Note, Add Document, Add Contact). Then the active service cards, each showing the service name, status, progress bar, task count, and last updated timestamp.</w:t>
+      </w:r>
     </w:p>
     <w:tbl>
       <w:tblPr>
@@ -2731,8 +2088,670 @@
           <w:sz w:val="18"/>
           <w:szCs w:val="18"/>
         </w:rPr>
-        <w:t xml:space="preserve">Figure 4: Overview cards — People, Meetings, Documents, and Billing</w:t>
-      </w:r>
+        <w:t xml:space="preserve">Figure 3: Client dashboard — Header, quick actions bar, and active service cards</w:t>
+      </w:r>
+    </w:p>
+    <w:p>
+      <w:pPr>
+        <w:pStyle w:val="Heading3"/>
+      </w:pPr>
+      <w:r>
+        <w:rPr>
+          <w:b/>
+          <w:bCs/>
+        </w:rPr>
+        <w:t xml:space="preserve">Client Overview Section</w:t>
+      </w:r>
+    </w:p>
+    <w:p>
+      <w:pPr>
+        <w:spacing w:after="120"/>
+      </w:pPr>
+      <w:r>
+        <w:rPr>
+          <w:rFonts w:ascii="Arial" w:cs="Arial" w:eastAsia="Arial" w:hAnsi="Arial"/>
+          <w:color w:val="1D1D1F"/>
+          <w:sz w:val="22"/>
+          <w:szCs w:val="22"/>
+        </w:rPr>
+        <w:t xml:space="preserve">Below the services, a grid of overview cards gives a complete picture of the client relationship:</w:t>
+      </w:r>
+    </w:p>
+    <w:tbl>
+      <w:tblPr>
+        <w:tblW w:type="dxa" w:w="9360"/>
+        <w:tblBorders>
+          <w:top w:val="single" w:color="auto" w:sz="4"/>
+          <w:left w:val="single" w:color="auto" w:sz="4"/>
+          <w:bottom w:val="single" w:color="auto" w:sz="4"/>
+          <w:right w:val="single" w:color="auto" w:sz="4"/>
+          <w:insideH w:val="single" w:color="auto" w:sz="4"/>
+          <w:insideV w:val="single" w:color="auto" w:sz="4"/>
+        </w:tblBorders>
+      </w:tblPr>
+      <w:tblGrid>
+        <w:gridCol w:w="2200"/>
+        <w:gridCol w:w="7160"/>
+      </w:tblGrid>
+      <w:tr>
+        <w:tc>
+          <w:tcPr>
+            <w:tcW w:type="dxa" w:w="2200"/>
+            <w:tcBorders>
+              <w:top w:val="single" w:color="D2D2D7" w:sz="1"/>
+              <w:left w:val="single" w:color="D2D2D7" w:sz="1"/>
+              <w:bottom w:val="single" w:color="D2D2D7" w:sz="1"/>
+              <w:right w:val="single" w:color="D2D2D7" w:sz="1"/>
+            </w:tcBorders>
+            <w:shd w:fill="E8F0FF" w:val="clear"/>
+            <w:tcMar>
+              <w:top w:type="dxa" w:w="80"/>
+              <w:left w:type="dxa" w:w="120"/>
+              <w:bottom w:type="dxa" w:w="80"/>
+              <w:right w:type="dxa" w:w="120"/>
+            </w:tcMar>
+          </w:tcPr>
+          <w:p>
+            <w:pPr>
+              <w:jc w:val="left"/>
+            </w:pPr>
+            <w:r>
+              <w:rPr>
+                <w:rFonts w:ascii="Arial" w:cs="Arial" w:eastAsia="Arial" w:hAnsi="Arial"/>
+                <w:b/>
+                <w:bCs/>
+                <w:color w:val="1D1D1F"/>
+                <w:sz w:val="20"/>
+                <w:szCs w:val="20"/>
+              </w:rPr>
+              <w:t xml:space="preserve">Card</w:t>
+            </w:r>
+          </w:p>
+        </w:tc>
+        <w:tc>
+          <w:tcPr>
+            <w:tcW w:type="dxa" w:w="7160"/>
+            <w:tcBorders>
+              <w:top w:val="single" w:color="D2D2D7" w:sz="1"/>
+              <w:left w:val="single" w:color="D2D2D7" w:sz="1"/>
+              <w:bottom w:val="single" w:color="D2D2D7" w:sz="1"/>
+              <w:right w:val="single" w:color="D2D2D7" w:sz="1"/>
+            </w:tcBorders>
+            <w:shd w:fill="E8F0FF" w:val="clear"/>
+            <w:tcMar>
+              <w:top w:type="dxa" w:w="80"/>
+              <w:left w:type="dxa" w:w="120"/>
+              <w:bottom w:type="dxa" w:w="80"/>
+              <w:right w:type="dxa" w:w="120"/>
+            </w:tcMar>
+          </w:tcPr>
+          <w:p>
+            <w:pPr>
+              <w:jc w:val="left"/>
+            </w:pPr>
+            <w:r>
+              <w:rPr>
+                <w:rFonts w:ascii="Arial" w:cs="Arial" w:eastAsia="Arial" w:hAnsi="Arial"/>
+                <w:b/>
+                <w:bCs/>
+                <w:color w:val="1D1D1F"/>
+                <w:sz w:val="20"/>
+                <w:szCs w:val="20"/>
+              </w:rPr>
+              <w:t xml:space="preserve">What it shows</w:t>
+            </w:r>
+          </w:p>
+        </w:tc>
+      </w:tr>
+      <w:tr>
+        <w:tc>
+          <w:tcPr>
+            <w:tcW w:type="dxa" w:w="2200"/>
+            <w:tcBorders>
+              <w:top w:val="single" w:color="D2D2D7" w:sz="1"/>
+              <w:left w:val="single" w:color="D2D2D7" w:sz="1"/>
+              <w:bottom w:val="single" w:color="D2D2D7" w:sz="1"/>
+              <w:right w:val="single" w:color="D2D2D7" w:sz="1"/>
+            </w:tcBorders>
+            <w:tcMar>
+              <w:top w:type="dxa" w:w="80"/>
+              <w:left w:type="dxa" w:w="120"/>
+              <w:bottom w:type="dxa" w:w="80"/>
+              <w:right w:type="dxa" w:w="120"/>
+            </w:tcMar>
+          </w:tcPr>
+          <w:p>
+            <w:pPr>
+              <w:jc w:val="left"/>
+            </w:pPr>
+            <w:r>
+              <w:rPr>
+                <w:rFonts w:ascii="Arial" w:cs="Arial" w:eastAsia="Arial" w:hAnsi="Arial"/>
+                <w:b/>
+                <w:bCs/>
+                <w:color w:val="1D1D1F"/>
+                <w:sz w:val="20"/>
+                <w:szCs w:val="20"/>
+              </w:rPr>
+              <w:t xml:space="preserve">People</w:t>
+            </w:r>
+          </w:p>
+        </w:tc>
+        <w:tc>
+          <w:tcPr>
+            <w:tcW w:type="dxa" w:w="7160"/>
+            <w:tcBorders>
+              <w:top w:val="single" w:color="D2D2D7" w:sz="1"/>
+              <w:left w:val="single" w:color="D2D2D7" w:sz="1"/>
+              <w:bottom w:val="single" w:color="D2D2D7" w:sz="1"/>
+              <w:right w:val="single" w:color="D2D2D7" w:sz="1"/>
+            </w:tcBorders>
+            <w:tcMar>
+              <w:top w:type="dxa" w:w="80"/>
+              <w:left w:type="dxa" w:w="120"/>
+              <w:bottom w:type="dxa" w:w="80"/>
+              <w:right w:type="dxa" w:w="120"/>
+            </w:tcMar>
+          </w:tcPr>
+          <w:p>
+            <w:pPr>
+              <w:jc w:val="left"/>
+            </w:pPr>
+            <w:r>
+              <w:rPr>
+                <w:rFonts w:ascii="Arial" w:cs="Arial" w:eastAsia="Arial" w:hAnsi="Arial"/>
+                <w:b w:val="false"/>
+                <w:bCs w:val="false"/>
+                <w:color w:val="1D1D1F"/>
+                <w:sz w:val="20"/>
+                <w:szCs w:val="20"/>
+              </w:rPr>
+              <w:t xml:space="preserve">Account manager and team members assigned to this client, with roles and contact shortcuts</w:t>
+            </w:r>
+          </w:p>
+        </w:tc>
+      </w:tr>
+      <w:tr>
+        <w:tc>
+          <w:tcPr>
+            <w:tcW w:type="dxa" w:w="2200"/>
+            <w:tcBorders>
+              <w:top w:val="single" w:color="D2D2D7" w:sz="1"/>
+              <w:left w:val="single" w:color="D2D2D7" w:sz="1"/>
+              <w:bottom w:val="single" w:color="D2D2D7" w:sz="1"/>
+              <w:right w:val="single" w:color="D2D2D7" w:sz="1"/>
+            </w:tcBorders>
+            <w:tcMar>
+              <w:top w:type="dxa" w:w="80"/>
+              <w:left w:type="dxa" w:w="120"/>
+              <w:bottom w:type="dxa" w:w="80"/>
+              <w:right w:type="dxa" w:w="120"/>
+            </w:tcMar>
+          </w:tcPr>
+          <w:p>
+            <w:pPr>
+              <w:jc w:val="left"/>
+            </w:pPr>
+            <w:r>
+              <w:rPr>
+                <w:rFonts w:ascii="Arial" w:cs="Arial" w:eastAsia="Arial" w:hAnsi="Arial"/>
+                <w:b/>
+                <w:bCs/>
+                <w:color w:val="1D1D1F"/>
+                <w:sz w:val="20"/>
+                <w:szCs w:val="20"/>
+              </w:rPr>
+              <w:t xml:space="preserve">Meetings</w:t>
+            </w:r>
+          </w:p>
+        </w:tc>
+        <w:tc>
+          <w:tcPr>
+            <w:tcW w:type="dxa" w:w="7160"/>
+            <w:tcBorders>
+              <w:top w:val="single" w:color="D2D2D7" w:sz="1"/>
+              <w:left w:val="single" w:color="D2D2D7" w:sz="1"/>
+              <w:bottom w:val="single" w:color="D2D2D7" w:sz="1"/>
+              <w:right w:val="single" w:color="D2D2D7" w:sz="1"/>
+            </w:tcBorders>
+            <w:tcMar>
+              <w:top w:type="dxa" w:w="80"/>
+              <w:left w:type="dxa" w:w="120"/>
+              <w:bottom w:type="dxa" w:w="80"/>
+              <w:right w:type="dxa" w:w="120"/>
+            </w:tcMar>
+          </w:tcPr>
+          <w:p>
+            <w:pPr>
+              <w:jc w:val="left"/>
+            </w:pPr>
+            <w:r>
+              <w:rPr>
+                <w:rFonts w:ascii="Arial" w:cs="Arial" w:eastAsia="Arial" w:hAnsi="Arial"/>
+                <w:b w:val="false"/>
+                <w:bCs w:val="false"/>
+                <w:color w:val="1D1D1F"/>
+                <w:sz w:val="20"/>
+                <w:szCs w:val="20"/>
+              </w:rPr>
+              <w:t xml:space="preserve">Last meeting, next scheduled meeting, frequency, attendees, links to recordings and agendas</w:t>
+            </w:r>
+          </w:p>
+        </w:tc>
+      </w:tr>
+      <w:tr>
+        <w:tc>
+          <w:tcPr>
+            <w:tcW w:type="dxa" w:w="2200"/>
+            <w:tcBorders>
+              <w:top w:val="single" w:color="D2D2D7" w:sz="1"/>
+              <w:left w:val="single" w:color="D2D2D7" w:sz="1"/>
+              <w:bottom w:val="single" w:color="D2D2D7" w:sz="1"/>
+              <w:right w:val="single" w:color="D2D2D7" w:sz="1"/>
+            </w:tcBorders>
+            <w:tcMar>
+              <w:top w:type="dxa" w:w="80"/>
+              <w:left w:type="dxa" w:w="120"/>
+              <w:bottom w:type="dxa" w:w="80"/>
+              <w:right w:type="dxa" w:w="120"/>
+            </w:tcMar>
+          </w:tcPr>
+          <w:p>
+            <w:pPr>
+              <w:jc w:val="left"/>
+            </w:pPr>
+            <w:r>
+              <w:rPr>
+                <w:rFonts w:ascii="Arial" w:cs="Arial" w:eastAsia="Arial" w:hAnsi="Arial"/>
+                <w:b/>
+                <w:bCs/>
+                <w:color w:val="1D1D1F"/>
+                <w:sz w:val="20"/>
+                <w:szCs w:val="20"/>
+              </w:rPr>
+              <w:t xml:space="preserve">Documents</w:t>
+            </w:r>
+          </w:p>
+        </w:tc>
+        <w:tc>
+          <w:tcPr>
+            <w:tcW w:type="dxa" w:w="7160"/>
+            <w:tcBorders>
+              <w:top w:val="single" w:color="D2D2D7" w:sz="1"/>
+              <w:left w:val="single" w:color="D2D2D7" w:sz="1"/>
+              <w:bottom w:val="single" w:color="D2D2D7" w:sz="1"/>
+              <w:right w:val="single" w:color="D2D2D7" w:sz="1"/>
+            </w:tcBorders>
+            <w:tcMar>
+              <w:top w:type="dxa" w:w="80"/>
+              <w:left w:type="dxa" w:w="120"/>
+              <w:bottom w:type="dxa" w:w="80"/>
+              <w:right w:type="dxa" w:w="120"/>
+            </w:tcMar>
+          </w:tcPr>
+          <w:p>
+            <w:pPr>
+              <w:jc w:val="left"/>
+            </w:pPr>
+            <w:r>
+              <w:rPr>
+                <w:rFonts w:ascii="Arial" w:cs="Arial" w:eastAsia="Arial" w:hAnsi="Arial"/>
+                <w:b w:val="false"/>
+                <w:bCs w:val="false"/>
+                <w:color w:val="1D1D1F"/>
+                <w:sz w:val="20"/>
+                <w:szCs w:val="20"/>
+              </w:rPr>
+              <w:t xml:space="preserve">Document checklist with signing status (Contract, NDA, SOW, Proposal, Brand Guidelines) plus Google Drive link</w:t>
+            </w:r>
+          </w:p>
+        </w:tc>
+      </w:tr>
+      <w:tr>
+        <w:tc>
+          <w:tcPr>
+            <w:tcW w:type="dxa" w:w="2200"/>
+            <w:tcBorders>
+              <w:top w:val="single" w:color="D2D2D7" w:sz="1"/>
+              <w:left w:val="single" w:color="D2D2D7" w:sz="1"/>
+              <w:bottom w:val="single" w:color="D2D2D7" w:sz="1"/>
+              <w:right w:val="single" w:color="D2D2D7" w:sz="1"/>
+            </w:tcBorders>
+            <w:tcMar>
+              <w:top w:type="dxa" w:w="80"/>
+              <w:left w:type="dxa" w:w="120"/>
+              <w:bottom w:type="dxa" w:w="80"/>
+              <w:right w:type="dxa" w:w="120"/>
+            </w:tcMar>
+          </w:tcPr>
+          <w:p>
+            <w:pPr>
+              <w:jc w:val="left"/>
+            </w:pPr>
+            <w:r>
+              <w:rPr>
+                <w:rFonts w:ascii="Arial" w:cs="Arial" w:eastAsia="Arial" w:hAnsi="Arial"/>
+                <w:b/>
+                <w:bCs/>
+                <w:color w:val="1D1D1F"/>
+                <w:sz w:val="20"/>
+                <w:szCs w:val="20"/>
+              </w:rPr>
+              <w:t xml:space="preserve">Billing</w:t>
+            </w:r>
+          </w:p>
+        </w:tc>
+        <w:tc>
+          <w:tcPr>
+            <w:tcW w:type="dxa" w:w="7160"/>
+            <w:tcBorders>
+              <w:top w:val="single" w:color="D2D2D7" w:sz="1"/>
+              <w:left w:val="single" w:color="D2D2D7" w:sz="1"/>
+              <w:bottom w:val="single" w:color="D2D2D7" w:sz="1"/>
+              <w:right w:val="single" w:color="D2D2D7" w:sz="1"/>
+            </w:tcBorders>
+            <w:tcMar>
+              <w:top w:type="dxa" w:w="80"/>
+              <w:left w:type="dxa" w:w="120"/>
+              <w:bottom w:type="dxa" w:w="80"/>
+              <w:right w:type="dxa" w:w="120"/>
+            </w:tcMar>
+          </w:tcPr>
+          <w:p>
+            <w:pPr>
+              <w:jc w:val="left"/>
+            </w:pPr>
+            <w:r>
+              <w:rPr>
+                <w:rFonts w:ascii="Arial" w:cs="Arial" w:eastAsia="Arial" w:hAnsi="Arial"/>
+                <w:b w:val="false"/>
+                <w:bCs w:val="false"/>
+                <w:color w:val="1D1D1F"/>
+                <w:sz w:val="20"/>
+                <w:szCs w:val="20"/>
+              </w:rPr>
+              <w:t xml:space="preserve">Payment status, current invoice amount, last payment date, next invoice date, recent invoice history, Xero link</w:t>
+            </w:r>
+          </w:p>
+        </w:tc>
+      </w:tr>
+      <w:tr>
+        <w:tc>
+          <w:tcPr>
+            <w:tcW w:type="dxa" w:w="2200"/>
+            <w:tcBorders>
+              <w:top w:val="single" w:color="D2D2D7" w:sz="1"/>
+              <w:left w:val="single" w:color="D2D2D7" w:sz="1"/>
+              <w:bottom w:val="single" w:color="D2D2D7" w:sz="1"/>
+              <w:right w:val="single" w:color="D2D2D7" w:sz="1"/>
+            </w:tcBorders>
+            <w:tcMar>
+              <w:top w:type="dxa" w:w="80"/>
+              <w:left w:type="dxa" w:w="120"/>
+              <w:bottom w:type="dxa" w:w="80"/>
+              <w:right w:type="dxa" w:w="120"/>
+            </w:tcMar>
+          </w:tcPr>
+          <w:p>
+            <w:pPr>
+              <w:jc w:val="left"/>
+            </w:pPr>
+            <w:r>
+              <w:rPr>
+                <w:rFonts w:ascii="Arial" w:cs="Arial" w:eastAsia="Arial" w:hAnsi="Arial"/>
+                <w:b/>
+                <w:bCs/>
+                <w:color w:val="1D1D1F"/>
+                <w:sz w:val="20"/>
+                <w:szCs w:val="20"/>
+              </w:rPr>
+              <w:t xml:space="preserve">Key Contacts</w:t>
+            </w:r>
+          </w:p>
+        </w:tc>
+        <w:tc>
+          <w:tcPr>
+            <w:tcW w:type="dxa" w:w="7160"/>
+            <w:tcBorders>
+              <w:top w:val="single" w:color="D2D2D7" w:sz="1"/>
+              <w:left w:val="single" w:color="D2D2D7" w:sz="1"/>
+              <w:bottom w:val="single" w:color="D2D2D7" w:sz="1"/>
+              <w:right w:val="single" w:color="D2D2D7" w:sz="1"/>
+            </w:tcBorders>
+            <w:tcMar>
+              <w:top w:type="dxa" w:w="80"/>
+              <w:left w:type="dxa" w:w="120"/>
+              <w:bottom w:type="dxa" w:w="80"/>
+              <w:right w:type="dxa" w:w="120"/>
+            </w:tcMar>
+          </w:tcPr>
+          <w:p>
+            <w:pPr>
+              <w:jc w:val="left"/>
+            </w:pPr>
+            <w:r>
+              <w:rPr>
+                <w:rFonts w:ascii="Arial" w:cs="Arial" w:eastAsia="Arial" w:hAnsi="Arial"/>
+                <w:b w:val="false"/>
+                <w:bCs w:val="false"/>
+                <w:color w:val="1D1D1F"/>
+                <w:sz w:val="20"/>
+                <w:szCs w:val="20"/>
+              </w:rPr>
+              <w:t xml:space="preserve">Client-side contacts with roles, email, phone, and quick action buttons</w:t>
+            </w:r>
+          </w:p>
+        </w:tc>
+      </w:tr>
+      <w:tr>
+        <w:tc>
+          <w:tcPr>
+            <w:tcW w:type="dxa" w:w="2200"/>
+            <w:tcBorders>
+              <w:top w:val="single" w:color="D2D2D7" w:sz="1"/>
+              <w:left w:val="single" w:color="D2D2D7" w:sz="1"/>
+              <w:bottom w:val="single" w:color="D2D2D7" w:sz="1"/>
+              <w:right w:val="single" w:color="D2D2D7" w:sz="1"/>
+            </w:tcBorders>
+            <w:tcMar>
+              <w:top w:type="dxa" w:w="80"/>
+              <w:left w:type="dxa" w:w="120"/>
+              <w:bottom w:type="dxa" w:w="80"/>
+              <w:right w:type="dxa" w:w="120"/>
+            </w:tcMar>
+          </w:tcPr>
+          <w:p>
+            <w:pPr>
+              <w:jc w:val="left"/>
+            </w:pPr>
+            <w:r>
+              <w:rPr>
+                <w:rFonts w:ascii="Arial" w:cs="Arial" w:eastAsia="Arial" w:hAnsi="Arial"/>
+                <w:b/>
+                <w:bCs/>
+                <w:color w:val="1D1D1F"/>
+                <w:sz w:val="20"/>
+                <w:szCs w:val="20"/>
+              </w:rPr>
+              <w:t xml:space="preserve">Contract Details</w:t>
+            </w:r>
+          </w:p>
+        </w:tc>
+        <w:tc>
+          <w:tcPr>
+            <w:tcW w:type="dxa" w:w="7160"/>
+            <w:tcBorders>
+              <w:top w:val="single" w:color="D2D2D7" w:sz="1"/>
+              <w:left w:val="single" w:color="D2D2D7" w:sz="1"/>
+              <w:bottom w:val="single" w:color="D2D2D7" w:sz="1"/>
+              <w:right w:val="single" w:color="D2D2D7" w:sz="1"/>
+            </w:tcBorders>
+            <w:tcMar>
+              <w:top w:type="dxa" w:w="80"/>
+              <w:left w:type="dxa" w:w="120"/>
+              <w:bottom w:type="dxa" w:w="80"/>
+              <w:right w:type="dxa" w:w="120"/>
+            </w:tcMar>
+          </w:tcPr>
+          <w:p>
+            <w:pPr>
+              <w:jc w:val="left"/>
+            </w:pPr>
+            <w:r>
+              <w:rPr>
+                <w:rFonts w:ascii="Arial" w:cs="Arial" w:eastAsia="Arial" w:hAnsi="Arial"/>
+                <w:b w:val="false"/>
+                <w:bCs w:val="false"/>
+                <w:color w:val="1D1D1F"/>
+                <w:sz w:val="20"/>
+                <w:szCs w:val="20"/>
+              </w:rPr>
+              <w:t xml:space="preserve">Contract type, start/end dates, auto-renewal status, monthly retainer, total contract value</w:t>
+            </w:r>
+          </w:p>
+        </w:tc>
+      </w:tr>
+      <w:tr>
+        <w:tc>
+          <w:tcPr>
+            <w:tcW w:type="dxa" w:w="2200"/>
+            <w:tcBorders>
+              <w:top w:val="single" w:color="D2D2D7" w:sz="1"/>
+              <w:left w:val="single" w:color="D2D2D7" w:sz="1"/>
+              <w:bottom w:val="single" w:color="D2D2D7" w:sz="1"/>
+              <w:right w:val="single" w:color="D2D2D7" w:sz="1"/>
+            </w:tcBorders>
+            <w:tcMar>
+              <w:top w:type="dxa" w:w="80"/>
+              <w:left w:type="dxa" w:w="120"/>
+              <w:bottom w:type="dxa" w:w="80"/>
+              <w:right w:type="dxa" w:w="120"/>
+            </w:tcMar>
+          </w:tcPr>
+          <w:p>
+            <w:pPr>
+              <w:jc w:val="left"/>
+            </w:pPr>
+            <w:r>
+              <w:rPr>
+                <w:rFonts w:ascii="Arial" w:cs="Arial" w:eastAsia="Arial" w:hAnsi="Arial"/>
+                <w:b/>
+                <w:bCs/>
+                <w:color w:val="1D1D1F"/>
+                <w:sz w:val="20"/>
+                <w:szCs w:val="20"/>
+              </w:rPr>
+              <w:t xml:space="preserve">Internal Notes</w:t>
+            </w:r>
+          </w:p>
+        </w:tc>
+        <w:tc>
+          <w:tcPr>
+            <w:tcW w:type="dxa" w:w="7160"/>
+            <w:tcBorders>
+              <w:top w:val="single" w:color="D2D2D7" w:sz="1"/>
+              <w:left w:val="single" w:color="D2D2D7" w:sz="1"/>
+              <w:bottom w:val="single" w:color="D2D2D7" w:sz="1"/>
+              <w:right w:val="single" w:color="D2D2D7" w:sz="1"/>
+            </w:tcBorders>
+            <w:tcMar>
+              <w:top w:type="dxa" w:w="80"/>
+              <w:left w:type="dxa" w:w="120"/>
+              <w:bottom w:type="dxa" w:w="80"/>
+              <w:right w:type="dxa" w:w="120"/>
+            </w:tcMar>
+          </w:tcPr>
+          <w:p>
+            <w:pPr>
+              <w:jc w:val="left"/>
+            </w:pPr>
+            <w:r>
+              <w:rPr>
+                <w:rFonts w:ascii="Arial" w:cs="Arial" w:eastAsia="Arial" w:hAnsi="Arial"/>
+                <w:b w:val="false"/>
+                <w:bCs w:val="false"/>
+                <w:color w:val="1D1D1F"/>
+                <w:sz w:val="20"/>
+                <w:szCs w:val="20"/>
+              </w:rPr>
+              <w:t xml:space="preserve">Timestamped notes from team members — preferences, upsell opportunities, important context</w:t>
+            </w:r>
+          </w:p>
+        </w:tc>
+      </w:tr>
+      <w:tr>
+        <w:tc>
+          <w:tcPr>
+            <w:tcW w:type="dxa" w:w="2200"/>
+            <w:tcBorders>
+              <w:top w:val="single" w:color="D2D2D7" w:sz="1"/>
+              <w:left w:val="single" w:color="D2D2D7" w:sz="1"/>
+              <w:bottom w:val="single" w:color="D2D2D7" w:sz="1"/>
+              <w:right w:val="single" w:color="D2D2D7" w:sz="1"/>
+            </w:tcBorders>
+            <w:tcMar>
+              <w:top w:type="dxa" w:w="80"/>
+              <w:left w:type="dxa" w:w="120"/>
+              <w:bottom w:type="dxa" w:w="80"/>
+              <w:right w:type="dxa" w:w="120"/>
+            </w:tcMar>
+          </w:tcPr>
+          <w:p>
+            <w:pPr>
+              <w:jc w:val="left"/>
+            </w:pPr>
+            <w:r>
+              <w:rPr>
+                <w:rFonts w:ascii="Arial" w:cs="Arial" w:eastAsia="Arial" w:hAnsi="Arial"/>
+                <w:b/>
+                <w:bCs/>
+                <w:color w:val="1D1D1F"/>
+                <w:sz w:val="20"/>
+                <w:szCs w:val="20"/>
+              </w:rPr>
+              <w:t xml:space="preserve">Communications</w:t>
+            </w:r>
+          </w:p>
+        </w:tc>
+        <w:tc>
+          <w:tcPr>
+            <w:tcW w:type="dxa" w:w="7160"/>
+            <w:tcBorders>
+              <w:top w:val="single" w:color="D2D2D7" w:sz="1"/>
+              <w:left w:val="single" w:color="D2D2D7" w:sz="1"/>
+              <w:bottom w:val="single" w:color="D2D2D7" w:sz="1"/>
+              <w:right w:val="single" w:color="D2D2D7" w:sz="1"/>
+            </w:tcBorders>
+            <w:tcMar>
+              <w:top w:type="dxa" w:w="80"/>
+              <w:left w:type="dxa" w:w="120"/>
+              <w:bottom w:type="dxa" w:w="80"/>
+              <w:right w:type="dxa" w:w="120"/>
+            </w:tcMar>
+          </w:tcPr>
+          <w:p>
+            <w:pPr>
+              <w:jc w:val="left"/>
+            </w:pPr>
+            <w:r>
+              <w:rPr>
+                <w:rFonts w:ascii="Arial" w:cs="Arial" w:eastAsia="Arial" w:hAnsi="Arial"/>
+                <w:b w:val="false"/>
+                <w:bCs w:val="false"/>
+                <w:color w:val="1D1D1F"/>
+                <w:sz w:val="20"/>
+                <w:szCs w:val="20"/>
+              </w:rPr>
+              <w:t xml:space="preserve">Recent activity log: emails sent, calls made, meetings held, Slack messages — with timestamps</w:t>
+            </w:r>
+          </w:p>
+        </w:tc>
+      </w:tr>
+    </w:tbl>
+    <w:p>
+      <w:pPr>
+        <w:spacing w:after="160"/>
+      </w:pPr>
     </w:p>
     <w:tbl>
       <w:tblPr>
@@ -2828,614 +2847,7 @@
           <w:sz w:val="18"/>
           <w:szCs w:val="18"/>
         </w:rPr>
-        <w:t xml:space="preserve">Figure 5: Overview cards — Key Contacts, Contract Details, Internal Notes, and Communications</w:t>
-      </w:r>
-    </w:p>
-    <w:p>
-      <w:r>
-        <w:br w:type="page"/>
-      </w:r>
-    </w:p>
-    <w:p>
-      <w:pPr>
-        <w:pStyle w:val="Heading2"/>
-      </w:pPr>
-      <w:r>
-        <w:rPr>
-          <w:b/>
-          <w:bCs/>
-        </w:rPr>
-        <w:t xml:space="preserve">3.3 Layer 3: Kanban Board</w:t>
-      </w:r>
-    </w:p>
-    <w:tbl>
-      <w:tblPr>
-        <w:tblW w:type="dxa" w:w="9360"/>
-        <w:tblBorders>
-          <w:top w:val="single" w:color="auto" w:sz="4"/>
-          <w:left w:val="single" w:color="auto" w:sz="4"/>
-          <w:bottom w:val="single" w:color="auto" w:sz="4"/>
-          <w:right w:val="single" w:color="auto" w:sz="4"/>
-          <w:insideH w:val="single" w:color="auto" w:sz="4"/>
-          <w:insideV w:val="single" w:color="auto" w:sz="4"/>
-        </w:tblBorders>
-      </w:tblPr>
-      <w:tblGrid>
-        <w:gridCol w:w="9360"/>
-      </w:tblGrid>
-      <w:tr>
-        <w:tc>
-          <w:tcPr>
-            <w:tcW w:type="dxa" w:w="9360"/>
-            <w:tcBorders>
-              <w:top w:val="single" w:color="0071E3" w:sz="3"/>
-              <w:left w:val="single" w:color="0071E3" w:sz="3"/>
-              <w:bottom w:val="single" w:color="0071E3" w:sz="3"/>
-              <w:right w:val="single" w:color="0071E3" w:sz="3"/>
-            </w:tcBorders>
-            <w:shd w:fill="E8F0FF" w:val="clear"/>
-            <w:tcMar>
-              <w:top w:type="dxa" w:w="120"/>
-              <w:left w:type="dxa" w:w="160"/>
-              <w:bottom w:type="dxa" w:w="120"/>
-              <w:right w:type="dxa" w:w="160"/>
-            </w:tcMar>
-          </w:tcPr>
-          <w:p>
-            <w:pPr>
-              <w:spacing w:after="60"/>
-            </w:pPr>
-            <w:r>
-              <w:rPr>
-                <w:rFonts w:ascii="Arial" w:cs="Arial" w:eastAsia="Arial" w:hAnsi="Arial"/>
-                <w:b/>
-                <w:bCs/>
-                <w:color w:val="1D1D1F"/>
-                <w:sz w:val="20"/>
-                <w:szCs w:val="20"/>
-              </w:rPr>
-              <w:t xml:space="preserve">Live Demo — Kanban Board</w:t>
-            </w:r>
-          </w:p>
-          <w:p>
-            <w:hyperlink w:history="1" r:id="rIdnahizpsvnx_u5rd332ige">
-              <w:r>
-                <w:rPr>
-                  <w:rStyle w:val="Hyperlink"/>
-                  <w:rFonts w:ascii="Arial" w:cs="Arial" w:eastAsia="Arial" w:hAnsi="Arial"/>
-                  <w:sz w:val="20"/>
-                  <w:szCs w:val="20"/>
-                </w:rPr>
-                <w:t xml:space="preserve">https://nikkortrinidad-cpu.github.io/kanban-website/mockups/03-kanban.html</w:t>
-              </w:r>
-            </w:hyperlink>
-          </w:p>
-        </w:tc>
-      </w:tr>
-    </w:tbl>
-    <w:p>
-      <w:pPr>
-        <w:spacing w:after="120" w:before="200"/>
-      </w:pPr>
-    </w:p>
-    <w:p>
-      <w:pPr>
-        <w:spacing w:after="120"/>
-      </w:pPr>
-      <w:r>
-        <w:rPr>
-          <w:rFonts w:ascii="Arial" w:cs="Arial" w:eastAsia="Arial" w:hAnsi="Arial"/>
-          <w:color w:val="1D1D1F"/>
-          <w:sz w:val="22"/>
-          <w:szCs w:val="22"/>
-        </w:rPr>
-        <w:t xml:space="preserve">Click any service card and you get the kanban board for that service. This is where the production team lives day-to-day.</w:t>
-      </w:r>
-    </w:p>
-    <w:p>
-      <w:pPr>
-        <w:pStyle w:val="Heading3"/>
-      </w:pPr>
-      <w:r>
-        <w:rPr>
-          <w:b/>
-          <w:bCs/>
-        </w:rPr>
-        <w:t xml:space="preserve">Board Structure</w:t>
-      </w:r>
-    </w:p>
-    <w:p>
-      <w:pPr>
-        <w:spacing w:after="120"/>
-      </w:pPr>
-      <w:r>
-        <w:rPr>
-          <w:rFonts w:ascii="Arial" w:cs="Arial" w:eastAsia="Arial" w:hAnsi="Arial"/>
-          <w:color w:val="1D1D1F"/>
-          <w:sz w:val="22"/>
-          <w:szCs w:val="22"/>
-        </w:rPr>
-        <w:t xml:space="preserve">The board has four columns by default, representing the task lifecycle:</w:t>
-      </w:r>
-    </w:p>
-    <w:tbl>
-      <w:tblPr>
-        <w:tblW w:type="dxa" w:w="9360"/>
-        <w:tblBorders>
-          <w:top w:val="single" w:color="auto" w:sz="4"/>
-          <w:left w:val="single" w:color="auto" w:sz="4"/>
-          <w:bottom w:val="single" w:color="auto" w:sz="4"/>
-          <w:right w:val="single" w:color="auto" w:sz="4"/>
-          <w:insideH w:val="single" w:color="auto" w:sz="4"/>
-          <w:insideV w:val="single" w:color="auto" w:sz="4"/>
-        </w:tblBorders>
-      </w:tblPr>
-      <w:tblGrid>
-        <w:gridCol w:w="2340"/>
-        <w:gridCol w:w="7020"/>
-      </w:tblGrid>
-      <w:tr>
-        <w:tc>
-          <w:tcPr>
-            <w:tcW w:type="dxa" w:w="2340"/>
-            <w:tcBorders>
-              <w:top w:val="single" w:color="D2D2D7" w:sz="1"/>
-              <w:left w:val="single" w:color="D2D2D7" w:sz="1"/>
-              <w:bottom w:val="single" w:color="D2D2D7" w:sz="1"/>
-              <w:right w:val="single" w:color="D2D2D7" w:sz="1"/>
-            </w:tcBorders>
-            <w:shd w:fill="E8F0FF" w:val="clear"/>
-            <w:tcMar>
-              <w:top w:type="dxa" w:w="80"/>
-              <w:left w:type="dxa" w:w="120"/>
-              <w:bottom w:type="dxa" w:w="80"/>
-              <w:right w:type="dxa" w:w="120"/>
-            </w:tcMar>
-          </w:tcPr>
-          <w:p>
-            <w:pPr>
-              <w:jc w:val="left"/>
-            </w:pPr>
-            <w:r>
-              <w:rPr>
-                <w:rFonts w:ascii="Arial" w:cs="Arial" w:eastAsia="Arial" w:hAnsi="Arial"/>
-                <w:b/>
-                <w:bCs/>
-                <w:color w:val="1D1D1F"/>
-                <w:sz w:val="20"/>
-                <w:szCs w:val="20"/>
-              </w:rPr>
-              <w:t xml:space="preserve">Column</w:t>
-            </w:r>
-          </w:p>
-        </w:tc>
-        <w:tc>
-          <w:tcPr>
-            <w:tcW w:type="dxa" w:w="7020"/>
-            <w:tcBorders>
-              <w:top w:val="single" w:color="D2D2D7" w:sz="1"/>
-              <w:left w:val="single" w:color="D2D2D7" w:sz="1"/>
-              <w:bottom w:val="single" w:color="D2D2D7" w:sz="1"/>
-              <w:right w:val="single" w:color="D2D2D7" w:sz="1"/>
-            </w:tcBorders>
-            <w:shd w:fill="E8F0FF" w:val="clear"/>
-            <w:tcMar>
-              <w:top w:type="dxa" w:w="80"/>
-              <w:left w:type="dxa" w:w="120"/>
-              <w:bottom w:type="dxa" w:w="80"/>
-              <w:right w:type="dxa" w:w="120"/>
-            </w:tcMar>
-          </w:tcPr>
-          <w:p>
-            <w:pPr>
-              <w:jc w:val="left"/>
-            </w:pPr>
-            <w:r>
-              <w:rPr>
-                <w:rFonts w:ascii="Arial" w:cs="Arial" w:eastAsia="Arial" w:hAnsi="Arial"/>
-                <w:b/>
-                <w:bCs/>
-                <w:color w:val="1D1D1F"/>
-                <w:sz w:val="20"/>
-                <w:szCs w:val="20"/>
-              </w:rPr>
-              <w:t xml:space="preserve">Purpose</w:t>
-            </w:r>
-          </w:p>
-        </w:tc>
-      </w:tr>
-      <w:tr>
-        <w:tc>
-          <w:tcPr>
-            <w:tcW w:type="dxa" w:w="2340"/>
-            <w:tcBorders>
-              <w:top w:val="single" w:color="D2D2D7" w:sz="1"/>
-              <w:left w:val="single" w:color="D2D2D7" w:sz="1"/>
-              <w:bottom w:val="single" w:color="D2D2D7" w:sz="1"/>
-              <w:right w:val="single" w:color="D2D2D7" w:sz="1"/>
-            </w:tcBorders>
-            <w:tcMar>
-              <w:top w:type="dxa" w:w="80"/>
-              <w:left w:type="dxa" w:w="120"/>
-              <w:bottom w:type="dxa" w:w="80"/>
-              <w:right w:type="dxa" w:w="120"/>
-            </w:tcMar>
-          </w:tcPr>
-          <w:p>
-            <w:pPr>
-              <w:jc w:val="left"/>
-            </w:pPr>
-            <w:r>
-              <w:rPr>
-                <w:rFonts w:ascii="Arial" w:cs="Arial" w:eastAsia="Arial" w:hAnsi="Arial"/>
-                <w:b/>
-                <w:bCs/>
-                <w:color w:val="1D1D1F"/>
-                <w:sz w:val="20"/>
-                <w:szCs w:val="20"/>
-              </w:rPr>
-              <w:t xml:space="preserve">To Do</w:t>
-            </w:r>
-          </w:p>
-        </w:tc>
-        <w:tc>
-          <w:tcPr>
-            <w:tcW w:type="dxa" w:w="7020"/>
-            <w:tcBorders>
-              <w:top w:val="single" w:color="D2D2D7" w:sz="1"/>
-              <w:left w:val="single" w:color="D2D2D7" w:sz="1"/>
-              <w:bottom w:val="single" w:color="D2D2D7" w:sz="1"/>
-              <w:right w:val="single" w:color="D2D2D7" w:sz="1"/>
-            </w:tcBorders>
-            <w:tcMar>
-              <w:top w:type="dxa" w:w="80"/>
-              <w:left w:type="dxa" w:w="120"/>
-              <w:bottom w:type="dxa" w:w="80"/>
-              <w:right w:type="dxa" w:w="120"/>
-            </w:tcMar>
-          </w:tcPr>
-          <w:p>
-            <w:pPr>
-              <w:jc w:val="left"/>
-            </w:pPr>
-            <w:r>
-              <w:rPr>
-                <w:rFonts w:ascii="Arial" w:cs="Arial" w:eastAsia="Arial" w:hAnsi="Arial"/>
-                <w:b w:val="false"/>
-                <w:bCs w:val="false"/>
-                <w:color w:val="1D1D1F"/>
-                <w:sz w:val="20"/>
-                <w:szCs w:val="20"/>
-              </w:rPr>
-              <w:t xml:space="preserve">Tasks that are planned but not yet started</w:t>
-            </w:r>
-          </w:p>
-        </w:tc>
-      </w:tr>
-      <w:tr>
-        <w:tc>
-          <w:tcPr>
-            <w:tcW w:type="dxa" w:w="2340"/>
-            <w:tcBorders>
-              <w:top w:val="single" w:color="D2D2D7" w:sz="1"/>
-              <w:left w:val="single" w:color="D2D2D7" w:sz="1"/>
-              <w:bottom w:val="single" w:color="D2D2D7" w:sz="1"/>
-              <w:right w:val="single" w:color="D2D2D7" w:sz="1"/>
-            </w:tcBorders>
-            <w:tcMar>
-              <w:top w:type="dxa" w:w="80"/>
-              <w:left w:type="dxa" w:w="120"/>
-              <w:bottom w:type="dxa" w:w="80"/>
-              <w:right w:type="dxa" w:w="120"/>
-            </w:tcMar>
-          </w:tcPr>
-          <w:p>
-            <w:pPr>
-              <w:jc w:val="left"/>
-            </w:pPr>
-            <w:r>
-              <w:rPr>
-                <w:rFonts w:ascii="Arial" w:cs="Arial" w:eastAsia="Arial" w:hAnsi="Arial"/>
-                <w:b/>
-                <w:bCs/>
-                <w:color w:val="1D1D1F"/>
-                <w:sz w:val="20"/>
-                <w:szCs w:val="20"/>
-              </w:rPr>
-              <w:t xml:space="preserve">In Progress</w:t>
-            </w:r>
-          </w:p>
-        </w:tc>
-        <w:tc>
-          <w:tcPr>
-            <w:tcW w:type="dxa" w:w="7020"/>
-            <w:tcBorders>
-              <w:top w:val="single" w:color="D2D2D7" w:sz="1"/>
-              <w:left w:val="single" w:color="D2D2D7" w:sz="1"/>
-              <w:bottom w:val="single" w:color="D2D2D7" w:sz="1"/>
-              <w:right w:val="single" w:color="D2D2D7" w:sz="1"/>
-            </w:tcBorders>
-            <w:tcMar>
-              <w:top w:type="dxa" w:w="80"/>
-              <w:left w:type="dxa" w:w="120"/>
-              <w:bottom w:type="dxa" w:w="80"/>
-              <w:right w:type="dxa" w:w="120"/>
-            </w:tcMar>
-          </w:tcPr>
-          <w:p>
-            <w:pPr>
-              <w:jc w:val="left"/>
-            </w:pPr>
-            <w:r>
-              <w:rPr>
-                <w:rFonts w:ascii="Arial" w:cs="Arial" w:eastAsia="Arial" w:hAnsi="Arial"/>
-                <w:b w:val="false"/>
-                <w:bCs w:val="false"/>
-                <w:color w:val="1D1D1F"/>
-                <w:sz w:val="20"/>
-                <w:szCs w:val="20"/>
-              </w:rPr>
-              <w:t xml:space="preserve">Tasks currently being worked on</w:t>
-            </w:r>
-          </w:p>
-        </w:tc>
-      </w:tr>
-      <w:tr>
-        <w:tc>
-          <w:tcPr>
-            <w:tcW w:type="dxa" w:w="2340"/>
-            <w:tcBorders>
-              <w:top w:val="single" w:color="D2D2D7" w:sz="1"/>
-              <w:left w:val="single" w:color="D2D2D7" w:sz="1"/>
-              <w:bottom w:val="single" w:color="D2D2D7" w:sz="1"/>
-              <w:right w:val="single" w:color="D2D2D7" w:sz="1"/>
-            </w:tcBorders>
-            <w:tcMar>
-              <w:top w:type="dxa" w:w="80"/>
-              <w:left w:type="dxa" w:w="120"/>
-              <w:bottom w:type="dxa" w:w="80"/>
-              <w:right w:type="dxa" w:w="120"/>
-            </w:tcMar>
-          </w:tcPr>
-          <w:p>
-            <w:pPr>
-              <w:jc w:val="left"/>
-            </w:pPr>
-            <w:r>
-              <w:rPr>
-                <w:rFonts w:ascii="Arial" w:cs="Arial" w:eastAsia="Arial" w:hAnsi="Arial"/>
-                <w:b/>
-                <w:bCs/>
-                <w:color w:val="1D1D1F"/>
-                <w:sz w:val="20"/>
-                <w:szCs w:val="20"/>
-              </w:rPr>
-              <w:t xml:space="preserve">In Review</w:t>
-            </w:r>
-          </w:p>
-        </w:tc>
-        <w:tc>
-          <w:tcPr>
-            <w:tcW w:type="dxa" w:w="7020"/>
-            <w:tcBorders>
-              <w:top w:val="single" w:color="D2D2D7" w:sz="1"/>
-              <w:left w:val="single" w:color="D2D2D7" w:sz="1"/>
-              <w:bottom w:val="single" w:color="D2D2D7" w:sz="1"/>
-              <w:right w:val="single" w:color="D2D2D7" w:sz="1"/>
-            </w:tcBorders>
-            <w:tcMar>
-              <w:top w:type="dxa" w:w="80"/>
-              <w:left w:type="dxa" w:w="120"/>
-              <w:bottom w:type="dxa" w:w="80"/>
-              <w:right w:type="dxa" w:w="120"/>
-            </w:tcMar>
-          </w:tcPr>
-          <w:p>
-            <w:pPr>
-              <w:jc w:val="left"/>
-            </w:pPr>
-            <w:r>
-              <w:rPr>
-                <w:rFonts w:ascii="Arial" w:cs="Arial" w:eastAsia="Arial" w:hAnsi="Arial"/>
-                <w:b w:val="false"/>
-                <w:bCs w:val="false"/>
-                <w:color w:val="1D1D1F"/>
-                <w:sz w:val="20"/>
-                <w:szCs w:val="20"/>
-              </w:rPr>
-              <w:t xml:space="preserve">Tasks completed by the team, waiting for review or client feedback</w:t>
-            </w:r>
-          </w:p>
-        </w:tc>
-      </w:tr>
-      <w:tr>
-        <w:tc>
-          <w:tcPr>
-            <w:tcW w:type="dxa" w:w="2340"/>
-            <w:tcBorders>
-              <w:top w:val="single" w:color="D2D2D7" w:sz="1"/>
-              <w:left w:val="single" w:color="D2D2D7" w:sz="1"/>
-              <w:bottom w:val="single" w:color="D2D2D7" w:sz="1"/>
-              <w:right w:val="single" w:color="D2D2D7" w:sz="1"/>
-            </w:tcBorders>
-            <w:tcMar>
-              <w:top w:type="dxa" w:w="80"/>
-              <w:left w:type="dxa" w:w="120"/>
-              <w:bottom w:type="dxa" w:w="80"/>
-              <w:right w:type="dxa" w:w="120"/>
-            </w:tcMar>
-          </w:tcPr>
-          <w:p>
-            <w:pPr>
-              <w:jc w:val="left"/>
-            </w:pPr>
-            <w:r>
-              <w:rPr>
-                <w:rFonts w:ascii="Arial" w:cs="Arial" w:eastAsia="Arial" w:hAnsi="Arial"/>
-                <w:b/>
-                <w:bCs/>
-                <w:color w:val="1D1D1F"/>
-                <w:sz w:val="20"/>
-                <w:szCs w:val="20"/>
-              </w:rPr>
-              <w:t xml:space="preserve">Done</w:t>
-            </w:r>
-          </w:p>
-        </w:tc>
-        <w:tc>
-          <w:tcPr>
-            <w:tcW w:type="dxa" w:w="7020"/>
-            <w:tcBorders>
-              <w:top w:val="single" w:color="D2D2D7" w:sz="1"/>
-              <w:left w:val="single" w:color="D2D2D7" w:sz="1"/>
-              <w:bottom w:val="single" w:color="D2D2D7" w:sz="1"/>
-              <w:right w:val="single" w:color="D2D2D7" w:sz="1"/>
-            </w:tcBorders>
-            <w:tcMar>
-              <w:top w:type="dxa" w:w="80"/>
-              <w:left w:type="dxa" w:w="120"/>
-              <w:bottom w:type="dxa" w:w="80"/>
-              <w:right w:type="dxa" w:w="120"/>
-            </w:tcMar>
-          </w:tcPr>
-          <w:p>
-            <w:pPr>
-              <w:jc w:val="left"/>
-            </w:pPr>
-            <w:r>
-              <w:rPr>
-                <w:rFonts w:ascii="Arial" w:cs="Arial" w:eastAsia="Arial" w:hAnsi="Arial"/>
-                <w:b w:val="false"/>
-                <w:bCs w:val="false"/>
-                <w:color w:val="1D1D1F"/>
-                <w:sz w:val="20"/>
-                <w:szCs w:val="20"/>
-              </w:rPr>
-              <w:t xml:space="preserve">Tasks that are fully completed and approved</w:t>
-            </w:r>
-          </w:p>
-        </w:tc>
-      </w:tr>
-    </w:tbl>
-    <w:p>
-      <w:pPr>
-        <w:spacing w:after="160"/>
-      </w:pPr>
-    </w:p>
-    <w:p>
-      <w:pPr>
-        <w:pStyle w:val="Heading3"/>
-      </w:pPr>
-      <w:r>
-        <w:rPr>
-          <w:b/>
-          <w:bCs/>
-        </w:rPr>
-        <w:t xml:space="preserve">Task Cards</w:t>
-      </w:r>
-    </w:p>
-    <w:p>
-      <w:pPr>
-        <w:spacing w:after="120"/>
-      </w:pPr>
-      <w:r>
-        <w:rPr>
-          <w:rFonts w:ascii="Arial" w:cs="Arial" w:eastAsia="Arial" w:hAnsi="Arial"/>
-          <w:color w:val="1D1D1F"/>
-          <w:sz w:val="22"/>
-          <w:szCs w:val="22"/>
-        </w:rPr>
-        <w:t xml:space="preserve">Each card on the board represents a task. Cards show:</w:t>
-      </w:r>
-    </w:p>
-    <w:p>
-      <w:pPr>
-        <w:pStyle w:val="ListParagraph"/>
-        <w:numPr>
-          <w:ilvl w:val="0"/>
-          <w:numId w:val="3"/>
-        </w:numPr>
-        <w:spacing w:after="60"/>
-      </w:pPr>
-      <w:r>
-        <w:rPr>
-          <w:rFonts w:ascii="Arial" w:cs="Arial" w:eastAsia="Arial" w:hAnsi="Arial"/>
-          <w:sz w:val="22"/>
-          <w:szCs w:val="22"/>
-        </w:rPr>
-        <w:t xml:space="preserve">Priority indicator (red = high, orange = medium, green = low)</w:t>
-      </w:r>
-    </w:p>
-    <w:p>
-      <w:pPr>
-        <w:pStyle w:val="ListParagraph"/>
-        <w:numPr>
-          <w:ilvl w:val="0"/>
-          <w:numId w:val="3"/>
-        </w:numPr>
-        <w:spacing w:after="60"/>
-      </w:pPr>
-      <w:r>
-        <w:rPr>
-          <w:rFonts w:ascii="Arial" w:cs="Arial" w:eastAsia="Arial" w:hAnsi="Arial"/>
-          <w:sz w:val="22"/>
-          <w:szCs w:val="22"/>
-        </w:rPr>
-        <w:t xml:space="preserve">Label badges (Design, Dev, Bug, Feature, Content) with color coding</w:t>
-      </w:r>
-    </w:p>
-    <w:p>
-      <w:pPr>
-        <w:pStyle w:val="ListParagraph"/>
-        <w:numPr>
-          <w:ilvl w:val="0"/>
-          <w:numId w:val="3"/>
-        </w:numPr>
-        <w:spacing w:after="60"/>
-      </w:pPr>
-      <w:r>
-        <w:rPr>
-          <w:rFonts w:ascii="Arial" w:cs="Arial" w:eastAsia="Arial" w:hAnsi="Arial"/>
-          <w:sz w:val="22"/>
-          <w:szCs w:val="22"/>
-        </w:rPr>
-        <w:t xml:space="preserve">Task title</w:t>
-      </w:r>
-    </w:p>
-    <w:p>
-      <w:pPr>
-        <w:pStyle w:val="ListParagraph"/>
-        <w:numPr>
-          <w:ilvl w:val="0"/>
-          <w:numId w:val="3"/>
-        </w:numPr>
-        <w:spacing w:after="60"/>
-      </w:pPr>
-      <w:r>
-        <w:rPr>
-          <w:rFonts w:ascii="Arial" w:cs="Arial" w:eastAsia="Arial" w:hAnsi="Arial"/>
-          <w:sz w:val="22"/>
-          <w:szCs w:val="22"/>
-        </w:rPr>
-        <w:t xml:space="preserve">Comment count and attachment count</w:t>
-      </w:r>
-    </w:p>
-    <w:p>
-      <w:pPr>
-        <w:pStyle w:val="ListParagraph"/>
-        <w:numPr>
-          <w:ilvl w:val="0"/>
-          <w:numId w:val="3"/>
-        </w:numPr>
-        <w:spacing w:after="60"/>
-      </w:pPr>
-      <w:r>
-        <w:rPr>
-          <w:rFonts w:ascii="Arial" w:cs="Arial" w:eastAsia="Arial" w:hAnsi="Arial"/>
-          <w:sz w:val="22"/>
-          <w:szCs w:val="22"/>
-        </w:rPr>
-        <w:t xml:space="preserve">Assigned team member avatar</w:t>
+        <w:t xml:space="preserve">Figure 4: Overview cards — People, Meetings, Documents, and Billing</w:t>
       </w:r>
     </w:p>
     <w:tbl>
@@ -3532,144 +2944,24 @@
           <w:sz w:val="18"/>
           <w:szCs w:val="18"/>
         </w:rPr>
-        <w:t xml:space="preserve">Figure 6: Kanban board for “Website Redesign” — 4 columns with task cards, breadcrumb navigation</w:t>
-      </w:r>
-    </w:p>
-    <w:p>
-      <w:pPr>
-        <w:pStyle w:val="Heading3"/>
+        <w:t xml:space="preserve">Figure 5: Overview cards — Key Contacts, Contract Details, Internal Notes, and Communications</w:t>
+      </w:r>
+    </w:p>
+    <w:p>
+      <w:r>
+        <w:br w:type="page"/>
+      </w:r>
+    </w:p>
+    <w:p>
+      <w:pPr>
+        <w:pStyle w:val="Heading2"/>
       </w:pPr>
       <w:r>
         <w:rPr>
           <w:b/>
           <w:bCs/>
         </w:rPr>
-        <w:t xml:space="preserve">Board Actions</w:t>
-      </w:r>
-    </w:p>
-    <w:p>
-      <w:pPr>
-        <w:pStyle w:val="ListParagraph"/>
-        <w:numPr>
-          <w:ilvl w:val="0"/>
-          <w:numId w:val="3"/>
-        </w:numPr>
-        <w:spacing w:after="60"/>
-      </w:pPr>
-      <w:r>
-        <w:rPr>
-          <w:rFonts w:ascii="Arial" w:cs="Arial" w:eastAsia="Arial" w:hAnsi="Arial"/>
-          <w:sz w:val="22"/>
-          <w:szCs w:val="22"/>
-        </w:rPr>
-        <w:t xml:space="preserve">Drag and drop cards between columns to update task status</w:t>
-      </w:r>
-    </w:p>
-    <w:p>
-      <w:pPr>
-        <w:pStyle w:val="ListParagraph"/>
-        <w:numPr>
-          <w:ilvl w:val="0"/>
-          <w:numId w:val="3"/>
-        </w:numPr>
-        <w:spacing w:after="60"/>
-      </w:pPr>
-      <w:r>
-        <w:rPr>
-          <w:rFonts w:ascii="Arial" w:cs="Arial" w:eastAsia="Arial" w:hAnsi="Arial"/>
-          <w:sz w:val="22"/>
-          <w:szCs w:val="22"/>
-        </w:rPr>
-        <w:t xml:space="preserve">Add new cards directly from any column</w:t>
-      </w:r>
-    </w:p>
-    <w:p>
-      <w:pPr>
-        <w:pStyle w:val="ListParagraph"/>
-        <w:numPr>
-          <w:ilvl w:val="0"/>
-          <w:numId w:val="3"/>
-        </w:numPr>
-        <w:spacing w:after="60"/>
-      </w:pPr>
-      <w:r>
-        <w:rPr>
-          <w:rFonts w:ascii="Arial" w:cs="Arial" w:eastAsia="Arial" w:hAnsi="Arial"/>
-          <w:sz w:val="22"/>
-          <w:szCs w:val="22"/>
-        </w:rPr>
-        <w:t xml:space="preserve">Add new columns for custom workflows</w:t>
-      </w:r>
-    </w:p>
-    <w:p>
-      <w:pPr>
-        <w:pStyle w:val="ListParagraph"/>
-        <w:numPr>
-          <w:ilvl w:val="0"/>
-          <w:numId w:val="3"/>
-        </w:numPr>
-        <w:spacing w:after="60"/>
-      </w:pPr>
-      <w:r>
-        <w:rPr>
-          <w:rFonts w:ascii="Arial" w:cs="Arial" w:eastAsia="Arial" w:hAnsi="Arial"/>
-          <w:sz w:val="22"/>
-          <w:szCs w:val="22"/>
-        </w:rPr>
-        <w:t xml:space="preserve">Board Settings for column configuration</w:t>
-      </w:r>
-    </w:p>
-    <w:p>
-      <w:pPr>
-        <w:pStyle w:val="ListParagraph"/>
-        <w:numPr>
-          <w:ilvl w:val="0"/>
-          <w:numId w:val="3"/>
-        </w:numPr>
-        <w:spacing w:after="60"/>
-      </w:pPr>
-      <w:r>
-        <w:rPr>
-          <w:rFonts w:ascii="Arial" w:cs="Arial" w:eastAsia="Arial" w:hAnsi="Arial"/>
-          <w:sz w:val="22"/>
-          <w:szCs w:val="22"/>
-        </w:rPr>
-        <w:t xml:space="preserve">Members view for team assignment</w:t>
-      </w:r>
-    </w:p>
-    <w:p>
-      <w:pPr>
-        <w:pStyle w:val="ListParagraph"/>
-        <w:numPr>
-          <w:ilvl w:val="0"/>
-          <w:numId w:val="3"/>
-        </w:numPr>
-        <w:spacing w:after="60"/>
-      </w:pPr>
-      <w:r>
-        <w:rPr>
-          <w:rFonts w:ascii="Arial" w:cs="Arial" w:eastAsia="Arial" w:hAnsi="Arial"/>
-          <w:sz w:val="22"/>
-          <w:szCs w:val="22"/>
-        </w:rPr>
-        <w:t xml:space="preserve">Analytics button to jump to performance data</w:t>
-      </w:r>
-    </w:p>
-    <w:p>
-      <w:r>
-        <w:br w:type="page"/>
-      </w:r>
-    </w:p>
-    <w:p>
-      <w:pPr>
-        <w:pStyle w:val="Heading2"/>
-      </w:pPr>
-      <w:r>
-        <w:rPr>
-          <w:b/>
-          <w:bCs/>
-        </w:rPr>
-        <w:t xml:space="preserve">3.4 Analytics</w:t>
+        <w:t xml:space="preserve">3.3 Layer 3: Kanban Board</w:t>
       </w:r>
     </w:p>
     <w:tbl>
@@ -3718,11 +3010,11 @@
                 <w:sz w:val="20"/>
                 <w:szCs w:val="20"/>
               </w:rPr>
-              <w:t xml:space="preserve">Live Demo — Analytics</w:t>
-            </w:r>
-          </w:p>
-          <w:p>
-            <w:hyperlink w:history="1" r:id="rIdumpg1xhczhgtmpy_75akv">
+              <w:t xml:space="preserve">Live Demo — Kanban Board</w:t>
+            </w:r>
+          </w:p>
+          <w:p>
+            <w:hyperlink w:history="1" r:id="rId54mgj04oogggr7n1zs1d_">
               <w:r>
                 <w:rPr>
                   <w:rStyle w:val="Hyperlink"/>
@@ -3730,7 +3022,7 @@
                   <w:sz w:val="20"/>
                   <w:szCs w:val="20"/>
                 </w:rPr>
-                <w:t xml:space="preserve">https://nikkortrinidad-cpu.github.io/kanban-website/mockups/04-analytics.html</w:t>
+                <w:t xml:space="preserve">https://nikkortrinidad-cpu.github.io/kanban-website/mockups/03-kanban.html</w:t>
               </w:r>
             </w:hyperlink>
           </w:p>
@@ -3753,7 +3045,7 @@
           <w:sz w:val="22"/>
           <w:szCs w:val="22"/>
         </w:rPr>
-        <w:t xml:space="preserve">The analytics page gives a performance overview for a specific client. It’s accessible from the services page or the kanban board.</w:t>
+        <w:t xml:space="preserve">Click any service card and you get the kanban board for that service. This is where the production team lives day-to-day.</w:t>
       </w:r>
     </w:p>
     <w:p>
@@ -3765,7 +3057,7 @@
           <w:b/>
           <w:bCs/>
         </w:rPr>
-        <w:t xml:space="preserve">KPI Summary</w:t>
+        <w:t xml:space="preserve">Board Structure</w:t>
       </w:r>
     </w:p>
     <w:p>
@@ -3779,7 +3071,7 @@
           <w:sz w:val="22"/>
           <w:szCs w:val="22"/>
         </w:rPr>
-        <w:t xml:space="preserve">Four metrics across the top, with trend indicators:</w:t>
+        <w:t xml:space="preserve">The board has four columns by default, representing the task lifecycle:</w:t>
       </w:r>
     </w:p>
     <w:tbl>
@@ -3796,8 +3088,7 @@
       </w:tblPr>
       <w:tblGrid>
         <w:gridCol w:w="2340"/>
-        <w:gridCol w:w="2340"/>
-        <w:gridCol w:w="4680"/>
+        <w:gridCol w:w="7020"/>
       </w:tblGrid>
       <w:tr>
         <w:tc>
@@ -3830,13 +3121,13 @@
                 <w:sz w:val="20"/>
                 <w:szCs w:val="20"/>
               </w:rPr>
-              <w:t xml:space="preserve">Metric</w:t>
-            </w:r>
-          </w:p>
-        </w:tc>
-        <w:tc>
-          <w:tcPr>
-            <w:tcW w:type="dxa" w:w="2340"/>
+              <w:t xml:space="preserve">Column</w:t>
+            </w:r>
+          </w:p>
+        </w:tc>
+        <w:tc>
+          <w:tcPr>
+            <w:tcW w:type="dxa" w:w="7020"/>
             <w:tcBorders>
               <w:top w:val="single" w:color="D2D2D7" w:sz="1"/>
               <w:left w:val="single" w:color="D2D2D7" w:sz="1"/>
@@ -3864,20 +3155,21 @@
                 <w:sz w:val="20"/>
                 <w:szCs w:val="20"/>
               </w:rPr>
-              <w:t xml:space="preserve">Value</w:t>
-            </w:r>
-          </w:p>
-        </w:tc>
-        <w:tc>
-          <w:tcPr>
-            <w:tcW w:type="dxa" w:w="4680"/>
-            <w:tcBorders>
-              <w:top w:val="single" w:color="D2D2D7" w:sz="1"/>
-              <w:left w:val="single" w:color="D2D2D7" w:sz="1"/>
-              <w:bottom w:val="single" w:color="D2D2D7" w:sz="1"/>
-              <w:right w:val="single" w:color="D2D2D7" w:sz="1"/>
-            </w:tcBorders>
-            <w:shd w:fill="E8F0FF" w:val="clear"/>
+              <w:t xml:space="preserve">Purpose</w:t>
+            </w:r>
+          </w:p>
+        </w:tc>
+      </w:tr>
+      <w:tr>
+        <w:tc>
+          <w:tcPr>
+            <w:tcW w:type="dxa" w:w="2340"/>
+            <w:tcBorders>
+              <w:top w:val="single" w:color="D2D2D7" w:sz="1"/>
+              <w:left w:val="single" w:color="D2D2D7" w:sz="1"/>
+              <w:bottom w:val="single" w:color="D2D2D7" w:sz="1"/>
+              <w:right w:val="single" w:color="D2D2D7" w:sz="1"/>
+            </w:tcBorders>
             <w:tcMar>
               <w:top w:type="dxa" w:w="80"/>
               <w:left w:type="dxa" w:w="120"/>
@@ -3898,7 +3190,40 @@
                 <w:sz w:val="20"/>
                 <w:szCs w:val="20"/>
               </w:rPr>
-              <w:t xml:space="preserve">Trend</w:t>
+              <w:t xml:space="preserve">To Do</w:t>
+            </w:r>
+          </w:p>
+        </w:tc>
+        <w:tc>
+          <w:tcPr>
+            <w:tcW w:type="dxa" w:w="7020"/>
+            <w:tcBorders>
+              <w:top w:val="single" w:color="D2D2D7" w:sz="1"/>
+              <w:left w:val="single" w:color="D2D2D7" w:sz="1"/>
+              <w:bottom w:val="single" w:color="D2D2D7" w:sz="1"/>
+              <w:right w:val="single" w:color="D2D2D7" w:sz="1"/>
+            </w:tcBorders>
+            <w:tcMar>
+              <w:top w:type="dxa" w:w="80"/>
+              <w:left w:type="dxa" w:w="120"/>
+              <w:bottom w:type="dxa" w:w="80"/>
+              <w:right w:type="dxa" w:w="120"/>
+            </w:tcMar>
+          </w:tcPr>
+          <w:p>
+            <w:pPr>
+              <w:jc w:val="left"/>
+            </w:pPr>
+            <w:r>
+              <w:rPr>
+                <w:rFonts w:ascii="Arial" w:cs="Arial" w:eastAsia="Arial" w:hAnsi="Arial"/>
+                <w:b w:val="false"/>
+                <w:bCs w:val="false"/>
+                <w:color w:val="1D1D1F"/>
+                <w:sz w:val="20"/>
+                <w:szCs w:val="20"/>
+              </w:rPr>
+              <w:t xml:space="preserve">Tasks that are planned but not yet started</w:t>
             </w:r>
           </w:p>
         </w:tc>
@@ -3927,16 +3252,51 @@
             <w:r>
               <w:rPr>
                 <w:rFonts w:ascii="Arial" w:cs="Arial" w:eastAsia="Arial" w:hAnsi="Arial"/>
+                <w:b/>
+                <w:bCs/>
+                <w:color w:val="1D1D1F"/>
+                <w:sz w:val="20"/>
+                <w:szCs w:val="20"/>
+              </w:rPr>
+              <w:t xml:space="preserve">In Progress</w:t>
+            </w:r>
+          </w:p>
+        </w:tc>
+        <w:tc>
+          <w:tcPr>
+            <w:tcW w:type="dxa" w:w="7020"/>
+            <w:tcBorders>
+              <w:top w:val="single" w:color="D2D2D7" w:sz="1"/>
+              <w:left w:val="single" w:color="D2D2D7" w:sz="1"/>
+              <w:bottom w:val="single" w:color="D2D2D7" w:sz="1"/>
+              <w:right w:val="single" w:color="D2D2D7" w:sz="1"/>
+            </w:tcBorders>
+            <w:tcMar>
+              <w:top w:type="dxa" w:w="80"/>
+              <w:left w:type="dxa" w:w="120"/>
+              <w:bottom w:type="dxa" w:w="80"/>
+              <w:right w:type="dxa" w:w="120"/>
+            </w:tcMar>
+          </w:tcPr>
+          <w:p>
+            <w:pPr>
+              <w:jc w:val="left"/>
+            </w:pPr>
+            <w:r>
+              <w:rPr>
+                <w:rFonts w:ascii="Arial" w:cs="Arial" w:eastAsia="Arial" w:hAnsi="Arial"/>
                 <w:b w:val="false"/>
                 <w:bCs w:val="false"/>
                 <w:color w:val="1D1D1F"/>
                 <w:sz w:val="20"/>
                 <w:szCs w:val="20"/>
               </w:rPr>
-              <w:t xml:space="preserve">Total Hours Worked</w:t>
-            </w:r>
-          </w:p>
-        </w:tc>
+              <w:t xml:space="preserve">Tasks currently being worked on</w:t>
+            </w:r>
+          </w:p>
+        </w:tc>
+      </w:tr>
+      <w:tr>
         <w:tc>
           <w:tcPr>
             <w:tcW w:type="dxa" w:w="2340"/>
@@ -3966,13 +3326,13 @@
                 <w:sz w:val="20"/>
                 <w:szCs w:val="20"/>
               </w:rPr>
-              <w:t xml:space="preserve">247.5h</w:t>
-            </w:r>
-          </w:p>
-        </w:tc>
-        <w:tc>
-          <w:tcPr>
-            <w:tcW w:type="dxa" w:w="4680"/>
+              <w:t xml:space="preserve">In Review</w:t>
+            </w:r>
+          </w:p>
+        </w:tc>
+        <w:tc>
+          <w:tcPr>
+            <w:tcW w:type="dxa" w:w="7020"/>
             <w:tcBorders>
               <w:top w:val="single" w:color="D2D2D7" w:sz="1"/>
               <w:left w:val="single" w:color="D2D2D7" w:sz="1"/>
@@ -3995,11 +3355,11 @@
                 <w:rFonts w:ascii="Arial" w:cs="Arial" w:eastAsia="Arial" w:hAnsi="Arial"/>
                 <w:b w:val="false"/>
                 <w:bCs w:val="false"/>
-                <w:color w:val="1A8D44"/>
-                <w:sz w:val="20"/>
-                <w:szCs w:val="20"/>
-              </w:rPr>
-              <w:t xml:space="preserve">+12% vs last month</w:t>
+                <w:color w:val="1D1D1F"/>
+                <w:sz w:val="20"/>
+                <w:szCs w:val="20"/>
+              </w:rPr>
+              <w:t xml:space="preserve">Tasks completed by the team, waiting for review or client feedback</w:t>
             </w:r>
           </w:p>
         </w:tc>
@@ -4028,281 +3388,46 @@
             <w:r>
               <w:rPr>
                 <w:rFonts w:ascii="Arial" w:cs="Arial" w:eastAsia="Arial" w:hAnsi="Arial"/>
+                <w:b/>
+                <w:bCs/>
+                <w:color w:val="1D1D1F"/>
+                <w:sz w:val="20"/>
+                <w:szCs w:val="20"/>
+              </w:rPr>
+              <w:t xml:space="preserve">Done</w:t>
+            </w:r>
+          </w:p>
+        </w:tc>
+        <w:tc>
+          <w:tcPr>
+            <w:tcW w:type="dxa" w:w="7020"/>
+            <w:tcBorders>
+              <w:top w:val="single" w:color="D2D2D7" w:sz="1"/>
+              <w:left w:val="single" w:color="D2D2D7" w:sz="1"/>
+              <w:bottom w:val="single" w:color="D2D2D7" w:sz="1"/>
+              <w:right w:val="single" w:color="D2D2D7" w:sz="1"/>
+            </w:tcBorders>
+            <w:tcMar>
+              <w:top w:type="dxa" w:w="80"/>
+              <w:left w:type="dxa" w:w="120"/>
+              <w:bottom w:type="dxa" w:w="80"/>
+              <w:right w:type="dxa" w:w="120"/>
+            </w:tcMar>
+          </w:tcPr>
+          <w:p>
+            <w:pPr>
+              <w:jc w:val="left"/>
+            </w:pPr>
+            <w:r>
+              <w:rPr>
+                <w:rFonts w:ascii="Arial" w:cs="Arial" w:eastAsia="Arial" w:hAnsi="Arial"/>
                 <w:b w:val="false"/>
                 <w:bCs w:val="false"/>
                 <w:color w:val="1D1D1F"/>
                 <w:sz w:val="20"/>
                 <w:szCs w:val="20"/>
               </w:rPr>
-              <w:t xml:space="preserve">Total Billings</w:t>
-            </w:r>
-          </w:p>
-        </w:tc>
-        <w:tc>
-          <w:tcPr>
-            <w:tcW w:type="dxa" w:w="2340"/>
-            <w:tcBorders>
-              <w:top w:val="single" w:color="D2D2D7" w:sz="1"/>
-              <w:left w:val="single" w:color="D2D2D7" w:sz="1"/>
-              <w:bottom w:val="single" w:color="D2D2D7" w:sz="1"/>
-              <w:right w:val="single" w:color="D2D2D7" w:sz="1"/>
-            </w:tcBorders>
-            <w:tcMar>
-              <w:top w:type="dxa" w:w="80"/>
-              <w:left w:type="dxa" w:w="120"/>
-              <w:bottom w:type="dxa" w:w="80"/>
-              <w:right w:type="dxa" w:w="120"/>
-            </w:tcMar>
-          </w:tcPr>
-          <w:p>
-            <w:pPr>
-              <w:jc w:val="left"/>
-            </w:pPr>
-            <w:r>
-              <w:rPr>
-                <w:rFonts w:ascii="Arial" w:cs="Arial" w:eastAsia="Arial" w:hAnsi="Arial"/>
-                <w:b/>
-                <w:bCs/>
-                <w:color w:val="1D1D1F"/>
-                <w:sz w:val="20"/>
-                <w:szCs w:val="20"/>
-              </w:rPr>
-              <w:t xml:space="preserve">$37,500</w:t>
-            </w:r>
-          </w:p>
-        </w:tc>
-        <w:tc>
-          <w:tcPr>
-            <w:tcW w:type="dxa" w:w="4680"/>
-            <w:tcBorders>
-              <w:top w:val="single" w:color="D2D2D7" w:sz="1"/>
-              <w:left w:val="single" w:color="D2D2D7" w:sz="1"/>
-              <w:bottom w:val="single" w:color="D2D2D7" w:sz="1"/>
-              <w:right w:val="single" w:color="D2D2D7" w:sz="1"/>
-            </w:tcBorders>
-            <w:tcMar>
-              <w:top w:type="dxa" w:w="80"/>
-              <w:left w:type="dxa" w:w="120"/>
-              <w:bottom w:type="dxa" w:w="80"/>
-              <w:right w:type="dxa" w:w="120"/>
-            </w:tcMar>
-          </w:tcPr>
-          <w:p>
-            <w:pPr>
-              <w:jc w:val="left"/>
-            </w:pPr>
-            <w:r>
-              <w:rPr>
-                <w:rFonts w:ascii="Arial" w:cs="Arial" w:eastAsia="Arial" w:hAnsi="Arial"/>
-                <w:b w:val="false"/>
-                <w:bCs w:val="false"/>
-                <w:color w:val="86868B"/>
-                <w:sz w:val="20"/>
-                <w:szCs w:val="20"/>
-              </w:rPr>
-              <w:t xml:space="preserve">Same as last month</w:t>
-            </w:r>
-          </w:p>
-        </w:tc>
-      </w:tr>
-      <w:tr>
-        <w:tc>
-          <w:tcPr>
-            <w:tcW w:type="dxa" w:w="2340"/>
-            <w:tcBorders>
-              <w:top w:val="single" w:color="D2D2D7" w:sz="1"/>
-              <w:left w:val="single" w:color="D2D2D7" w:sz="1"/>
-              <w:bottom w:val="single" w:color="D2D2D7" w:sz="1"/>
-              <w:right w:val="single" w:color="D2D2D7" w:sz="1"/>
-            </w:tcBorders>
-            <w:tcMar>
-              <w:top w:type="dxa" w:w="80"/>
-              <w:left w:type="dxa" w:w="120"/>
-              <w:bottom w:type="dxa" w:w="80"/>
-              <w:right w:type="dxa" w:w="120"/>
-            </w:tcMar>
-          </w:tcPr>
-          <w:p>
-            <w:pPr>
-              <w:jc w:val="left"/>
-            </w:pPr>
-            <w:r>
-              <w:rPr>
-                <w:rFonts w:ascii="Arial" w:cs="Arial" w:eastAsia="Arial" w:hAnsi="Arial"/>
-                <w:b w:val="false"/>
-                <w:bCs w:val="false"/>
-                <w:color w:val="1D1D1F"/>
-                <w:sz w:val="20"/>
-                <w:szCs w:val="20"/>
-              </w:rPr>
-              <w:t xml:space="preserve">Tasks Completed</w:t>
-            </w:r>
-          </w:p>
-        </w:tc>
-        <w:tc>
-          <w:tcPr>
-            <w:tcW w:type="dxa" w:w="2340"/>
-            <w:tcBorders>
-              <w:top w:val="single" w:color="D2D2D7" w:sz="1"/>
-              <w:left w:val="single" w:color="D2D2D7" w:sz="1"/>
-              <w:bottom w:val="single" w:color="D2D2D7" w:sz="1"/>
-              <w:right w:val="single" w:color="D2D2D7" w:sz="1"/>
-            </w:tcBorders>
-            <w:tcMar>
-              <w:top w:type="dxa" w:w="80"/>
-              <w:left w:type="dxa" w:w="120"/>
-              <w:bottom w:type="dxa" w:w="80"/>
-              <w:right w:type="dxa" w:w="120"/>
-            </w:tcMar>
-          </w:tcPr>
-          <w:p>
-            <w:pPr>
-              <w:jc w:val="left"/>
-            </w:pPr>
-            <w:r>
-              <w:rPr>
-                <w:rFonts w:ascii="Arial" w:cs="Arial" w:eastAsia="Arial" w:hAnsi="Arial"/>
-                <w:b/>
-                <w:bCs/>
-                <w:color w:val="1D1D1F"/>
-                <w:sz w:val="20"/>
-                <w:szCs w:val="20"/>
-              </w:rPr>
-              <w:t xml:space="preserve">34</w:t>
-            </w:r>
-          </w:p>
-        </w:tc>
-        <w:tc>
-          <w:tcPr>
-            <w:tcW w:type="dxa" w:w="4680"/>
-            <w:tcBorders>
-              <w:top w:val="single" w:color="D2D2D7" w:sz="1"/>
-              <w:left w:val="single" w:color="D2D2D7" w:sz="1"/>
-              <w:bottom w:val="single" w:color="D2D2D7" w:sz="1"/>
-              <w:right w:val="single" w:color="D2D2D7" w:sz="1"/>
-            </w:tcBorders>
-            <w:tcMar>
-              <w:top w:type="dxa" w:w="80"/>
-              <w:left w:type="dxa" w:w="120"/>
-              <w:bottom w:type="dxa" w:w="80"/>
-              <w:right w:type="dxa" w:w="120"/>
-            </w:tcMar>
-          </w:tcPr>
-          <w:p>
-            <w:pPr>
-              <w:jc w:val="left"/>
-            </w:pPr>
-            <w:r>
-              <w:rPr>
-                <w:rFonts w:ascii="Arial" w:cs="Arial" w:eastAsia="Arial" w:hAnsi="Arial"/>
-                <w:b w:val="false"/>
-                <w:bCs w:val="false"/>
-                <w:color w:val="1A8D44"/>
-                <w:sz w:val="20"/>
-                <w:szCs w:val="20"/>
-              </w:rPr>
-              <w:t xml:space="preserve">+8 more than last month</w:t>
-            </w:r>
-          </w:p>
-        </w:tc>
-      </w:tr>
-      <w:tr>
-        <w:tc>
-          <w:tcPr>
-            <w:tcW w:type="dxa" w:w="2340"/>
-            <w:tcBorders>
-              <w:top w:val="single" w:color="D2D2D7" w:sz="1"/>
-              <w:left w:val="single" w:color="D2D2D7" w:sz="1"/>
-              <w:bottom w:val="single" w:color="D2D2D7" w:sz="1"/>
-              <w:right w:val="single" w:color="D2D2D7" w:sz="1"/>
-            </w:tcBorders>
-            <w:tcMar>
-              <w:top w:type="dxa" w:w="80"/>
-              <w:left w:type="dxa" w:w="120"/>
-              <w:bottom w:type="dxa" w:w="80"/>
-              <w:right w:type="dxa" w:w="120"/>
-            </w:tcMar>
-          </w:tcPr>
-          <w:p>
-            <w:pPr>
-              <w:jc w:val="left"/>
-            </w:pPr>
-            <w:r>
-              <w:rPr>
-                <w:rFonts w:ascii="Arial" w:cs="Arial" w:eastAsia="Arial" w:hAnsi="Arial"/>
-                <w:b w:val="false"/>
-                <w:bCs w:val="false"/>
-                <w:color w:val="1D1D1F"/>
-                <w:sz w:val="20"/>
-                <w:szCs w:val="20"/>
-              </w:rPr>
-              <w:t xml:space="preserve">Profitability</w:t>
-            </w:r>
-          </w:p>
-        </w:tc>
-        <w:tc>
-          <w:tcPr>
-            <w:tcW w:type="dxa" w:w="2340"/>
-            <w:tcBorders>
-              <w:top w:val="single" w:color="D2D2D7" w:sz="1"/>
-              <w:left w:val="single" w:color="D2D2D7" w:sz="1"/>
-              <w:bottom w:val="single" w:color="D2D2D7" w:sz="1"/>
-              <w:right w:val="single" w:color="D2D2D7" w:sz="1"/>
-            </w:tcBorders>
-            <w:tcMar>
-              <w:top w:type="dxa" w:w="80"/>
-              <w:left w:type="dxa" w:w="120"/>
-              <w:bottom w:type="dxa" w:w="80"/>
-              <w:right w:type="dxa" w:w="120"/>
-            </w:tcMar>
-          </w:tcPr>
-          <w:p>
-            <w:pPr>
-              <w:jc w:val="left"/>
-            </w:pPr>
-            <w:r>
-              <w:rPr>
-                <w:rFonts w:ascii="Arial" w:cs="Arial" w:eastAsia="Arial" w:hAnsi="Arial"/>
-                <w:b/>
-                <w:bCs/>
-                <w:color w:val="1D1D1F"/>
-                <w:sz w:val="20"/>
-                <w:szCs w:val="20"/>
-              </w:rPr>
-              <w:t xml:space="preserve">+$13,125</w:t>
-            </w:r>
-          </w:p>
-        </w:tc>
-        <w:tc>
-          <w:tcPr>
-            <w:tcW w:type="dxa" w:w="4680"/>
-            <w:tcBorders>
-              <w:top w:val="single" w:color="D2D2D7" w:sz="1"/>
-              <w:left w:val="single" w:color="D2D2D7" w:sz="1"/>
-              <w:bottom w:val="single" w:color="D2D2D7" w:sz="1"/>
-              <w:right w:val="single" w:color="D2D2D7" w:sz="1"/>
-            </w:tcBorders>
-            <w:tcMar>
-              <w:top w:type="dxa" w:w="80"/>
-              <w:left w:type="dxa" w:w="120"/>
-              <w:bottom w:type="dxa" w:w="80"/>
-              <w:right w:type="dxa" w:w="120"/>
-            </w:tcMar>
-          </w:tcPr>
-          <w:p>
-            <w:pPr>
-              <w:jc w:val="left"/>
-            </w:pPr>
-            <w:r>
-              <w:rPr>
-                <w:rFonts w:ascii="Arial" w:cs="Arial" w:eastAsia="Arial" w:hAnsi="Arial"/>
-                <w:b w:val="false"/>
-                <w:bCs w:val="false"/>
-                <w:color w:val="1A8D44"/>
-                <w:sz w:val="20"/>
-                <w:szCs w:val="20"/>
-              </w:rPr>
-              <w:t xml:space="preserve">54% margin</w:t>
+              <w:t xml:space="preserve">Tasks that are fully completed and approved</w:t>
             </w:r>
           </w:p>
         </w:tc>
@@ -4322,7 +3447,21 @@
           <w:b/>
           <w:bCs/>
         </w:rPr>
-        <w:t xml:space="preserve">Charts &amp; Breakdowns</w:t>
+        <w:t xml:space="preserve">Task Cards</w:t>
+      </w:r>
+    </w:p>
+    <w:p>
+      <w:pPr>
+        <w:spacing w:after="120"/>
+      </w:pPr>
+      <w:r>
+        <w:rPr>
+          <w:rFonts w:ascii="Arial" w:cs="Arial" w:eastAsia="Arial" w:hAnsi="Arial"/>
+          <w:color w:val="1D1D1F"/>
+          <w:sz w:val="22"/>
+          <w:szCs w:val="22"/>
+        </w:rPr>
+        <w:t xml:space="preserve">Each card on the board represents a task. Cards show:</w:t>
       </w:r>
     </w:p>
     <w:p>
@@ -4340,7 +3479,7 @@
           <w:sz w:val="22"/>
           <w:szCs w:val="22"/>
         </w:rPr>
-        <w:t xml:space="preserve">Task Breakdown — Donut chart showing distribution: Done (18), In Progress (13), In Review (11), Overdue (6), To Do (8)</w:t>
+        <w:t xml:space="preserve">Priority indicator (red = high, orange = medium, green = low)</w:t>
       </w:r>
     </w:p>
     <w:p>
@@ -4358,7 +3497,7 @@
           <w:sz w:val="22"/>
           <w:szCs w:val="22"/>
         </w:rPr>
-        <w:t xml:space="preserve">Task Velocity — Bar chart showing weekly completed tasks (W1–W8) to track team throughput over time</w:t>
+        <w:t xml:space="preserve">Label badges (Design, Dev, Bug, Feature, Content) with color coding</w:t>
       </w:r>
     </w:p>
     <w:p>
@@ -4376,7 +3515,7 @@
           <w:sz w:val="22"/>
           <w:szCs w:val="22"/>
         </w:rPr>
-        <w:t xml:space="preserve">Hours by Service — Which services are consuming the most time (Website Redesign: 98.5h, Mobile App: 82h, SEO: 45h, Cloud: 22h)</w:t>
+        <w:t xml:space="preserve">Task title</w:t>
       </w:r>
     </w:p>
     <w:p>
@@ -4394,7 +3533,25 @@
           <w:sz w:val="22"/>
           <w:szCs w:val="22"/>
         </w:rPr>
-        <w:t xml:space="preserve">Hours by Team Member — Individual contribution breakdown (Alex Smith: 88h, Jake Kim: 72.5h, etc.)</w:t>
+        <w:t xml:space="preserve">Comment count and attachment count</w:t>
+      </w:r>
+    </w:p>
+    <w:p>
+      <w:pPr>
+        <w:pStyle w:val="ListParagraph"/>
+        <w:numPr>
+          <w:ilvl w:val="0"/>
+          <w:numId w:val="3"/>
+        </w:numPr>
+        <w:spacing w:after="60"/>
+      </w:pPr>
+      <w:r>
+        <w:rPr>
+          <w:rFonts w:ascii="Arial" w:cs="Arial" w:eastAsia="Arial" w:hAnsi="Arial"/>
+          <w:sz w:val="22"/>
+          <w:szCs w:val="22"/>
+        </w:rPr>
+        <w:t xml:space="preserve">Assigned team member avatar</w:t>
       </w:r>
     </w:p>
     <w:tbl>
@@ -4491,7 +3648,7 @@
           <w:sz w:val="18"/>
           <w:szCs w:val="18"/>
         </w:rPr>
-        <w:t xml:space="preserve">Figure 7: Analytics — KPI cards, task breakdown donut chart, velocity bar chart, and hours tables</w:t>
+        <w:t xml:space="preserve">Figure 6: Kanban board for “Website Redesign” — 4 columns with task cards, breadcrumb navigation</w:t>
       </w:r>
     </w:p>
     <w:p>
@@ -4503,7 +3660,7 @@
           <w:b/>
           <w:bCs/>
         </w:rPr>
-        <w:t xml:space="preserve">Financial Overview</w:t>
+        <w:t xml:space="preserve">Board Actions</w:t>
       </w:r>
     </w:p>
     <w:p>
@@ -4521,7 +3678,7 @@
           <w:sz w:val="22"/>
           <w:szCs w:val="22"/>
         </w:rPr>
-        <w:t xml:space="preserve">Profitability Overview — Total revenue ($37,500), total cost ($24,375), net profit (+$13,125), profit margin (54%)</w:t>
+        <w:t xml:space="preserve">Drag and drop cards between columns to update task status</w:t>
       </w:r>
     </w:p>
     <w:p>
@@ -4539,7 +3696,7 @@
           <w:sz w:val="22"/>
           <w:szCs w:val="22"/>
         </w:rPr>
-        <w:t xml:space="preserve">Monthly breakdown comparing revenue vs. cost per month</w:t>
+        <w:t xml:space="preserve">Add new cards directly from any column</w:t>
       </w:r>
     </w:p>
     <w:p>
@@ -4557,7 +3714,803 @@
           <w:sz w:val="22"/>
           <w:szCs w:val="22"/>
         </w:rPr>
-        <w:t xml:space="preserve">Billing History — Full invoice table with invoice numbers, dates, amounts, and payment status</w:t>
+        <w:t xml:space="preserve">Add new columns for custom workflows</w:t>
+      </w:r>
+    </w:p>
+    <w:p>
+      <w:pPr>
+        <w:pStyle w:val="ListParagraph"/>
+        <w:numPr>
+          <w:ilvl w:val="0"/>
+          <w:numId w:val="3"/>
+        </w:numPr>
+        <w:spacing w:after="60"/>
+      </w:pPr>
+      <w:r>
+        <w:rPr>
+          <w:rFonts w:ascii="Arial" w:cs="Arial" w:eastAsia="Arial" w:hAnsi="Arial"/>
+          <w:sz w:val="22"/>
+          <w:szCs w:val="22"/>
+        </w:rPr>
+        <w:t xml:space="preserve">Board Settings for column configuration</w:t>
+      </w:r>
+    </w:p>
+    <w:p>
+      <w:pPr>
+        <w:pStyle w:val="ListParagraph"/>
+        <w:numPr>
+          <w:ilvl w:val="0"/>
+          <w:numId w:val="3"/>
+        </w:numPr>
+        <w:spacing w:after="60"/>
+      </w:pPr>
+      <w:r>
+        <w:rPr>
+          <w:rFonts w:ascii="Arial" w:cs="Arial" w:eastAsia="Arial" w:hAnsi="Arial"/>
+          <w:sz w:val="22"/>
+          <w:szCs w:val="22"/>
+        </w:rPr>
+        <w:t xml:space="preserve">Members view for team assignment</w:t>
+      </w:r>
+    </w:p>
+    <w:p>
+      <w:pPr>
+        <w:pStyle w:val="ListParagraph"/>
+        <w:numPr>
+          <w:ilvl w:val="0"/>
+          <w:numId w:val="3"/>
+        </w:numPr>
+        <w:spacing w:after="60"/>
+      </w:pPr>
+      <w:r>
+        <w:rPr>
+          <w:rFonts w:ascii="Arial" w:cs="Arial" w:eastAsia="Arial" w:hAnsi="Arial"/>
+          <w:sz w:val="22"/>
+          <w:szCs w:val="22"/>
+        </w:rPr>
+        <w:t xml:space="preserve">Analytics button to jump to performance data</w:t>
+      </w:r>
+    </w:p>
+    <w:p>
+      <w:r>
+        <w:br w:type="page"/>
+      </w:r>
+    </w:p>
+    <w:p>
+      <w:pPr>
+        <w:pStyle w:val="Heading2"/>
+      </w:pPr>
+      <w:r>
+        <w:rPr>
+          <w:b/>
+          <w:bCs/>
+        </w:rPr>
+        <w:t xml:space="preserve">3.4 Analytics</w:t>
+      </w:r>
+    </w:p>
+    <w:tbl>
+      <w:tblPr>
+        <w:tblW w:type="dxa" w:w="9360"/>
+        <w:tblBorders>
+          <w:top w:val="single" w:color="auto" w:sz="4"/>
+          <w:left w:val="single" w:color="auto" w:sz="4"/>
+          <w:bottom w:val="single" w:color="auto" w:sz="4"/>
+          <w:right w:val="single" w:color="auto" w:sz="4"/>
+          <w:insideH w:val="single" w:color="auto" w:sz="4"/>
+          <w:insideV w:val="single" w:color="auto" w:sz="4"/>
+        </w:tblBorders>
+      </w:tblPr>
+      <w:tblGrid>
+        <w:gridCol w:w="9360"/>
+      </w:tblGrid>
+      <w:tr>
+        <w:tc>
+          <w:tcPr>
+            <w:tcW w:type="dxa" w:w="9360"/>
+            <w:tcBorders>
+              <w:top w:val="single" w:color="0071E3" w:sz="3"/>
+              <w:left w:val="single" w:color="0071E3" w:sz="3"/>
+              <w:bottom w:val="single" w:color="0071E3" w:sz="3"/>
+              <w:right w:val="single" w:color="0071E3" w:sz="3"/>
+            </w:tcBorders>
+            <w:shd w:fill="E8F0FF" w:val="clear"/>
+            <w:tcMar>
+              <w:top w:type="dxa" w:w="120"/>
+              <w:left w:type="dxa" w:w="160"/>
+              <w:bottom w:type="dxa" w:w="120"/>
+              <w:right w:type="dxa" w:w="160"/>
+            </w:tcMar>
+          </w:tcPr>
+          <w:p>
+            <w:pPr>
+              <w:spacing w:after="60"/>
+            </w:pPr>
+            <w:r>
+              <w:rPr>
+                <w:rFonts w:ascii="Arial" w:cs="Arial" w:eastAsia="Arial" w:hAnsi="Arial"/>
+                <w:b/>
+                <w:bCs/>
+                <w:color w:val="1D1D1F"/>
+                <w:sz w:val="20"/>
+                <w:szCs w:val="20"/>
+              </w:rPr>
+              <w:t xml:space="preserve">Live Demo — Analytics</w:t>
+            </w:r>
+          </w:p>
+          <w:p>
+            <w:hyperlink w:history="1" r:id="rIdemrgnhoaqx2afztb6sdvt">
+              <w:r>
+                <w:rPr>
+                  <w:rStyle w:val="Hyperlink"/>
+                  <w:rFonts w:ascii="Arial" w:cs="Arial" w:eastAsia="Arial" w:hAnsi="Arial"/>
+                  <w:sz w:val="20"/>
+                  <w:szCs w:val="20"/>
+                </w:rPr>
+                <w:t xml:space="preserve">https://nikkortrinidad-cpu.github.io/kanban-website/mockups/04-analytics.html</w:t>
+              </w:r>
+            </w:hyperlink>
+          </w:p>
+        </w:tc>
+      </w:tr>
+    </w:tbl>
+    <w:p>
+      <w:pPr>
+        <w:spacing w:after="120" w:before="200"/>
+      </w:pPr>
+    </w:p>
+    <w:p>
+      <w:pPr>
+        <w:spacing w:after="120"/>
+      </w:pPr>
+      <w:r>
+        <w:rPr>
+          <w:rFonts w:ascii="Arial" w:cs="Arial" w:eastAsia="Arial" w:hAnsi="Arial"/>
+          <w:color w:val="1D1D1F"/>
+          <w:sz w:val="22"/>
+          <w:szCs w:val="22"/>
+        </w:rPr>
+        <w:t xml:space="preserve">The analytics page gives a performance overview for a specific client. It’s accessible from the services page or the kanban board.</w:t>
+      </w:r>
+    </w:p>
+    <w:p>
+      <w:pPr>
+        <w:pStyle w:val="Heading3"/>
+      </w:pPr>
+      <w:r>
+        <w:rPr>
+          <w:b/>
+          <w:bCs/>
+        </w:rPr>
+        <w:t xml:space="preserve">KPI Summary</w:t>
+      </w:r>
+    </w:p>
+    <w:p>
+      <w:pPr>
+        <w:spacing w:after="120"/>
+      </w:pPr>
+      <w:r>
+        <w:rPr>
+          <w:rFonts w:ascii="Arial" w:cs="Arial" w:eastAsia="Arial" w:hAnsi="Arial"/>
+          <w:color w:val="1D1D1F"/>
+          <w:sz w:val="22"/>
+          <w:szCs w:val="22"/>
+        </w:rPr>
+        <w:t xml:space="preserve">Four metrics across the top, with trend indicators:</w:t>
+      </w:r>
+    </w:p>
+    <w:tbl>
+      <w:tblPr>
+        <w:tblW w:type="dxa" w:w="9360"/>
+        <w:tblBorders>
+          <w:top w:val="single" w:color="auto" w:sz="4"/>
+          <w:left w:val="single" w:color="auto" w:sz="4"/>
+          <w:bottom w:val="single" w:color="auto" w:sz="4"/>
+          <w:right w:val="single" w:color="auto" w:sz="4"/>
+          <w:insideH w:val="single" w:color="auto" w:sz="4"/>
+          <w:insideV w:val="single" w:color="auto" w:sz="4"/>
+        </w:tblBorders>
+      </w:tblPr>
+      <w:tblGrid>
+        <w:gridCol w:w="2340"/>
+        <w:gridCol w:w="2340"/>
+        <w:gridCol w:w="4680"/>
+      </w:tblGrid>
+      <w:tr>
+        <w:tc>
+          <w:tcPr>
+            <w:tcW w:type="dxa" w:w="2340"/>
+            <w:tcBorders>
+              <w:top w:val="single" w:color="D2D2D7" w:sz="1"/>
+              <w:left w:val="single" w:color="D2D2D7" w:sz="1"/>
+              <w:bottom w:val="single" w:color="D2D2D7" w:sz="1"/>
+              <w:right w:val="single" w:color="D2D2D7" w:sz="1"/>
+            </w:tcBorders>
+            <w:shd w:fill="E8F0FF" w:val="clear"/>
+            <w:tcMar>
+              <w:top w:type="dxa" w:w="80"/>
+              <w:left w:type="dxa" w:w="120"/>
+              <w:bottom w:type="dxa" w:w="80"/>
+              <w:right w:type="dxa" w:w="120"/>
+            </w:tcMar>
+          </w:tcPr>
+          <w:p>
+            <w:pPr>
+              <w:jc w:val="left"/>
+            </w:pPr>
+            <w:r>
+              <w:rPr>
+                <w:rFonts w:ascii="Arial" w:cs="Arial" w:eastAsia="Arial" w:hAnsi="Arial"/>
+                <w:b/>
+                <w:bCs/>
+                <w:color w:val="1D1D1F"/>
+                <w:sz w:val="20"/>
+                <w:szCs w:val="20"/>
+              </w:rPr>
+              <w:t xml:space="preserve">Metric</w:t>
+            </w:r>
+          </w:p>
+        </w:tc>
+        <w:tc>
+          <w:tcPr>
+            <w:tcW w:type="dxa" w:w="2340"/>
+            <w:tcBorders>
+              <w:top w:val="single" w:color="D2D2D7" w:sz="1"/>
+              <w:left w:val="single" w:color="D2D2D7" w:sz="1"/>
+              <w:bottom w:val="single" w:color="D2D2D7" w:sz="1"/>
+              <w:right w:val="single" w:color="D2D2D7" w:sz="1"/>
+            </w:tcBorders>
+            <w:shd w:fill="E8F0FF" w:val="clear"/>
+            <w:tcMar>
+              <w:top w:type="dxa" w:w="80"/>
+              <w:left w:type="dxa" w:w="120"/>
+              <w:bottom w:type="dxa" w:w="80"/>
+              <w:right w:type="dxa" w:w="120"/>
+            </w:tcMar>
+          </w:tcPr>
+          <w:p>
+            <w:pPr>
+              <w:jc w:val="left"/>
+            </w:pPr>
+            <w:r>
+              <w:rPr>
+                <w:rFonts w:ascii="Arial" w:cs="Arial" w:eastAsia="Arial" w:hAnsi="Arial"/>
+                <w:b/>
+                <w:bCs/>
+                <w:color w:val="1D1D1F"/>
+                <w:sz w:val="20"/>
+                <w:szCs w:val="20"/>
+              </w:rPr>
+              <w:t xml:space="preserve">Value</w:t>
+            </w:r>
+          </w:p>
+        </w:tc>
+        <w:tc>
+          <w:tcPr>
+            <w:tcW w:type="dxa" w:w="4680"/>
+            <w:tcBorders>
+              <w:top w:val="single" w:color="D2D2D7" w:sz="1"/>
+              <w:left w:val="single" w:color="D2D2D7" w:sz="1"/>
+              <w:bottom w:val="single" w:color="D2D2D7" w:sz="1"/>
+              <w:right w:val="single" w:color="D2D2D7" w:sz="1"/>
+            </w:tcBorders>
+            <w:shd w:fill="E8F0FF" w:val="clear"/>
+            <w:tcMar>
+              <w:top w:type="dxa" w:w="80"/>
+              <w:left w:type="dxa" w:w="120"/>
+              <w:bottom w:type="dxa" w:w="80"/>
+              <w:right w:type="dxa" w:w="120"/>
+            </w:tcMar>
+          </w:tcPr>
+          <w:p>
+            <w:pPr>
+              <w:jc w:val="left"/>
+            </w:pPr>
+            <w:r>
+              <w:rPr>
+                <w:rFonts w:ascii="Arial" w:cs="Arial" w:eastAsia="Arial" w:hAnsi="Arial"/>
+                <w:b/>
+                <w:bCs/>
+                <w:color w:val="1D1D1F"/>
+                <w:sz w:val="20"/>
+                <w:szCs w:val="20"/>
+              </w:rPr>
+              <w:t xml:space="preserve">Trend</w:t>
+            </w:r>
+          </w:p>
+        </w:tc>
+      </w:tr>
+      <w:tr>
+        <w:tc>
+          <w:tcPr>
+            <w:tcW w:type="dxa" w:w="2340"/>
+            <w:tcBorders>
+              <w:top w:val="single" w:color="D2D2D7" w:sz="1"/>
+              <w:left w:val="single" w:color="D2D2D7" w:sz="1"/>
+              <w:bottom w:val="single" w:color="D2D2D7" w:sz="1"/>
+              <w:right w:val="single" w:color="D2D2D7" w:sz="1"/>
+            </w:tcBorders>
+            <w:tcMar>
+              <w:top w:type="dxa" w:w="80"/>
+              <w:left w:type="dxa" w:w="120"/>
+              <w:bottom w:type="dxa" w:w="80"/>
+              <w:right w:type="dxa" w:w="120"/>
+            </w:tcMar>
+          </w:tcPr>
+          <w:p>
+            <w:pPr>
+              <w:jc w:val="left"/>
+            </w:pPr>
+            <w:r>
+              <w:rPr>
+                <w:rFonts w:ascii="Arial" w:cs="Arial" w:eastAsia="Arial" w:hAnsi="Arial"/>
+                <w:b w:val="false"/>
+                <w:bCs w:val="false"/>
+                <w:color w:val="1D1D1F"/>
+                <w:sz w:val="20"/>
+                <w:szCs w:val="20"/>
+              </w:rPr>
+              <w:t xml:space="preserve">Total Hours Worked</w:t>
+            </w:r>
+          </w:p>
+        </w:tc>
+        <w:tc>
+          <w:tcPr>
+            <w:tcW w:type="dxa" w:w="2340"/>
+            <w:tcBorders>
+              <w:top w:val="single" w:color="D2D2D7" w:sz="1"/>
+              <w:left w:val="single" w:color="D2D2D7" w:sz="1"/>
+              <w:bottom w:val="single" w:color="D2D2D7" w:sz="1"/>
+              <w:right w:val="single" w:color="D2D2D7" w:sz="1"/>
+            </w:tcBorders>
+            <w:tcMar>
+              <w:top w:type="dxa" w:w="80"/>
+              <w:left w:type="dxa" w:w="120"/>
+              <w:bottom w:type="dxa" w:w="80"/>
+              <w:right w:type="dxa" w:w="120"/>
+            </w:tcMar>
+          </w:tcPr>
+          <w:p>
+            <w:pPr>
+              <w:jc w:val="left"/>
+            </w:pPr>
+            <w:r>
+              <w:rPr>
+                <w:rFonts w:ascii="Arial" w:cs="Arial" w:eastAsia="Arial" w:hAnsi="Arial"/>
+                <w:b/>
+                <w:bCs/>
+                <w:color w:val="1D1D1F"/>
+                <w:sz w:val="20"/>
+                <w:szCs w:val="20"/>
+              </w:rPr>
+              <w:t xml:space="preserve">247.5h</w:t>
+            </w:r>
+          </w:p>
+        </w:tc>
+        <w:tc>
+          <w:tcPr>
+            <w:tcW w:type="dxa" w:w="4680"/>
+            <w:tcBorders>
+              <w:top w:val="single" w:color="D2D2D7" w:sz="1"/>
+              <w:left w:val="single" w:color="D2D2D7" w:sz="1"/>
+              <w:bottom w:val="single" w:color="D2D2D7" w:sz="1"/>
+              <w:right w:val="single" w:color="D2D2D7" w:sz="1"/>
+            </w:tcBorders>
+            <w:tcMar>
+              <w:top w:type="dxa" w:w="80"/>
+              <w:left w:type="dxa" w:w="120"/>
+              <w:bottom w:type="dxa" w:w="80"/>
+              <w:right w:type="dxa" w:w="120"/>
+            </w:tcMar>
+          </w:tcPr>
+          <w:p>
+            <w:pPr>
+              <w:jc w:val="left"/>
+            </w:pPr>
+            <w:r>
+              <w:rPr>
+                <w:rFonts w:ascii="Arial" w:cs="Arial" w:eastAsia="Arial" w:hAnsi="Arial"/>
+                <w:b w:val="false"/>
+                <w:bCs w:val="false"/>
+                <w:color w:val="1A8D44"/>
+                <w:sz w:val="20"/>
+                <w:szCs w:val="20"/>
+              </w:rPr>
+              <w:t xml:space="preserve">+12% vs last month</w:t>
+            </w:r>
+          </w:p>
+        </w:tc>
+      </w:tr>
+      <w:tr>
+        <w:tc>
+          <w:tcPr>
+            <w:tcW w:type="dxa" w:w="2340"/>
+            <w:tcBorders>
+              <w:top w:val="single" w:color="D2D2D7" w:sz="1"/>
+              <w:left w:val="single" w:color="D2D2D7" w:sz="1"/>
+              <w:bottom w:val="single" w:color="D2D2D7" w:sz="1"/>
+              <w:right w:val="single" w:color="D2D2D7" w:sz="1"/>
+            </w:tcBorders>
+            <w:tcMar>
+              <w:top w:type="dxa" w:w="80"/>
+              <w:left w:type="dxa" w:w="120"/>
+              <w:bottom w:type="dxa" w:w="80"/>
+              <w:right w:type="dxa" w:w="120"/>
+            </w:tcMar>
+          </w:tcPr>
+          <w:p>
+            <w:pPr>
+              <w:jc w:val="left"/>
+            </w:pPr>
+            <w:r>
+              <w:rPr>
+                <w:rFonts w:ascii="Arial" w:cs="Arial" w:eastAsia="Arial" w:hAnsi="Arial"/>
+                <w:b w:val="false"/>
+                <w:bCs w:val="false"/>
+                <w:color w:val="1D1D1F"/>
+                <w:sz w:val="20"/>
+                <w:szCs w:val="20"/>
+              </w:rPr>
+              <w:t xml:space="preserve">Total Billings</w:t>
+            </w:r>
+          </w:p>
+        </w:tc>
+        <w:tc>
+          <w:tcPr>
+            <w:tcW w:type="dxa" w:w="2340"/>
+            <w:tcBorders>
+              <w:top w:val="single" w:color="D2D2D7" w:sz="1"/>
+              <w:left w:val="single" w:color="D2D2D7" w:sz="1"/>
+              <w:bottom w:val="single" w:color="D2D2D7" w:sz="1"/>
+              <w:right w:val="single" w:color="D2D2D7" w:sz="1"/>
+            </w:tcBorders>
+            <w:tcMar>
+              <w:top w:type="dxa" w:w="80"/>
+              <w:left w:type="dxa" w:w="120"/>
+              <w:bottom w:type="dxa" w:w="80"/>
+              <w:right w:type="dxa" w:w="120"/>
+            </w:tcMar>
+          </w:tcPr>
+          <w:p>
+            <w:pPr>
+              <w:jc w:val="left"/>
+            </w:pPr>
+            <w:r>
+              <w:rPr>
+                <w:rFonts w:ascii="Arial" w:cs="Arial" w:eastAsia="Arial" w:hAnsi="Arial"/>
+                <w:b/>
+                <w:bCs/>
+                <w:color w:val="1D1D1F"/>
+                <w:sz w:val="20"/>
+                <w:szCs w:val="20"/>
+              </w:rPr>
+              <w:t xml:space="preserve">$37,500</w:t>
+            </w:r>
+          </w:p>
+        </w:tc>
+        <w:tc>
+          <w:tcPr>
+            <w:tcW w:type="dxa" w:w="4680"/>
+            <w:tcBorders>
+              <w:top w:val="single" w:color="D2D2D7" w:sz="1"/>
+              <w:left w:val="single" w:color="D2D2D7" w:sz="1"/>
+              <w:bottom w:val="single" w:color="D2D2D7" w:sz="1"/>
+              <w:right w:val="single" w:color="D2D2D7" w:sz="1"/>
+            </w:tcBorders>
+            <w:tcMar>
+              <w:top w:type="dxa" w:w="80"/>
+              <w:left w:type="dxa" w:w="120"/>
+              <w:bottom w:type="dxa" w:w="80"/>
+              <w:right w:type="dxa" w:w="120"/>
+            </w:tcMar>
+          </w:tcPr>
+          <w:p>
+            <w:pPr>
+              <w:jc w:val="left"/>
+            </w:pPr>
+            <w:r>
+              <w:rPr>
+                <w:rFonts w:ascii="Arial" w:cs="Arial" w:eastAsia="Arial" w:hAnsi="Arial"/>
+                <w:b w:val="false"/>
+                <w:bCs w:val="false"/>
+                <w:color w:val="86868B"/>
+                <w:sz w:val="20"/>
+                <w:szCs w:val="20"/>
+              </w:rPr>
+              <w:t xml:space="preserve">Same as last month</w:t>
+            </w:r>
+          </w:p>
+        </w:tc>
+      </w:tr>
+      <w:tr>
+        <w:tc>
+          <w:tcPr>
+            <w:tcW w:type="dxa" w:w="2340"/>
+            <w:tcBorders>
+              <w:top w:val="single" w:color="D2D2D7" w:sz="1"/>
+              <w:left w:val="single" w:color="D2D2D7" w:sz="1"/>
+              <w:bottom w:val="single" w:color="D2D2D7" w:sz="1"/>
+              <w:right w:val="single" w:color="D2D2D7" w:sz="1"/>
+            </w:tcBorders>
+            <w:tcMar>
+              <w:top w:type="dxa" w:w="80"/>
+              <w:left w:type="dxa" w:w="120"/>
+              <w:bottom w:type="dxa" w:w="80"/>
+              <w:right w:type="dxa" w:w="120"/>
+            </w:tcMar>
+          </w:tcPr>
+          <w:p>
+            <w:pPr>
+              <w:jc w:val="left"/>
+            </w:pPr>
+            <w:r>
+              <w:rPr>
+                <w:rFonts w:ascii="Arial" w:cs="Arial" w:eastAsia="Arial" w:hAnsi="Arial"/>
+                <w:b w:val="false"/>
+                <w:bCs w:val="false"/>
+                <w:color w:val="1D1D1F"/>
+                <w:sz w:val="20"/>
+                <w:szCs w:val="20"/>
+              </w:rPr>
+              <w:t xml:space="preserve">Tasks Completed</w:t>
+            </w:r>
+          </w:p>
+        </w:tc>
+        <w:tc>
+          <w:tcPr>
+            <w:tcW w:type="dxa" w:w="2340"/>
+            <w:tcBorders>
+              <w:top w:val="single" w:color="D2D2D7" w:sz="1"/>
+              <w:left w:val="single" w:color="D2D2D7" w:sz="1"/>
+              <w:bottom w:val="single" w:color="D2D2D7" w:sz="1"/>
+              <w:right w:val="single" w:color="D2D2D7" w:sz="1"/>
+            </w:tcBorders>
+            <w:tcMar>
+              <w:top w:type="dxa" w:w="80"/>
+              <w:left w:type="dxa" w:w="120"/>
+              <w:bottom w:type="dxa" w:w="80"/>
+              <w:right w:type="dxa" w:w="120"/>
+            </w:tcMar>
+          </w:tcPr>
+          <w:p>
+            <w:pPr>
+              <w:jc w:val="left"/>
+            </w:pPr>
+            <w:r>
+              <w:rPr>
+                <w:rFonts w:ascii="Arial" w:cs="Arial" w:eastAsia="Arial" w:hAnsi="Arial"/>
+                <w:b/>
+                <w:bCs/>
+                <w:color w:val="1D1D1F"/>
+                <w:sz w:val="20"/>
+                <w:szCs w:val="20"/>
+              </w:rPr>
+              <w:t xml:space="preserve">34</w:t>
+            </w:r>
+          </w:p>
+        </w:tc>
+        <w:tc>
+          <w:tcPr>
+            <w:tcW w:type="dxa" w:w="4680"/>
+            <w:tcBorders>
+              <w:top w:val="single" w:color="D2D2D7" w:sz="1"/>
+              <w:left w:val="single" w:color="D2D2D7" w:sz="1"/>
+              <w:bottom w:val="single" w:color="D2D2D7" w:sz="1"/>
+              <w:right w:val="single" w:color="D2D2D7" w:sz="1"/>
+            </w:tcBorders>
+            <w:tcMar>
+              <w:top w:type="dxa" w:w="80"/>
+              <w:left w:type="dxa" w:w="120"/>
+              <w:bottom w:type="dxa" w:w="80"/>
+              <w:right w:type="dxa" w:w="120"/>
+            </w:tcMar>
+          </w:tcPr>
+          <w:p>
+            <w:pPr>
+              <w:jc w:val="left"/>
+            </w:pPr>
+            <w:r>
+              <w:rPr>
+                <w:rFonts w:ascii="Arial" w:cs="Arial" w:eastAsia="Arial" w:hAnsi="Arial"/>
+                <w:b w:val="false"/>
+                <w:bCs w:val="false"/>
+                <w:color w:val="1A8D44"/>
+                <w:sz w:val="20"/>
+                <w:szCs w:val="20"/>
+              </w:rPr>
+              <w:t xml:space="preserve">+8 more than last month</w:t>
+            </w:r>
+          </w:p>
+        </w:tc>
+      </w:tr>
+      <w:tr>
+        <w:tc>
+          <w:tcPr>
+            <w:tcW w:type="dxa" w:w="2340"/>
+            <w:tcBorders>
+              <w:top w:val="single" w:color="D2D2D7" w:sz="1"/>
+              <w:left w:val="single" w:color="D2D2D7" w:sz="1"/>
+              <w:bottom w:val="single" w:color="D2D2D7" w:sz="1"/>
+              <w:right w:val="single" w:color="D2D2D7" w:sz="1"/>
+            </w:tcBorders>
+            <w:tcMar>
+              <w:top w:type="dxa" w:w="80"/>
+              <w:left w:type="dxa" w:w="120"/>
+              <w:bottom w:type="dxa" w:w="80"/>
+              <w:right w:type="dxa" w:w="120"/>
+            </w:tcMar>
+          </w:tcPr>
+          <w:p>
+            <w:pPr>
+              <w:jc w:val="left"/>
+            </w:pPr>
+            <w:r>
+              <w:rPr>
+                <w:rFonts w:ascii="Arial" w:cs="Arial" w:eastAsia="Arial" w:hAnsi="Arial"/>
+                <w:b w:val="false"/>
+                <w:bCs w:val="false"/>
+                <w:color w:val="1D1D1F"/>
+                <w:sz w:val="20"/>
+                <w:szCs w:val="20"/>
+              </w:rPr>
+              <w:t xml:space="preserve">Profitability</w:t>
+            </w:r>
+          </w:p>
+        </w:tc>
+        <w:tc>
+          <w:tcPr>
+            <w:tcW w:type="dxa" w:w="2340"/>
+            <w:tcBorders>
+              <w:top w:val="single" w:color="D2D2D7" w:sz="1"/>
+              <w:left w:val="single" w:color="D2D2D7" w:sz="1"/>
+              <w:bottom w:val="single" w:color="D2D2D7" w:sz="1"/>
+              <w:right w:val="single" w:color="D2D2D7" w:sz="1"/>
+            </w:tcBorders>
+            <w:tcMar>
+              <w:top w:type="dxa" w:w="80"/>
+              <w:left w:type="dxa" w:w="120"/>
+              <w:bottom w:type="dxa" w:w="80"/>
+              <w:right w:type="dxa" w:w="120"/>
+            </w:tcMar>
+          </w:tcPr>
+          <w:p>
+            <w:pPr>
+              <w:jc w:val="left"/>
+            </w:pPr>
+            <w:r>
+              <w:rPr>
+                <w:rFonts w:ascii="Arial" w:cs="Arial" w:eastAsia="Arial" w:hAnsi="Arial"/>
+                <w:b/>
+                <w:bCs/>
+                <w:color w:val="1D1D1F"/>
+                <w:sz w:val="20"/>
+                <w:szCs w:val="20"/>
+              </w:rPr>
+              <w:t xml:space="preserve">+$13,125</w:t>
+            </w:r>
+          </w:p>
+        </w:tc>
+        <w:tc>
+          <w:tcPr>
+            <w:tcW w:type="dxa" w:w="4680"/>
+            <w:tcBorders>
+              <w:top w:val="single" w:color="D2D2D7" w:sz="1"/>
+              <w:left w:val="single" w:color="D2D2D7" w:sz="1"/>
+              <w:bottom w:val="single" w:color="D2D2D7" w:sz="1"/>
+              <w:right w:val="single" w:color="D2D2D7" w:sz="1"/>
+            </w:tcBorders>
+            <w:tcMar>
+              <w:top w:type="dxa" w:w="80"/>
+              <w:left w:type="dxa" w:w="120"/>
+              <w:bottom w:type="dxa" w:w="80"/>
+              <w:right w:type="dxa" w:w="120"/>
+            </w:tcMar>
+          </w:tcPr>
+          <w:p>
+            <w:pPr>
+              <w:jc w:val="left"/>
+            </w:pPr>
+            <w:r>
+              <w:rPr>
+                <w:rFonts w:ascii="Arial" w:cs="Arial" w:eastAsia="Arial" w:hAnsi="Arial"/>
+                <w:b w:val="false"/>
+                <w:bCs w:val="false"/>
+                <w:color w:val="1A8D44"/>
+                <w:sz w:val="20"/>
+                <w:szCs w:val="20"/>
+              </w:rPr>
+              <w:t xml:space="preserve">54% margin</w:t>
+            </w:r>
+          </w:p>
+        </w:tc>
+      </w:tr>
+    </w:tbl>
+    <w:p>
+      <w:pPr>
+        <w:spacing w:after="160"/>
+      </w:pPr>
+    </w:p>
+    <w:p>
+      <w:pPr>
+        <w:pStyle w:val="Heading3"/>
+      </w:pPr>
+      <w:r>
+        <w:rPr>
+          <w:b/>
+          <w:bCs/>
+        </w:rPr>
+        <w:t xml:space="preserve">Charts &amp; Breakdowns</w:t>
+      </w:r>
+    </w:p>
+    <w:p>
+      <w:pPr>
+        <w:pStyle w:val="ListParagraph"/>
+        <w:numPr>
+          <w:ilvl w:val="0"/>
+          <w:numId w:val="3"/>
+        </w:numPr>
+        <w:spacing w:after="60"/>
+      </w:pPr>
+      <w:r>
+        <w:rPr>
+          <w:rFonts w:ascii="Arial" w:cs="Arial" w:eastAsia="Arial" w:hAnsi="Arial"/>
+          <w:sz w:val="22"/>
+          <w:szCs w:val="22"/>
+        </w:rPr>
+        <w:t xml:space="preserve">Task Breakdown — Donut chart showing distribution: Done (18), In Progress (13), In Review (11), Overdue (6), To Do (8)</w:t>
+      </w:r>
+    </w:p>
+    <w:p>
+      <w:pPr>
+        <w:pStyle w:val="ListParagraph"/>
+        <w:numPr>
+          <w:ilvl w:val="0"/>
+          <w:numId w:val="3"/>
+        </w:numPr>
+        <w:spacing w:after="60"/>
+      </w:pPr>
+      <w:r>
+        <w:rPr>
+          <w:rFonts w:ascii="Arial" w:cs="Arial" w:eastAsia="Arial" w:hAnsi="Arial"/>
+          <w:sz w:val="22"/>
+          <w:szCs w:val="22"/>
+        </w:rPr>
+        <w:t xml:space="preserve">Task Velocity — Bar chart showing weekly completed tasks (W1–W8) to track team throughput over time</w:t>
+      </w:r>
+    </w:p>
+    <w:p>
+      <w:pPr>
+        <w:pStyle w:val="ListParagraph"/>
+        <w:numPr>
+          <w:ilvl w:val="0"/>
+          <w:numId w:val="3"/>
+        </w:numPr>
+        <w:spacing w:after="60"/>
+      </w:pPr>
+      <w:r>
+        <w:rPr>
+          <w:rFonts w:ascii="Arial" w:cs="Arial" w:eastAsia="Arial" w:hAnsi="Arial"/>
+          <w:sz w:val="22"/>
+          <w:szCs w:val="22"/>
+        </w:rPr>
+        <w:t xml:space="preserve">Hours by Service — Which services are consuming the most time (Website Redesign: 98.5h, Mobile App: 82h, SEO: 45h, Cloud: 22h)</w:t>
+      </w:r>
+    </w:p>
+    <w:p>
+      <w:pPr>
+        <w:pStyle w:val="ListParagraph"/>
+        <w:numPr>
+          <w:ilvl w:val="0"/>
+          <w:numId w:val="3"/>
+        </w:numPr>
+        <w:spacing w:after="60"/>
+      </w:pPr>
+      <w:r>
+        <w:rPr>
+          <w:rFonts w:ascii="Arial" w:cs="Arial" w:eastAsia="Arial" w:hAnsi="Arial"/>
+          <w:sz w:val="22"/>
+          <w:szCs w:val="22"/>
+        </w:rPr>
+        <w:t xml:space="preserve">Hours by Team Member — Individual contribution breakdown (Alex Smith: 88h, Jake Kim: 72.5h, etc.)</w:t>
       </w:r>
     </w:p>
     <w:tbl>
@@ -4616,6 +4569,169 @@
                         </pic:nvPicPr>
                         <pic:blipFill>
                           <a:blip r:embed="rId16" cstate="none"/>
+                          <a:srcRect/>
+                          <a:stretch>
+                            <a:fillRect/>
+                          </a:stretch>
+                        </pic:blipFill>
+                        <pic:spPr bwMode="auto">
+                          <a:xfrm>
+                            <a:off x="0" y="0"/>
+                            <a:ext cx="5800000" cy="3728571"/>
+                          </a:xfrm>
+                          <a:prstGeom prst="rect">
+                            <a:avLst/>
+                          </a:prstGeom>
+                        </pic:spPr>
+                      </pic:pic>
+                    </a:graphicData>
+                  </a:graphic>
+                </wp:inline>
+              </w:drawing>
+            </w:r>
+          </w:p>
+        </w:tc>
+      </w:tr>
+    </w:tbl>
+    <w:p>
+      <w:pPr>
+        <w:spacing w:after="200" w:before="40"/>
+        <w:jc w:val="center"/>
+      </w:pPr>
+      <w:r>
+        <w:rPr>
+          <w:rFonts w:ascii="Arial" w:cs="Arial" w:eastAsia="Arial" w:hAnsi="Arial"/>
+          <w:i/>
+          <w:iCs/>
+          <w:color w:val="86868B"/>
+          <w:sz w:val="18"/>
+          <w:szCs w:val="18"/>
+        </w:rPr>
+        <w:t xml:space="preserve">Figure 7: Analytics — KPI cards, task breakdown donut chart, velocity bar chart, and hours tables</w:t>
+      </w:r>
+    </w:p>
+    <w:p>
+      <w:pPr>
+        <w:pStyle w:val="Heading3"/>
+      </w:pPr>
+      <w:r>
+        <w:rPr>
+          <w:b/>
+          <w:bCs/>
+        </w:rPr>
+        <w:t xml:space="preserve">Financial Overview</w:t>
+      </w:r>
+    </w:p>
+    <w:p>
+      <w:pPr>
+        <w:pStyle w:val="ListParagraph"/>
+        <w:numPr>
+          <w:ilvl w:val="0"/>
+          <w:numId w:val="3"/>
+        </w:numPr>
+        <w:spacing w:after="60"/>
+      </w:pPr>
+      <w:r>
+        <w:rPr>
+          <w:rFonts w:ascii="Arial" w:cs="Arial" w:eastAsia="Arial" w:hAnsi="Arial"/>
+          <w:sz w:val="22"/>
+          <w:szCs w:val="22"/>
+        </w:rPr>
+        <w:t xml:space="preserve">Profitability Overview — Total revenue ($37,500), total cost ($24,375), net profit (+$13,125), profit margin (54%)</w:t>
+      </w:r>
+    </w:p>
+    <w:p>
+      <w:pPr>
+        <w:pStyle w:val="ListParagraph"/>
+        <w:numPr>
+          <w:ilvl w:val="0"/>
+          <w:numId w:val="3"/>
+        </w:numPr>
+        <w:spacing w:after="60"/>
+      </w:pPr>
+      <w:r>
+        <w:rPr>
+          <w:rFonts w:ascii="Arial" w:cs="Arial" w:eastAsia="Arial" w:hAnsi="Arial"/>
+          <w:sz w:val="22"/>
+          <w:szCs w:val="22"/>
+        </w:rPr>
+        <w:t xml:space="preserve">Monthly breakdown comparing revenue vs. cost per month</w:t>
+      </w:r>
+    </w:p>
+    <w:p>
+      <w:pPr>
+        <w:pStyle w:val="ListParagraph"/>
+        <w:numPr>
+          <w:ilvl w:val="0"/>
+          <w:numId w:val="3"/>
+        </w:numPr>
+        <w:spacing w:after="60"/>
+      </w:pPr>
+      <w:r>
+        <w:rPr>
+          <w:rFonts w:ascii="Arial" w:cs="Arial" w:eastAsia="Arial" w:hAnsi="Arial"/>
+          <w:sz w:val="22"/>
+          <w:szCs w:val="22"/>
+        </w:rPr>
+        <w:t xml:space="preserve">Billing History — Full invoice table with invoice numbers, dates, amounts, and payment status</w:t>
+      </w:r>
+    </w:p>
+    <w:tbl>
+      <w:tblPr>
+        <w:tblW w:type="dxa" w:w="9360"/>
+        <w:tblBorders>
+          <w:top w:val="single" w:color="auto" w:sz="4"/>
+          <w:left w:val="single" w:color="auto" w:sz="4"/>
+          <w:bottom w:val="single" w:color="auto" w:sz="4"/>
+          <w:right w:val="single" w:color="auto" w:sz="4"/>
+          <w:insideH w:val="single" w:color="auto" w:sz="4"/>
+          <w:insideV w:val="single" w:color="auto" w:sz="4"/>
+        </w:tblBorders>
+      </w:tblPr>
+      <w:tblGrid>
+        <w:gridCol w:w="9360"/>
+      </w:tblGrid>
+      <w:tr>
+        <w:tc>
+          <w:tcPr>
+            <w:tcW w:type="dxa" w:w="9360"/>
+            <w:tcBorders>
+              <w:top w:val="single" w:color="D2D2D7" w:sz="2"/>
+              <w:left w:val="single" w:color="D2D2D7" w:sz="2"/>
+              <w:bottom w:val="single" w:color="D2D2D7" w:sz="2"/>
+              <w:right w:val="single" w:color="D2D2D7" w:sz="2"/>
+            </w:tcBorders>
+            <w:tcMar>
+              <w:top w:type="dxa" w:w="80"/>
+              <w:left w:type="dxa" w:w="80"/>
+              <w:bottom w:type="dxa" w:w="80"/>
+              <w:right w:type="dxa" w:w="80"/>
+            </w:tcMar>
+          </w:tcPr>
+          <w:p>
+            <w:pPr>
+              <w:jc w:val="center"/>
+            </w:pPr>
+            <w:r>
+              <w:drawing>
+                <wp:inline distT="0" distB="0" distL="0" distR="0">
+                  <wp:extent cx="5800000" cy="3728571"/>
+                  <wp:effectExtent t="0" r="0" b="0" l="0"/>
+                  <wp:docPr id="1" name="" descr="" title=""/>
+                  <wp:cNvGraphicFramePr>
+                    <a:graphicFrameLocks xmlns:a="http://schemas.openxmlformats.org/drawingml/2006/main" noChangeAspect="1"/>
+                  </wp:cNvGraphicFramePr>
+                  <a:graphic xmlns:a="http://schemas.openxmlformats.org/drawingml/2006/main">
+                    <a:graphicData uri="http://schemas.openxmlformats.org/drawingml/2006/picture">
+                      <pic:pic xmlns:pic="http://schemas.openxmlformats.org/drawingml/2006/picture">
+                        <pic:nvPicPr>
+                          <pic:cNvPr id="0" name="" descr=""/>
+                          <pic:cNvPicPr>
+                            <a:picLocks noChangeAspect="1" noChangeArrowheads="1"/>
+                          </pic:cNvPicPr>
+                        </pic:nvPicPr>
+                        <pic:blipFill>
+                          <a:blip r:embed="rId17" cstate="none"/>
                           <a:srcRect/>
                           <a:stretch>
                             <a:fillRect/>

</xml_diff>

<commit_message>
Rewrite CEO document copy in Nikko's voice with 8 real problems
Section 1: Rewritten to be direct and conversational
Section 2: Replaced generic problem statement with 8 specific operational
problems (CEO hijacking, info bottlenecks, siloed workflows, overwork,
scattered comms, unowned tasks, no visibility, lack of PM training)
Section 6: Updated role benefit table with plain language
Section 7: Rewritten closing with clear next steps and call to action

Co-Authored-By: Claude Opus 4.6 <noreply@anthropic.com>
</commit_message>
<xml_diff>
--- a/ProjectFlow-Executive-Overview.docx
+++ b/ProjectFlow-Executive-Overview.docx
@@ -162,7 +162,7 @@
               </w:rPr>
               <w:t xml:space="preserve">Clients Layer: </w:t>
             </w:r>
-            <w:hyperlink w:history="1" r:id="rIdd-uiwzdu-18jv_pb-a5et">
+            <w:hyperlink w:history="1" r:id="rIdvybcu-mpbhhf1r1dcvs69">
               <w:r>
                 <w:rPr>
                   <w:rStyle w:val="Hyperlink"/>
@@ -188,7 +188,7 @@
               </w:rPr>
               <w:t xml:space="preserve">Services Layer: </w:t>
             </w:r>
-            <w:hyperlink w:history="1" r:id="rIdybrxx_vw22l3aw8cgw6da">
+            <w:hyperlink w:history="1" r:id="rIdy3fxqy6dzlt4mzeccfi3e">
               <w:r>
                 <w:rPr>
                   <w:rStyle w:val="Hyperlink"/>
@@ -214,7 +214,7 @@
               </w:rPr>
               <w:t xml:space="preserve">Kanban Layer: </w:t>
             </w:r>
-            <w:hyperlink w:history="1" r:id="rIdbv7i_igoftjctybnsfrx9">
+            <w:hyperlink w:history="1" r:id="rId3qghcugltmlnbxjdhtluq">
               <w:r>
                 <w:rPr>
                   <w:rStyle w:val="Hyperlink"/>
@@ -237,7 +237,7 @@
               </w:rPr>
               <w:t xml:space="preserve">Analytics Layer: </w:t>
             </w:r>
-            <w:hyperlink w:history="1" r:id="rIdxm2uebtndtepfv5hjfdk0">
+            <w:hyperlink w:history="1" r:id="rIddbguv-z7uosvi-nomxzg5">
               <w:r>
                 <w:rPr>
                   <w:rStyle w:val="Hyperlink"/>
@@ -292,7 +292,7 @@
           <w:sz w:val="22"/>
           <w:szCs w:val="22"/>
         </w:rPr>
-        <w:t xml:space="preserve">2. The Problem We’re Solving</w:t>
+        <w:t xml:space="preserve">2. The Problems We’re Solving</w:t>
       </w:r>
     </w:p>
     <w:p>
@@ -444,7 +444,7 @@
           <w:sz w:val="22"/>
           <w:szCs w:val="22"/>
         </w:rPr>
-        <w:t xml:space="preserve">ProjectFlow is a custom-built project management tool designed around how our team actually works. It replaces scattered spreadsheets, chat threads, and sticky-note workflows with a single system that tracks clients, services, tasks, and performance in one place.</w:t>
+        <w:t xml:space="preserve">ProjectFlow is a project management tool built around how our team actually works. Not how a textbook says we should work. How we actually work.</w:t>
       </w:r>
     </w:p>
     <w:p>
@@ -458,7 +458,21 @@
           <w:sz w:val="22"/>
           <w:szCs w:val="22"/>
         </w:rPr>
-        <w:t xml:space="preserve">The tool follows a three-layer structure that mirrors our real workflow:</w:t>
+        <w:t xml:space="preserve">Right now, project information is scattered across spreadsheets, group chats, emails, and sticky notes. Getting a clear picture of where a client stands means asking three different people or digging through five different tools. That slows everyone down.</w:t>
+      </w:r>
+    </w:p>
+    <w:p>
+      <w:pPr>
+        <w:spacing w:after="120"/>
+      </w:pPr>
+      <w:r>
+        <w:rPr>
+          <w:rFonts w:ascii="Arial" w:cs="Arial" w:eastAsia="Arial" w:hAnsi="Arial"/>
+          <w:color w:val="1D1D1F"/>
+          <w:sz w:val="22"/>
+          <w:szCs w:val="22"/>
+        </w:rPr>
+        <w:t xml:space="preserve">ProjectFlow puts everything in one place. It follows a three-layer structure:</w:t>
       </w:r>
     </w:p>
     <w:p>
@@ -486,7 +500,7 @@
           <w:sz w:val="22"/>
           <w:szCs w:val="22"/>
         </w:rPr>
-        <w:t xml:space="preserve"> — See all clients at a glance. Know who’s active, who’s paused, and where the revenue sits.</w:t>
+        <w:t xml:space="preserve"> (the big picture). See all clients at a glance. Who’s active, who’s paused, where the revenue sits.</w:t>
       </w:r>
     </w:p>
     <w:p>
@@ -514,7 +528,7 @@
           <w:sz w:val="22"/>
           <w:szCs w:val="22"/>
         </w:rPr>
-        <w:t xml:space="preserve"> — Drill into a specific client. See what services we’re running for them, who’s assigned, meeting schedules, documents, billing, everything.</w:t>
+        <w:t xml:space="preserve"> (the details). Click into a client. See what services we’re running for them, who’s assigned, meeting schedules, documents, billing.</w:t>
       </w:r>
     </w:p>
     <w:p>
@@ -542,7 +556,7 @@
           <w:sz w:val="22"/>
           <w:szCs w:val="22"/>
         </w:rPr>
-        <w:t xml:space="preserve"> — Open a service and see the actual tasks. Drag cards between columns. Know what’s in progress, what’s blocked, what’s done.</w:t>
+        <w:t xml:space="preserve"> (the daily work). Click into a service. See the actual tasks. What’s in progress, what’s waiting for review, what’s done.</w:t>
       </w:r>
     </w:p>
     <w:p>
@@ -556,7 +570,7 @@
           <w:sz w:val="22"/>
           <w:szCs w:val="22"/>
         </w:rPr>
-        <w:t xml:space="preserve">Each layer connects to the next. Click a client, see their services. Click a service, see the tasks. No switching tools, no context-switching.</w:t>
+        <w:t xml:space="preserve">Each layer connects to the next. Click a client, see their services. Click a service, see the tasks. No switching tools. No asking around.</w:t>
       </w:r>
     </w:p>
     <w:p>
@@ -576,7 +590,7 @@
           <w:b/>
           <w:bCs/>
         </w:rPr>
-        <w:t xml:space="preserve">2. The Problem We’re Solving</w:t>
+        <w:t xml:space="preserve">2. The Problems We’re Solving</w:t>
       </w:r>
     </w:p>
     <w:p>
@@ -590,7 +604,24 @@
           <w:sz w:val="22"/>
           <w:szCs w:val="22"/>
         </w:rPr>
-        <w:t xml:space="preserve">Right now, managing client work means juggling multiple tools and processes. Information lives in different places, and getting a full picture of a client’s status requires pulling data from several sources.</w:t>
+        <w:t xml:space="preserve">Before building this tool, I looked at where things break down in our day-to-day operations. These aren’t hypothetical problems. They’re happening now, and they’re costing us time, money, and trust.</w:t>
+      </w:r>
+    </w:p>
+    <w:p>
+      <w:pPr>
+        <w:spacing w:after="80"/>
+      </w:pPr>
+    </w:p>
+    <w:p>
+      <w:pPr>
+        <w:pStyle w:val="Heading3"/>
+      </w:pPr>
+      <w:r>
+        <w:rPr>
+          <w:b/>
+          <w:bCs/>
+        </w:rPr>
+        <w:t xml:space="preserve">1. The CEO sometimes hijacks the process.</w:t>
       </w:r>
     </w:p>
     <w:p>
@@ -604,7 +635,19 @@
           <w:sz w:val="22"/>
           <w:szCs w:val="22"/>
         </w:rPr>
-        <w:t xml:space="preserve">ProjectFlow solves this by centralizing everything into one tool that the whole team — account managers, project managers, and the production team — can use together.</w:t>
+        <w:t xml:space="preserve">Without visibility on what’s happening inside a project, the natural instinct is to step in and course-correct. The problem is that stepping in without full context often causes more disruption than the original issue. ProjectFlow gives leadership a real-time view of every client and service so they can stay informed without needing to intervene.</w:t>
+      </w:r>
+    </w:p>
+    <w:p>
+      <w:pPr>
+        <w:pStyle w:val="Heading3"/>
+      </w:pPr>
+      <w:r>
+        <w:rPr>
+          <w:b/>
+          <w:bCs/>
+        </w:rPr>
+        <w:t xml:space="preserve">2. Account managers hold onto information too long.</w:t>
       </w:r>
     </w:p>
     <w:p>
@@ -618,79 +661,184 @@
           <w:sz w:val="22"/>
           <w:szCs w:val="22"/>
         </w:rPr>
-        <w:t xml:space="preserve">What this means in practice:</w:t>
-      </w:r>
-    </w:p>
-    <w:p>
-      <w:pPr>
-        <w:pStyle w:val="ListParagraph"/>
-        <w:numPr>
-          <w:ilvl w:val="0"/>
-          <w:numId w:val="3"/>
-        </w:numPr>
-        <w:spacing w:after="60"/>
-      </w:pPr>
-      <w:r>
-        <w:rPr>
-          <w:rFonts w:ascii="Arial" w:cs="Arial" w:eastAsia="Arial" w:hAnsi="Arial"/>
-          <w:sz w:val="22"/>
-          <w:szCs w:val="22"/>
-        </w:rPr>
-        <w:t xml:space="preserve">Account managers can see client health, revenue, and contract status without asking anyone</w:t>
-      </w:r>
-    </w:p>
-    <w:p>
-      <w:pPr>
-        <w:pStyle w:val="ListParagraph"/>
-        <w:numPr>
-          <w:ilvl w:val="0"/>
-          <w:numId w:val="3"/>
-        </w:numPr>
-        <w:spacing w:after="60"/>
-      </w:pPr>
-      <w:r>
-        <w:rPr>
-          <w:rFonts w:ascii="Arial" w:cs="Arial" w:eastAsia="Arial" w:hAnsi="Arial"/>
-          <w:sz w:val="22"/>
-          <w:szCs w:val="22"/>
-        </w:rPr>
-        <w:t xml:space="preserve">Project managers can track progress across all services for a client in one view</w:t>
-      </w:r>
-    </w:p>
-    <w:p>
-      <w:pPr>
-        <w:pStyle w:val="ListParagraph"/>
-        <w:numPr>
-          <w:ilvl w:val="0"/>
-          <w:numId w:val="3"/>
-        </w:numPr>
-        <w:spacing w:after="60"/>
-      </w:pPr>
-      <w:r>
-        <w:rPr>
-          <w:rFonts w:ascii="Arial" w:cs="Arial" w:eastAsia="Arial" w:hAnsi="Arial"/>
-          <w:sz w:val="22"/>
-          <w:szCs w:val="22"/>
-        </w:rPr>
-        <w:t xml:space="preserve">The production team has a clear kanban board showing exactly what to work on next</w:t>
-      </w:r>
-    </w:p>
-    <w:p>
-      <w:pPr>
-        <w:pStyle w:val="ListParagraph"/>
-        <w:numPr>
-          <w:ilvl w:val="0"/>
-          <w:numId w:val="3"/>
-        </w:numPr>
-        <w:spacing w:after="60"/>
-      </w:pPr>
-      <w:r>
-        <w:rPr>
-          <w:rFonts w:ascii="Arial" w:cs="Arial" w:eastAsia="Arial" w:hAnsi="Arial"/>
-          <w:sz w:val="22"/>
-          <w:szCs w:val="22"/>
-        </w:rPr>
-        <w:t xml:space="preserve">Everyone sees the same data, updated in real time</w:t>
+        <w:t xml:space="preserve">Client feedback, project updates, new requests. These sit in someone’s inbox or notes instead of reaching the production team. By the time the team gets it, we’ve already lost days on planning and execution. ProjectFlow makes all client information visible to the entire team the moment it’s logged.</w:t>
+      </w:r>
+    </w:p>
+    <w:p>
+      <w:pPr>
+        <w:pStyle w:val="Heading3"/>
+      </w:pPr>
+      <w:r>
+        <w:rPr>
+          <w:b/>
+          <w:bCs/>
+        </w:rPr>
+        <w:t xml:space="preserve">3. Workflows are siloed.</w:t>
+      </w:r>
+    </w:p>
+    <w:p>
+      <w:pPr>
+        <w:spacing w:after="120"/>
+      </w:pPr>
+      <w:r>
+        <w:rPr>
+          <w:rFonts w:ascii="Arial" w:cs="Arial" w:eastAsia="Arial" w:hAnsi="Arial"/>
+          <w:color w:val="1D1D1F"/>
+          <w:sz w:val="22"/>
+          <w:szCs w:val="22"/>
+        </w:rPr>
+        <w:t xml:space="preserve">Some teams follow their own process. Other managers and team members have zero visibility on what’s happening with a project or a specific task. When everyone is working in their own bubble, things fall through the cracks. ProjectFlow gives everyone the same view of the work.</w:t>
+      </w:r>
+    </w:p>
+    <w:p>
+      <w:pPr>
+        <w:pStyle w:val="Heading3"/>
+      </w:pPr>
+      <w:r>
+        <w:rPr>
+          <w:b/>
+          <w:bCs/>
+        </w:rPr>
+        <w:t xml:space="preserve">4. Team members are overworked beyond capacity.</w:t>
+      </w:r>
+    </w:p>
+    <w:p>
+      <w:pPr>
+        <w:spacing w:after="120"/>
+      </w:pPr>
+      <w:r>
+        <w:rPr>
+          <w:rFonts w:ascii="Arial" w:cs="Arial" w:eastAsia="Arial" w:hAnsi="Arial"/>
+          <w:color w:val="1D1D1F"/>
+          <w:sz w:val="22"/>
+          <w:szCs w:val="22"/>
+        </w:rPr>
+        <w:t xml:space="preserve">Without a clear view of who’s doing what, work piles up on certain people while others are underutilized. There’s no way to see the imbalance until someone burns out or misses a deadline. ProjectFlow’s analytics and kanban boards make workload distribution visible so managers can rebalance before it becomes a problem.</w:t>
+      </w:r>
+    </w:p>
+    <w:p>
+      <w:pPr>
+        <w:pStyle w:val="Heading3"/>
+      </w:pPr>
+      <w:r>
+        <w:rPr>
+          <w:b/>
+          <w:bCs/>
+        </w:rPr>
+        <w:t xml:space="preserve">5. Miscommunications from scattered group chats.</w:t>
+      </w:r>
+    </w:p>
+    <w:p>
+      <w:pPr>
+        <w:spacing w:after="120"/>
+      </w:pPr>
+      <w:r>
+        <w:rPr>
+          <w:rFonts w:ascii="Arial" w:cs="Arial" w:eastAsia="Arial" w:hAnsi="Arial"/>
+          <w:color w:val="1D1D1F"/>
+          <w:sz w:val="22"/>
+          <w:szCs w:val="22"/>
+        </w:rPr>
+        <w:t xml:space="preserve">Project updates live in group chats, emails, direct messages, and meeting notes (all in different places). When information lives everywhere, it lives nowhere. ProjectFlow centralizes communications into a single log per client so nothing gets lost between platforms.</w:t>
+      </w:r>
+    </w:p>
+    <w:p>
+      <w:pPr>
+        <w:pStyle w:val="Heading3"/>
+      </w:pPr>
+      <w:r>
+        <w:rPr>
+          <w:b/>
+          <w:bCs/>
+        </w:rPr>
+        <w:t xml:space="preserve">6. Tasks don’t have owners.</w:t>
+      </w:r>
+    </w:p>
+    <w:p>
+      <w:pPr>
+        <w:spacing w:after="120"/>
+      </w:pPr>
+      <w:r>
+        <w:rPr>
+          <w:rFonts w:ascii="Arial" w:cs="Arial" w:eastAsia="Arial" w:hAnsi="Arial"/>
+          <w:color w:val="1D1D1F"/>
+          <w:sz w:val="22"/>
+          <w:szCs w:val="22"/>
+        </w:rPr>
+        <w:t xml:space="preserve">Account managers don’t always assign tasks to specific people. The task exists, everyone assumes someone else is handling it, and it sits there with no progress. ProjectFlow’s kanban board requires an assignee for every task. If a card doesn’t have an owner, it’s immediately visible.</w:t>
+      </w:r>
+    </w:p>
+    <w:p>
+      <w:pPr>
+        <w:pStyle w:val="Heading3"/>
+      </w:pPr>
+      <w:r>
+        <w:rPr>
+          <w:b/>
+          <w:bCs/>
+        </w:rPr>
+        <w:t xml:space="preserve">7. The CEO has no idea what’s happening.</w:t>
+      </w:r>
+    </w:p>
+    <w:p>
+      <w:pPr>
+        <w:spacing w:after="120"/>
+      </w:pPr>
+      <w:r>
+        <w:rPr>
+          <w:rFonts w:ascii="Arial" w:cs="Arial" w:eastAsia="Arial" w:hAnsi="Arial"/>
+          <w:color w:val="1D1D1F"/>
+          <w:sz w:val="22"/>
+          <w:szCs w:val="22"/>
+        </w:rPr>
+        <w:t xml:space="preserve">Without a central system, the only way to get a project update is to ask someone. That creates anxiety and stress. ProjectFlow’s client and analytics layers give leadership a live dashboard they can check anytime without having to chase anyone for answers.</w:t>
+      </w:r>
+    </w:p>
+    <w:p>
+      <w:pPr>
+        <w:pStyle w:val="Heading3"/>
+      </w:pPr>
+      <w:r>
+        <w:rPr>
+          <w:b/>
+          <w:bCs/>
+        </w:rPr>
+        <w:t xml:space="preserve">8. Account managers lack project management training.</w:t>
+      </w:r>
+    </w:p>
+    <w:p>
+      <w:pPr>
+        <w:spacing w:after="120"/>
+      </w:pPr>
+      <w:r>
+        <w:rPr>
+          <w:rFonts w:ascii="Arial" w:cs="Arial" w:eastAsia="Arial" w:hAnsi="Arial"/>
+          <w:color w:val="1D1D1F"/>
+          <w:sz w:val="22"/>
+          <w:szCs w:val="22"/>
+        </w:rPr>
+        <w:t xml:space="preserve">They’re managing client relationships (which they’re good at), but they’re also expected to manage projects without the right tools or framework. ProjectFlow gives them a structured system to follow so they don’t have to figure it out on their own.</w:t>
+      </w:r>
+    </w:p>
+    <w:p>
+      <w:pPr>
+        <w:spacing w:after="120"/>
+      </w:pPr>
+    </w:p>
+    <w:p>
+      <w:pPr>
+        <w:spacing w:after="120"/>
+      </w:pPr>
+      <w:r>
+        <w:rPr>
+          <w:rFonts w:ascii="Arial" w:cs="Arial" w:eastAsia="Arial" w:hAnsi="Arial"/>
+          <w:b/>
+          <w:bCs/>
+          <w:color w:val="1D1D1F"/>
+          <w:sz w:val="22"/>
+          <w:szCs w:val="22"/>
+        </w:rPr>
+        <w:t xml:space="preserve">ProjectFlow addresses every one of these by giving the entire team (from CEO to production) a single system where clients, services, tasks, and performance data live together. No more digging. No more guessing. No more dropped balls.</w:t>
       </w:r>
     </w:p>
     <w:p>
@@ -910,7 +1058,7 @@
             </w:r>
           </w:p>
           <w:p>
-            <w:hyperlink w:history="1" r:id="rIdlta7wwnie3trp3nqxevum">
+            <w:hyperlink w:history="1" r:id="rIdlopi7pkfe7dkbk-qe36mw">
               <w:r>
                 <w:rPr>
                   <w:rStyle w:val="Hyperlink"/>
@@ -1934,7 +2082,7 @@
             </w:r>
           </w:p>
           <w:p>
-            <w:hyperlink w:history="1" r:id="rIdqkzjwsc9-cxl1fqdprwvt">
+            <w:hyperlink w:history="1" r:id="rIdhmsdvpkgkpf_hvdfn3v_-">
               <w:r>
                 <w:rPr>
                   <w:rStyle w:val="Hyperlink"/>
@@ -3014,7 +3162,7 @@
             </w:r>
           </w:p>
           <w:p>
-            <w:hyperlink w:history="1" r:id="rId54mgj04oogggr7n1zs1d_">
+            <w:hyperlink w:history="1" r:id="rIdi-drhv0vjkcme-2e4kh27">
               <w:r>
                 <w:rPr>
                   <w:rStyle w:val="Hyperlink"/>
@@ -3838,7 +3986,7 @@
             </w:r>
           </w:p>
           <w:p>
-            <w:hyperlink w:history="1" r:id="rIdemrgnhoaqx2afztb6sdvt">
+            <w:hyperlink w:history="1" r:id="rIdayhrjcnk39bt6r3mk0w-t">
               <w:r>
                 <w:rPr>
                   <w:rStyle w:val="Hyperlink"/>
@@ -5877,6 +6025,25 @@
         <w:t xml:space="preserve">6. Who Benefits and How</w:t>
       </w:r>
     </w:p>
+    <w:p>
+      <w:pPr>
+        <w:spacing w:after="120"/>
+      </w:pPr>
+      <w:r>
+        <w:rPr>
+          <w:rFonts w:ascii="Arial" w:cs="Arial" w:eastAsia="Arial" w:hAnsi="Arial"/>
+          <w:color w:val="1D1D1F"/>
+          <w:sz w:val="22"/>
+          <w:szCs w:val="22"/>
+        </w:rPr>
+        <w:t xml:space="preserve">Every role in the team gets something different out of ProjectFlow. Here’s the breakdown:</w:t>
+      </w:r>
+    </w:p>
+    <w:p>
+      <w:pPr>
+        <w:spacing w:after="120"/>
+      </w:pPr>
+    </w:p>
     <w:tbl>
       <w:tblPr>
         <w:tblW w:type="dxa" w:w="9360"/>
@@ -5959,7 +6126,7 @@
                 <w:sz w:val="20"/>
                 <w:szCs w:val="20"/>
               </w:rPr>
-              <w:t xml:space="preserve">Primary Use</w:t>
+              <w:t xml:space="preserve">What they use</w:t>
             </w:r>
           </w:p>
         </w:tc>
@@ -5993,7 +6160,7 @@
                 <w:sz w:val="20"/>
                 <w:szCs w:val="20"/>
               </w:rPr>
-              <w:t xml:space="preserve">Key Benefit</w:t>
+              <w:t xml:space="preserve">What changes for them</w:t>
             </w:r>
           </w:p>
         </w:tc>
@@ -6061,7 +6228,7 @@
                 <w:sz w:val="20"/>
                 <w:szCs w:val="20"/>
               </w:rPr>
-              <w:t xml:space="preserve">Client portfolio overview, revenue tracking, profitability</w:t>
+              <w:t xml:space="preserve">Client portfolio, revenue, profitability dashboard</w:t>
             </w:r>
           </w:p>
         </w:tc>
@@ -6094,7 +6261,7 @@
                 <w:sz w:val="20"/>
                 <w:szCs w:val="20"/>
               </w:rPr>
-              <w:t xml:space="preserve">High-level visibility without asking for reports</w:t>
+              <w:t xml:space="preserve">See what’s happening without asking anyone. No more chasing updates.</w:t>
             </w:r>
           </w:p>
         </w:tc>
@@ -6162,7 +6329,7 @@
                 <w:sz w:val="20"/>
                 <w:szCs w:val="20"/>
               </w:rPr>
-              <w:t xml:space="preserve">Client health, contracts, billing, communications</w:t>
+              <w:t xml:space="preserve">Client health, contracts, billing, communications log</w:t>
             </w:r>
           </w:p>
         </w:tc>
@@ -6195,7 +6362,7 @@
                 <w:sz w:val="20"/>
                 <w:szCs w:val="20"/>
               </w:rPr>
-              <w:t xml:space="preserve">Single source of truth for every client relationship</w:t>
+              <w:t xml:space="preserve">One place for everything about a client. No more scattered notes and forgotten follow-ups.</w:t>
             </w:r>
           </w:p>
         </w:tc>
@@ -6296,7 +6463,7 @@
                 <w:sz w:val="20"/>
                 <w:szCs w:val="20"/>
               </w:rPr>
-              <w:t xml:space="preserve">Track all services and tasks without switching tools</w:t>
+              <w:t xml:space="preserve">Track all services and tasks in one view. Know who’s overloaded before it becomes a problem.</w:t>
             </w:r>
           </w:p>
         </w:tc>
@@ -6397,7 +6564,7 @@
                 <w:sz w:val="20"/>
                 <w:szCs w:val="20"/>
               </w:rPr>
-              <w:t xml:space="preserve">Clear visibility on what to work on next</w:t>
+              <w:t xml:space="preserve">Open the board, see what to work on. Every task has an owner and a status. No more guessing.</w:t>
             </w:r>
           </w:p>
         </w:tc>
@@ -6468,7 +6635,7 @@
           <w:sz w:val="22"/>
           <w:szCs w:val="22"/>
         </w:rPr>
-        <w:t xml:space="preserve">Mockups are live and accessible via the demo links on the cover page</w:t>
+        <w:t xml:space="preserve">Mockups are live and clickable (see demo links on the cover page)</w:t>
       </w:r>
     </w:p>
     <w:p>
@@ -6486,7 +6653,25 @@
           <w:sz w:val="22"/>
           <w:szCs w:val="22"/>
         </w:rPr>
-        <w:t xml:space="preserve">Account managers, project managers, and the production team have reviewed and approved the design</w:t>
+        <w:t xml:space="preserve">The account managers, project managers, and production team have reviewed and approved the design</w:t>
+      </w:r>
+    </w:p>
+    <w:p>
+      <w:pPr>
+        <w:pStyle w:val="ListParagraph"/>
+        <w:numPr>
+          <w:ilvl w:val="0"/>
+          <w:numId w:val="3"/>
+        </w:numPr>
+        <w:spacing w:after="60"/>
+      </w:pPr>
+      <w:r>
+        <w:rPr>
+          <w:rFonts w:ascii="Arial" w:cs="Arial" w:eastAsia="Arial" w:hAnsi="Arial"/>
+          <w:sz w:val="22"/>
+          <w:szCs w:val="22"/>
+        </w:rPr>
+        <w:t xml:space="preserve">This is not a concept. It’s a working prototype that the team has already signed off on.</w:t>
       </w:r>
     </w:p>
     <w:p>
@@ -6503,7 +6688,7 @@
           <w:b/>
           <w:bCs/>
         </w:rPr>
-        <w:t xml:space="preserve">Next steps (pending CEO approval):</w:t>
+        <w:t xml:space="preserve">What happens next (pending your approval):</w:t>
       </w:r>
     </w:p>
     <w:p>
@@ -6521,7 +6706,7 @@
           <w:sz w:val="22"/>
           <w:szCs w:val="22"/>
         </w:rPr>
-        <w:t xml:space="preserve">Begin development of the production application based on these approved mockups</w:t>
+        <w:t xml:space="preserve">Hand off the approved mockups to the web developer for production build</w:t>
       </w:r>
     </w:p>
     <w:p>
@@ -6539,7 +6724,7 @@
           <w:sz w:val="22"/>
           <w:szCs w:val="22"/>
         </w:rPr>
-        <w:t xml:space="preserve">Set up the backend database and authentication system</w:t>
+        <w:t xml:space="preserve">Set up the backend (database, authentication, user roles)</w:t>
       </w:r>
     </w:p>
     <w:p>
@@ -6557,7 +6742,7 @@
           <w:sz w:val="22"/>
           <w:szCs w:val="22"/>
         </w:rPr>
-        <w:t xml:space="preserve">Build the client management layer first, then services, then kanban, following the same top-down structure</w:t>
+        <w:t xml:space="preserve">Build each layer in order: Clients first, then Services, then Kanban (same top-down structure the team already understands)</w:t>
       </w:r>
     </w:p>
     <w:p>
@@ -6575,7 +6760,7 @@
           <w:sz w:val="22"/>
           <w:szCs w:val="22"/>
         </w:rPr>
-        <w:t xml:space="preserve">Integrate with existing tools (Xero for billing, Google Drive for documents, Slack for communications)</w:t>
+        <w:t xml:space="preserve">Integrate with existing tools we already use (Xero for billing, Google Drive for documents, Slack for communications)</w:t>
       </w:r>
     </w:p>
     <w:p>
@@ -6593,7 +6778,7 @@
           <w:sz w:val="22"/>
           <w:szCs w:val="22"/>
         </w:rPr>
-        <w:t xml:space="preserve">Roll out to the team in phases, starting with account managers</w:t>
+        <w:t xml:space="preserve">Roll out to the team in phases, starting with account managers since they interact with clients the most</w:t>
       </w:r>
     </w:p>
     <w:p>
@@ -6614,7 +6799,7 @@
           <w:sz w:val="22"/>
           <w:szCs w:val="22"/>
         </w:rPr>
-        <w:t xml:space="preserve">The mockups represent the agreed-upon design direction. Development can begin immediately upon approval.</w:t>
+        <w:t xml:space="preserve">The team is ready. The design is approved. We just need the green light to start building.</w:t>
       </w:r>
     </w:p>
     <w:sectPr>

</xml_diff>

<commit_message>
Soften 9 phrases in CEO overview for appropriate tone
1. "trust" -> "efficiency" (intro)
2. "disruption" -> "slow things down" (problem 1)
3. "hold onto information" -> "doesn't always reach the team" (problem 2)
4. "beyond capacity" -> "stretched too thin" (problem 4)
5. "burns out" -> "gets overwhelmed" (problem 4)
6. "has no idea" -> "doesn't always have visibility" (problem 7)
7. "anxiety and stress" -> "unnecessary back-and-forth" (problem 7)
8. "chase anyone" -> "ask around" (problem 7)
9. "lack training" -> "don't always have the right tools" (problem 8)

Co-Authored-By: Claude Opus 4.6 <noreply@anthropic.com>
</commit_message>
<xml_diff>
--- a/ProjectFlow-Executive-Overview.docx
+++ b/ProjectFlow-Executive-Overview.docx
@@ -162,7 +162,7 @@
               </w:rPr>
               <w:t xml:space="preserve">Clients Layer: </w:t>
             </w:r>
-            <w:hyperlink w:history="1" r:id="rIdunba5zbtirueqmwgawjkc">
+            <w:hyperlink w:history="1" r:id="rIdcw82s74dtosdaxi4ivikc">
               <w:r>
                 <w:rPr>
                   <w:rStyle w:val="Hyperlink"/>
@@ -188,7 +188,7 @@
               </w:rPr>
               <w:t xml:space="preserve">Services Layer: </w:t>
             </w:r>
-            <w:hyperlink w:history="1" r:id="rIdl492wmmjzfweoigl-la5e">
+            <w:hyperlink w:history="1" r:id="rIddk0ix79y3z9a_e2lhusni">
               <w:r>
                 <w:rPr>
                   <w:rStyle w:val="Hyperlink"/>
@@ -214,7 +214,7 @@
               </w:rPr>
               <w:t xml:space="preserve">Kanban Layer: </w:t>
             </w:r>
-            <w:hyperlink w:history="1" r:id="rIde-o7ohuzdnhfa6ze5-yud">
+            <w:hyperlink w:history="1" r:id="rIdchw2usan9azd275ugyqhm">
               <w:r>
                 <w:rPr>
                   <w:rStyle w:val="Hyperlink"/>
@@ -237,7 +237,7 @@
               </w:rPr>
               <w:t xml:space="preserve">Analytics Layer: </w:t>
             </w:r>
-            <w:hyperlink w:history="1" r:id="rIdy7jqv3pddyuoxjfi8r2pa">
+            <w:hyperlink w:history="1" r:id="rId47hpahghlebemtjrwewtz">
               <w:r>
                 <w:rPr>
                   <w:rStyle w:val="Hyperlink"/>
@@ -604,7 +604,7 @@
           <w:sz w:val="22"/>
           <w:szCs w:val="22"/>
         </w:rPr>
-        <w:t xml:space="preserve">Before building this tool, I looked at where things break down in our day-to-day operations. These aren’t hypothetical problems. They’re happening now, and they’re costing us time, money, and trust.</w:t>
+        <w:t xml:space="preserve">Before building this tool, I looked at where things break down in our day-to-day operations. These aren’t hypothetical problems. They’re happening now, and they’re costing us time and efficiency.</w:t>
       </w:r>
     </w:p>
     <w:p>
@@ -635,7 +635,7 @@
           <w:sz w:val="22"/>
           <w:szCs w:val="22"/>
         </w:rPr>
-        <w:t xml:space="preserve">Without visibility on what’s happening inside a project, the natural instinct is to step in and course-correct. The problem is that stepping in without full context often causes more disruption than the original issue. ProjectFlow gives leadership a real-time view of every client and service so they can stay informed without needing to intervene.</w:t>
+        <w:t xml:space="preserve">Without visibility on what’s happening inside a project, the natural instinct is to step in and course-correct. The problem is that stepping in without full context can slow things down more than the original issue. ProjectFlow gives leadership a real-time view of every client and service so they can stay informed without needing to intervene.</w:t>
       </w:r>
     </w:p>
     <w:p>
@@ -647,7 +647,7 @@
           <w:b/>
           <w:bCs/>
         </w:rPr>
-        <w:t xml:space="preserve">2. Account managers hold onto information too long.</w:t>
+        <w:t xml:space="preserve">2. Essential information doesn’t always reach the team on time.</w:t>
       </w:r>
     </w:p>
     <w:p>
@@ -699,7 +699,7 @@
           <w:b/>
           <w:bCs/>
         </w:rPr>
-        <w:t xml:space="preserve">4. Team members are overworked beyond capacity.</w:t>
+        <w:t xml:space="preserve">4. Team members are stretched too thin.</w:t>
       </w:r>
     </w:p>
     <w:p>
@@ -713,7 +713,7 @@
           <w:sz w:val="22"/>
           <w:szCs w:val="22"/>
         </w:rPr>
-        <w:t xml:space="preserve">Without a clear view of who’s doing what, work piles up on certain people while others are underutilized. There’s no way to see the imbalance until someone burns out or misses a deadline. ProjectFlow’s analytics and kanban boards make workload distribution visible so managers can rebalance before it becomes a problem.</w:t>
+        <w:t xml:space="preserve">Without a clear view of who’s doing what, work piles up on certain people while others are underutilized. There’s no way to see the imbalance until someone gets overwhelmed or misses a deadline. ProjectFlow’s analytics and kanban boards make workload distribution visible so managers can rebalance before it becomes a problem.</w:t>
       </w:r>
     </w:p>
     <w:p>
@@ -777,7 +777,7 @@
           <w:b/>
           <w:bCs/>
         </w:rPr>
-        <w:t xml:space="preserve">7. The CEO has no idea what’s happening.</w:t>
+        <w:t xml:space="preserve">7. Leadership doesn’t always have visibility on project status.</w:t>
       </w:r>
     </w:p>
     <w:p>
@@ -791,7 +791,7 @@
           <w:sz w:val="22"/>
           <w:szCs w:val="22"/>
         </w:rPr>
-        <w:t xml:space="preserve">Without a central system, the only way to get a project update is to ask someone. That creates anxiety and stress. ProjectFlow’s client and analytics layers give leadership a live dashboard they can check anytime without having to chase anyone for answers.</w:t>
+        <w:t xml:space="preserve">Without a central system, the only way to get a project update is to ask someone. That creates unnecessary back-and-forth. ProjectFlow’s client and analytics layers give leadership a live dashboard they can check anytime without having to ask around for answers.</w:t>
       </w:r>
     </w:p>
     <w:p>
@@ -803,7 +803,7 @@
           <w:b/>
           <w:bCs/>
         </w:rPr>
-        <w:t xml:space="preserve">8. Account managers lack project management training.</w:t>
+        <w:t xml:space="preserve">8. Account managers don’t always have the right PM tools or framework.</w:t>
       </w:r>
     </w:p>
     <w:p>
@@ -1058,7 +1058,7 @@
             </w:r>
           </w:p>
           <w:p>
-            <w:hyperlink w:history="1" r:id="rIdk5x4t3ov52ljwdgzr6upz">
+            <w:hyperlink w:history="1" r:id="rId_gm4tddkavh0gj9vea9qy">
               <w:r>
                 <w:rPr>
                   <w:rStyle w:val="Hyperlink"/>
@@ -2082,7 +2082,7 @@
             </w:r>
           </w:p>
           <w:p>
-            <w:hyperlink w:history="1" r:id="rIdhhtznqqjrdi2gukyc1yos">
+            <w:hyperlink w:history="1" r:id="rIdmnf_24nvha3ybbklr4zhh">
               <w:r>
                 <w:rPr>
                   <w:rStyle w:val="Hyperlink"/>
@@ -3162,7 +3162,7 @@
             </w:r>
           </w:p>
           <w:p>
-            <w:hyperlink w:history="1" r:id="rIdldtik7inwvg-bqmyla1lj">
+            <w:hyperlink w:history="1" r:id="rIdgwmaervqcdh29a0lxpioo">
               <w:r>
                 <w:rPr>
                   <w:rStyle w:val="Hyperlink"/>
@@ -3986,7 +3986,7 @@
             </w:r>
           </w:p>
           <w:p>
-            <w:hyperlink w:history="1" r:id="rIdj8scrgxolntpvejyd_fmc">
+            <w:hyperlink w:history="1" r:id="rId3lry14ntwbuly5eyfvnn4">
               <w:r>
                 <w:rPr>
                   <w:rStyle w:val="Hyperlink"/>

</xml_diff>